<commit_message>
doc + test ia
</commit_message>
<xml_diff>
--- a/Doc/DOC.docx
+++ b/Doc/DOC.docx
@@ -739,6 +739,14 @@
     </w:p>
     <w:p>
       <w:pPr>
+        <w:pStyle w:val="Titre2"/>
+      </w:pPr>
+      <w:r>
+        <w:t xml:space="preserve">Diagram de classe : </w:t>
+      </w:r>
+    </w:p>
+    <w:p>
+      <w:pPr>
         <w:spacing w:after="0"/>
       </w:pPr>
     </w:p>
@@ -769,6 +777,9 @@
         <w:spacing w:after="0"/>
       </w:pPr>
       <w:r>
+        <w:rPr>
+          <w:noProof/>
+        </w:rPr>
         <w:drawing>
           <wp:inline distT="0" distB="0" distL="0" distR="0" wp14:anchorId="698B8A23" wp14:editId="0916C63B">
             <wp:extent cx="5760720" cy="2449195"/>
@@ -4480,6 +4491,7 @@
   <w:style w:type="character" w:default="1" w:styleId="Policepardfaut">
     <w:name w:val="Default Paragraph Font"/>
     <w:uiPriority w:val="1"/>
+    <w:semiHidden/>
     <w:unhideWhenUsed/>
   </w:style>
   <w:style w:type="table" w:default="1" w:styleId="TableauNormal">

</xml_diff>

<commit_message>
tri + document individuel
</commit_message>
<xml_diff>
--- a/Doc/DOC.docx
+++ b/Doc/DOC.docx
@@ -54,15 +54,7 @@
         <w:spacing w:after="0"/>
       </w:pPr>
       <w:r>
-        <w:t xml:space="preserve">De classe (proche du MCD donc </w:t>
-      </w:r>
-      <w:proofErr w:type="spellStart"/>
-      <w:r>
-        <w:t>trasition</w:t>
-      </w:r>
-      <w:proofErr w:type="spellEnd"/>
-      <w:r>
-        <w:t>)</w:t>
+        <w:t>De classe (proche du MCD donc trasition)</w:t>
       </w:r>
     </w:p>
     <w:p>
@@ -111,15 +103,7 @@
         <w:pStyle w:val="Titre2"/>
       </w:pPr>
       <w:r>
-        <w:t>Cas d’</w:t>
-      </w:r>
-      <w:proofErr w:type="spellStart"/>
-      <w:r>
-        <w:t>utilisaiton</w:t>
-      </w:r>
-      <w:proofErr w:type="spellEnd"/>
-      <w:r>
-        <w:t xml:space="preserve"> : </w:t>
+        <w:t xml:space="preserve">Cas d’utilisaiton : </w:t>
       </w:r>
     </w:p>
     <w:p>
@@ -768,7 +752,6 @@
         <w:pStyle w:val="Titre2"/>
       </w:pPr>
       <w:r>
-        <w:lastRenderedPageBreak/>
         <w:t xml:space="preserve">MCD : </w:t>
       </w:r>
     </w:p>
@@ -777,14 +760,11 @@
         <w:spacing w:after="0"/>
       </w:pPr>
       <w:r>
-        <w:rPr>
-          <w:noProof/>
-        </w:rPr>
         <w:drawing>
-          <wp:inline distT="0" distB="0" distL="0" distR="0" wp14:anchorId="698B8A23" wp14:editId="0916C63B">
-            <wp:extent cx="5760720" cy="2449195"/>
-            <wp:effectExtent l="0" t="0" r="0" b="8255"/>
-            <wp:docPr id="1959292349" name="Image 1" descr="Une image contenant texte, diagramme, capture d’écran, Police&#10;&#10;Le contenu généré par l’IA peut être incorrect."/>
+          <wp:inline distT="0" distB="0" distL="0" distR="0" wp14:anchorId="23DD852F" wp14:editId="1D0D0930">
+            <wp:extent cx="5760720" cy="2602230"/>
+            <wp:effectExtent l="0" t="0" r="0" b="7620"/>
+            <wp:docPr id="1816543905" name="Image 1" descr="Une image contenant texte, capture d’écran, Police, diagramme&#10;&#10;Le contenu généré par l’IA peut être incorrect."/>
             <wp:cNvGraphicFramePr>
               <a:graphicFrameLocks xmlns:a="http://schemas.openxmlformats.org/drawingml/2006/main" noChangeAspect="1"/>
             </wp:cNvGraphicFramePr>
@@ -792,7 +772,7 @@
               <a:graphicData uri="http://schemas.openxmlformats.org/drawingml/2006/picture">
                 <pic:pic xmlns:pic="http://schemas.openxmlformats.org/drawingml/2006/picture">
                   <pic:nvPicPr>
-                    <pic:cNvPr id="1959292349" name="Image 1" descr="Une image contenant texte, diagramme, capture d’écran, Police&#10;&#10;Le contenu généré par l’IA peut être incorrect."/>
+                    <pic:cNvPr id="1816543905" name="Image 1" descr="Une image contenant texte, capture d’écran, Police, diagramme&#10;&#10;Le contenu généré par l’IA peut être incorrect."/>
                     <pic:cNvPicPr/>
                   </pic:nvPicPr>
                   <pic:blipFill>
@@ -804,7 +784,7 @@
                   <pic:spPr>
                     <a:xfrm>
                       <a:off x="0" y="0"/>
-                      <a:ext cx="5760720" cy="2449195"/>
+                      <a:ext cx="5760720" cy="2602230"/>
                     </a:xfrm>
                     <a:prstGeom prst="rect">
                       <a:avLst/>
@@ -845,7 +825,6 @@
         <w:pStyle w:val="Titre2"/>
       </w:pPr>
       <w:r>
-        <w:lastRenderedPageBreak/>
         <w:t xml:space="preserve">MLD : </w:t>
       </w:r>
     </w:p>
@@ -860,7 +839,6 @@
         </w:rPr>
         <w:t>Utilisateur = (</w:t>
       </w:r>
-      <w:proofErr w:type="spellStart"/>
       <w:r>
         <w:rPr>
           <w:b/>
@@ -869,7 +847,6 @@
         </w:rPr>
         <w:t>IdUtilisateur</w:t>
       </w:r>
-      <w:proofErr w:type="spellEnd"/>
       <w:r>
         <w:rPr>
           <w:b/>
@@ -887,87 +864,21 @@
           <w:i/>
           <w:iCs/>
         </w:rPr>
-        <w:t xml:space="preserve"> </w:t>
-      </w:r>
-      <w:proofErr w:type="gramStart"/>
-      <w:r>
-        <w:rPr>
-          <w:i/>
-          <w:iCs/>
-        </w:rPr>
-        <w:t>VARCHAR(</w:t>
-      </w:r>
-      <w:proofErr w:type="gramEnd"/>
-      <w:r>
-        <w:rPr>
-          <w:i/>
-          <w:iCs/>
-        </w:rPr>
-        <w:t>50</w:t>
-      </w:r>
-      <w:proofErr w:type="gramStart"/>
-      <w:r>
-        <w:rPr>
-          <w:i/>
-          <w:iCs/>
-        </w:rPr>
-        <w:t xml:space="preserve">) </w:t>
-      </w:r>
-      <w:r>
-        <w:t>,</w:t>
-      </w:r>
-      <w:proofErr w:type="gramEnd"/>
-      <w:r>
-        <w:t xml:space="preserve"> </w:t>
-      </w:r>
-      <w:proofErr w:type="spellStart"/>
-      <w:r>
-        <w:t>Prenom</w:t>
-      </w:r>
-      <w:proofErr w:type="spellEnd"/>
-      <w:r>
-        <w:rPr>
-          <w:i/>
-          <w:iCs/>
-        </w:rPr>
-        <w:t xml:space="preserve"> </w:t>
-      </w:r>
-      <w:proofErr w:type="gramStart"/>
-      <w:r>
-        <w:rPr>
-          <w:i/>
-          <w:iCs/>
-        </w:rPr>
-        <w:t>VARCHAR(</w:t>
-      </w:r>
-      <w:proofErr w:type="gramEnd"/>
-      <w:r>
-        <w:rPr>
-          <w:i/>
-          <w:iCs/>
-        </w:rPr>
-        <w:t>50</w:t>
-      </w:r>
-      <w:proofErr w:type="gramStart"/>
-      <w:r>
-        <w:rPr>
-          <w:i/>
-          <w:iCs/>
-        </w:rPr>
-        <w:t xml:space="preserve">) </w:t>
-      </w:r>
-      <w:r>
-        <w:t>,</w:t>
-      </w:r>
-      <w:proofErr w:type="gramEnd"/>
-      <w:r>
-        <w:t xml:space="preserve"> </w:t>
-      </w:r>
-      <w:proofErr w:type="spellStart"/>
-      <w:r>
-        <w:t>DateNaissance</w:t>
-      </w:r>
-      <w:proofErr w:type="spellEnd"/>
+        <w:t xml:space="preserve"> VARCHAR(50) </w:t>
+      </w:r>
+      <w:r>
+        <w:t>, Prenom</w:t>
+      </w:r>
+      <w:r>
+        <w:rPr>
+          <w:i/>
+          <w:iCs/>
+        </w:rPr>
+        <w:t xml:space="preserve"> VARCHAR(50) </w:t>
+      </w:r>
+      <w:r>
+        <w:t>, DateNaissance</w:t>
+      </w:r>
       <w:r>
         <w:rPr>
           <w:i/>
@@ -983,308 +894,88 @@
           <w:i/>
           <w:iCs/>
         </w:rPr>
-        <w:t xml:space="preserve"> </w:t>
-      </w:r>
-      <w:proofErr w:type="gramStart"/>
-      <w:r>
-        <w:rPr>
-          <w:i/>
-          <w:iCs/>
-        </w:rPr>
-        <w:t>VARCHAR(</w:t>
-      </w:r>
-      <w:proofErr w:type="gramEnd"/>
-      <w:r>
-        <w:rPr>
-          <w:i/>
-          <w:iCs/>
-        </w:rPr>
-        <w:t>50</w:t>
-      </w:r>
-      <w:proofErr w:type="gramStart"/>
-      <w:r>
-        <w:rPr>
-          <w:i/>
-          <w:iCs/>
-        </w:rPr>
-        <w:t xml:space="preserve">) </w:t>
-      </w:r>
-      <w:r>
-        <w:t>,</w:t>
-      </w:r>
-      <w:proofErr w:type="gramEnd"/>
-      <w:r>
-        <w:t xml:space="preserve"> Adresse2</w:t>
-      </w:r>
-      <w:r>
-        <w:rPr>
-          <w:i/>
-          <w:iCs/>
-        </w:rPr>
-        <w:t xml:space="preserve"> </w:t>
-      </w:r>
-      <w:proofErr w:type="gramStart"/>
-      <w:r>
-        <w:rPr>
-          <w:i/>
-          <w:iCs/>
-        </w:rPr>
-        <w:t>VARCHAR(</w:t>
-      </w:r>
-      <w:proofErr w:type="gramEnd"/>
-      <w:r>
-        <w:rPr>
-          <w:i/>
-          <w:iCs/>
-        </w:rPr>
-        <w:t>50</w:t>
-      </w:r>
-      <w:proofErr w:type="gramStart"/>
-      <w:r>
-        <w:rPr>
-          <w:i/>
-          <w:iCs/>
-        </w:rPr>
-        <w:t xml:space="preserve">) </w:t>
-      </w:r>
-      <w:r>
-        <w:t>,</w:t>
-      </w:r>
-      <w:proofErr w:type="gramEnd"/>
-      <w:r>
-        <w:t xml:space="preserve"> Ville</w:t>
-      </w:r>
-      <w:r>
-        <w:rPr>
-          <w:i/>
-          <w:iCs/>
-        </w:rPr>
-        <w:t xml:space="preserve"> </w:t>
-      </w:r>
-      <w:proofErr w:type="gramStart"/>
-      <w:r>
-        <w:rPr>
-          <w:i/>
-          <w:iCs/>
-        </w:rPr>
-        <w:t>VARCHAR(</w:t>
-      </w:r>
-      <w:proofErr w:type="gramEnd"/>
-      <w:r>
-        <w:rPr>
-          <w:i/>
-          <w:iCs/>
-        </w:rPr>
-        <w:t>50</w:t>
-      </w:r>
-      <w:proofErr w:type="gramStart"/>
-      <w:r>
-        <w:rPr>
-          <w:i/>
-          <w:iCs/>
-        </w:rPr>
-        <w:t xml:space="preserve">) </w:t>
-      </w:r>
-      <w:r>
-        <w:t>,</w:t>
-      </w:r>
-      <w:proofErr w:type="gramEnd"/>
-      <w:r>
-        <w:t xml:space="preserve"> Pays</w:t>
-      </w:r>
-      <w:r>
-        <w:rPr>
-          <w:i/>
-          <w:iCs/>
-        </w:rPr>
-        <w:t xml:space="preserve"> </w:t>
-      </w:r>
-      <w:proofErr w:type="gramStart"/>
-      <w:r>
-        <w:rPr>
-          <w:i/>
-          <w:iCs/>
-        </w:rPr>
-        <w:t>VARCHAR(</w:t>
-      </w:r>
-      <w:proofErr w:type="gramEnd"/>
-      <w:r>
-        <w:rPr>
-          <w:i/>
-          <w:iCs/>
-        </w:rPr>
-        <w:t>50</w:t>
-      </w:r>
-      <w:proofErr w:type="gramStart"/>
-      <w:r>
-        <w:rPr>
-          <w:i/>
-          <w:iCs/>
-        </w:rPr>
-        <w:t xml:space="preserve">) </w:t>
-      </w:r>
-      <w:r>
-        <w:t>,</w:t>
-      </w:r>
-      <w:proofErr w:type="gramEnd"/>
-      <w:r>
-        <w:t xml:space="preserve"> Mail</w:t>
-      </w:r>
-      <w:r>
-        <w:rPr>
-          <w:b/>
-          <w:bCs/>
-          <w:i/>
-          <w:iCs/>
-        </w:rPr>
-        <w:t xml:space="preserve"> </w:t>
-      </w:r>
-      <w:proofErr w:type="gramStart"/>
-      <w:r>
-        <w:rPr>
-          <w:b/>
-          <w:bCs/>
-          <w:i/>
-          <w:iCs/>
-        </w:rPr>
-        <w:t>VARCHAR(</w:t>
-      </w:r>
-      <w:proofErr w:type="gramEnd"/>
-      <w:r>
-        <w:rPr>
-          <w:b/>
-          <w:bCs/>
-          <w:i/>
-          <w:iCs/>
-        </w:rPr>
-        <w:t>50</w:t>
-      </w:r>
-      <w:proofErr w:type="gramStart"/>
-      <w:r>
-        <w:rPr>
-          <w:b/>
-          <w:bCs/>
-          <w:i/>
-          <w:iCs/>
-        </w:rPr>
-        <w:t xml:space="preserve">) </w:t>
-      </w:r>
-      <w:r>
-        <w:t>,</w:t>
-      </w:r>
-      <w:proofErr w:type="gramEnd"/>
-      <w:r>
-        <w:t xml:space="preserve"> </w:t>
-      </w:r>
-      <w:proofErr w:type="spellStart"/>
-      <w:r>
-        <w:t>NumeroTelephone</w:t>
-      </w:r>
-      <w:proofErr w:type="spellEnd"/>
-      <w:r>
-        <w:rPr>
-          <w:i/>
-          <w:iCs/>
-        </w:rPr>
-        <w:t xml:space="preserve"> </w:t>
-      </w:r>
-      <w:proofErr w:type="gramStart"/>
-      <w:r>
-        <w:rPr>
-          <w:i/>
-          <w:iCs/>
-        </w:rPr>
-        <w:t>VARCHAR(</w:t>
-      </w:r>
-      <w:proofErr w:type="gramEnd"/>
-      <w:r>
-        <w:rPr>
-          <w:i/>
-          <w:iCs/>
-        </w:rPr>
-        <w:t>50</w:t>
-      </w:r>
-      <w:proofErr w:type="gramStart"/>
-      <w:r>
-        <w:rPr>
-          <w:i/>
-          <w:iCs/>
-        </w:rPr>
-        <w:t xml:space="preserve">) </w:t>
-      </w:r>
-      <w:r>
-        <w:t>,</w:t>
-      </w:r>
-      <w:proofErr w:type="gramEnd"/>
-      <w:r>
-        <w:t xml:space="preserve"> Situation</w:t>
-      </w:r>
-      <w:r>
-        <w:rPr>
-          <w:i/>
-          <w:iCs/>
-        </w:rPr>
-        <w:t xml:space="preserve"> </w:t>
-      </w:r>
-      <w:proofErr w:type="gramStart"/>
-      <w:r>
-        <w:rPr>
-          <w:i/>
-          <w:iCs/>
-        </w:rPr>
-        <w:t>VARCHAR(</w:t>
-      </w:r>
-      <w:proofErr w:type="gramEnd"/>
-      <w:r>
-        <w:rPr>
-          <w:i/>
-          <w:iCs/>
-        </w:rPr>
-        <w:t>50</w:t>
-      </w:r>
-      <w:proofErr w:type="gramStart"/>
-      <w:r>
-        <w:rPr>
-          <w:i/>
-          <w:iCs/>
-        </w:rPr>
-        <w:t xml:space="preserve">) </w:t>
-      </w:r>
-      <w:r>
-        <w:rPr>
-          <w:b/>
-          <w:bCs/>
-        </w:rPr>
-        <w:t>)</w:t>
-      </w:r>
-      <w:proofErr w:type="gramEnd"/>
-      <w:r>
-        <w:rPr>
-          <w:b/>
-          <w:bCs/>
-        </w:rPr>
-        <w:t>;</w:t>
-      </w:r>
-    </w:p>
-    <w:p>
-      <w:pPr>
-        <w:spacing w:after="0"/>
-      </w:pPr>
-      <w:proofErr w:type="spellStart"/>
-      <w:r>
-        <w:rPr>
-          <w:b/>
-          <w:bCs/>
-        </w:rPr>
-        <w:t>Employe</w:t>
-      </w:r>
-      <w:proofErr w:type="spellEnd"/>
-      <w:r>
-        <w:rPr>
-          <w:b/>
-          <w:bCs/>
-        </w:rPr>
-        <w:t xml:space="preserve"> = (</w:t>
+        <w:t xml:space="preserve"> VARCHAR(50) </w:t>
+      </w:r>
+      <w:r>
+        <w:t>, Adresse2</w:t>
+      </w:r>
+      <w:r>
+        <w:rPr>
+          <w:i/>
+          <w:iCs/>
+        </w:rPr>
+        <w:t xml:space="preserve"> VARCHAR(50) </w:t>
+      </w:r>
+      <w:r>
+        <w:t>, Ville</w:t>
+      </w:r>
+      <w:r>
+        <w:rPr>
+          <w:i/>
+          <w:iCs/>
+        </w:rPr>
+        <w:t xml:space="preserve"> VARCHAR(50) </w:t>
+      </w:r>
+      <w:r>
+        <w:t>, Pays</w:t>
+      </w:r>
+      <w:r>
+        <w:rPr>
+          <w:i/>
+          <w:iCs/>
+        </w:rPr>
+        <w:t xml:space="preserve"> VARCHAR(50) </w:t>
+      </w:r>
+      <w:r>
+        <w:t>, Mail</w:t>
+      </w:r>
+      <w:r>
+        <w:rPr>
+          <w:b/>
+          <w:bCs/>
+          <w:i/>
+          <w:iCs/>
+        </w:rPr>
+        <w:t xml:space="preserve"> VARCHAR(50) </w:t>
+      </w:r>
+      <w:r>
+        <w:t>, NumeroTelephone</w:t>
+      </w:r>
+      <w:r>
+        <w:rPr>
+          <w:i/>
+          <w:iCs/>
+        </w:rPr>
+        <w:t xml:space="preserve"> VARCHAR(50) </w:t>
+      </w:r>
+      <w:r>
+        <w:t>, Situation</w:t>
+      </w:r>
+      <w:r>
+        <w:rPr>
+          <w:i/>
+          <w:iCs/>
+        </w:rPr>
+        <w:t xml:space="preserve"> VARCHAR(50) </w:t>
+      </w:r>
+      <w:r>
+        <w:rPr>
+          <w:b/>
+          <w:bCs/>
+        </w:rPr>
+        <w:t>);</w:t>
+      </w:r>
+    </w:p>
+    <w:p>
+      <w:pPr>
+        <w:spacing w:after="0"/>
+      </w:pPr>
+      <w:r>
+        <w:rPr>
+          <w:b/>
+          <w:bCs/>
+        </w:rPr>
+        <w:t>Employe = (</w:t>
       </w:r>
       <w:r>
         <w:rPr>
@@ -1304,46 +995,14 @@
           <w:i/>
           <w:iCs/>
         </w:rPr>
-        <w:t xml:space="preserve"> </w:t>
-      </w:r>
-      <w:proofErr w:type="gramStart"/>
-      <w:r>
-        <w:rPr>
-          <w:i/>
-          <w:iCs/>
-        </w:rPr>
-        <w:t>VARCHAR(</w:t>
-      </w:r>
-      <w:proofErr w:type="gramEnd"/>
-      <w:r>
-        <w:rPr>
-          <w:i/>
-          <w:iCs/>
-        </w:rPr>
-        <w:t>50</w:t>
-      </w:r>
-      <w:proofErr w:type="gramStart"/>
-      <w:r>
-        <w:rPr>
-          <w:i/>
-          <w:iCs/>
-        </w:rPr>
-        <w:t xml:space="preserve">) </w:t>
-      </w:r>
-      <w:r>
-        <w:rPr>
-          <w:b/>
-          <w:bCs/>
-        </w:rPr>
-        <w:t>)</w:t>
-      </w:r>
-      <w:proofErr w:type="gramEnd"/>
-      <w:r>
-        <w:rPr>
-          <w:b/>
-          <w:bCs/>
-        </w:rPr>
-        <w:t>;</w:t>
+        <w:t xml:space="preserve"> VARCHAR(50) </w:t>
+      </w:r>
+      <w:r>
+        <w:rPr>
+          <w:b/>
+          <w:bCs/>
+        </w:rPr>
+        <w:t>);</w:t>
       </w:r>
     </w:p>
     <w:p>
@@ -1357,7 +1016,6 @@
         </w:rPr>
         <w:t>Document = (</w:t>
       </w:r>
-      <w:proofErr w:type="spellStart"/>
       <w:r>
         <w:rPr>
           <w:b/>
@@ -1366,7 +1024,6 @@
         </w:rPr>
         <w:t>IdDocument</w:t>
       </w:r>
-      <w:proofErr w:type="spellEnd"/>
       <w:r>
         <w:rPr>
           <w:b/>
@@ -1384,44 +1041,11 @@
           <w:i/>
           <w:iCs/>
         </w:rPr>
-        <w:t xml:space="preserve"> </w:t>
-      </w:r>
-      <w:proofErr w:type="gramStart"/>
-      <w:r>
-        <w:rPr>
-          <w:i/>
-          <w:iCs/>
-        </w:rPr>
-        <w:t>VARCHAR(</w:t>
-      </w:r>
-      <w:proofErr w:type="gramEnd"/>
-      <w:r>
-        <w:rPr>
-          <w:i/>
-          <w:iCs/>
-        </w:rPr>
-        <w:t>50</w:t>
-      </w:r>
-      <w:proofErr w:type="gramStart"/>
-      <w:r>
-        <w:rPr>
-          <w:i/>
-          <w:iCs/>
-        </w:rPr>
-        <w:t xml:space="preserve">) </w:t>
-      </w:r>
-      <w:r>
-        <w:t>,</w:t>
-      </w:r>
-      <w:proofErr w:type="gramEnd"/>
-      <w:r>
-        <w:t xml:space="preserve"> </w:t>
-      </w:r>
-      <w:proofErr w:type="spellStart"/>
-      <w:r>
-        <w:t>Annee</w:t>
-      </w:r>
-      <w:proofErr w:type="spellEnd"/>
+        <w:t xml:space="preserve"> VARCHAR(50) </w:t>
+      </w:r>
+      <w:r>
+        <w:t>, Annee</w:t>
+      </w:r>
       <w:r>
         <w:rPr>
           <w:i/>
@@ -1437,44 +1061,11 @@
           <w:i/>
           <w:iCs/>
         </w:rPr>
-        <w:t xml:space="preserve"> </w:t>
-      </w:r>
-      <w:proofErr w:type="gramStart"/>
-      <w:r>
-        <w:rPr>
-          <w:i/>
-          <w:iCs/>
-        </w:rPr>
-        <w:t>VARCHAR(</w:t>
-      </w:r>
-      <w:proofErr w:type="gramEnd"/>
-      <w:r>
-        <w:rPr>
-          <w:i/>
-          <w:iCs/>
-        </w:rPr>
-        <w:t>50</w:t>
-      </w:r>
-      <w:proofErr w:type="gramStart"/>
-      <w:r>
-        <w:rPr>
-          <w:i/>
-          <w:iCs/>
-        </w:rPr>
-        <w:t xml:space="preserve">) </w:t>
-      </w:r>
-      <w:r>
-        <w:t>,</w:t>
-      </w:r>
-      <w:proofErr w:type="gramEnd"/>
-      <w:r>
-        <w:t xml:space="preserve"> </w:t>
-      </w:r>
-      <w:proofErr w:type="spellStart"/>
-      <w:r>
-        <w:t>Resume</w:t>
-      </w:r>
-      <w:proofErr w:type="spellEnd"/>
+        <w:t xml:space="preserve"> VARCHAR(50) </w:t>
+      </w:r>
+      <w:r>
+        <w:t>, Resume</w:t>
+      </w:r>
       <w:r>
         <w:rPr>
           <w:i/>
@@ -1492,7 +1083,6 @@
         </w:rPr>
         <w:t xml:space="preserve"> INT</w:t>
       </w:r>
-      <w:proofErr w:type="gramStart"/>
       <w:r>
         <w:rPr>
           <w:b/>
@@ -1500,7 +1090,6 @@
         </w:rPr>
         <w:t>);</w:t>
       </w:r>
-      <w:proofErr w:type="gramEnd"/>
     </w:p>
     <w:p>
       <w:pPr>
@@ -1540,50 +1129,11 @@
           <w:i/>
           <w:iCs/>
         </w:rPr>
-        <w:t xml:space="preserve"> </w:t>
-      </w:r>
-      <w:proofErr w:type="gramStart"/>
-      <w:r>
-        <w:rPr>
-          <w:b/>
-          <w:bCs/>
-          <w:i/>
-          <w:iCs/>
-        </w:rPr>
-        <w:t>VARCHAR(</w:t>
-      </w:r>
-      <w:proofErr w:type="gramEnd"/>
-      <w:r>
-        <w:rPr>
-          <w:b/>
-          <w:bCs/>
-          <w:i/>
-          <w:iCs/>
-        </w:rPr>
-        <w:t>50</w:t>
-      </w:r>
-      <w:proofErr w:type="gramStart"/>
-      <w:r>
-        <w:rPr>
-          <w:b/>
-          <w:bCs/>
-          <w:i/>
-          <w:iCs/>
-        </w:rPr>
-        <w:t xml:space="preserve">) </w:t>
-      </w:r>
-      <w:r>
-        <w:t>,</w:t>
-      </w:r>
-      <w:proofErr w:type="gramEnd"/>
-      <w:r>
-        <w:t xml:space="preserve"> </w:t>
-      </w:r>
-      <w:proofErr w:type="spellStart"/>
-      <w:r>
-        <w:t>NombrePage</w:t>
-      </w:r>
-      <w:proofErr w:type="spellEnd"/>
+        <w:t xml:space="preserve"> VARCHAR(50) </w:t>
+      </w:r>
+      <w:r>
+        <w:t>, NombrePage</w:t>
+      </w:r>
       <w:r>
         <w:rPr>
           <w:i/>
@@ -1599,67 +1149,26 @@
           <w:i/>
           <w:iCs/>
         </w:rPr>
-        <w:t xml:space="preserve"> </w:t>
-      </w:r>
-      <w:proofErr w:type="gramStart"/>
-      <w:r>
-        <w:rPr>
-          <w:i/>
-          <w:iCs/>
-        </w:rPr>
-        <w:t>VARCHAR(</w:t>
-      </w:r>
-      <w:proofErr w:type="gramEnd"/>
-      <w:r>
-        <w:rPr>
-          <w:i/>
-          <w:iCs/>
-        </w:rPr>
-        <w:t>50</w:t>
-      </w:r>
-      <w:proofErr w:type="gramStart"/>
-      <w:r>
-        <w:rPr>
-          <w:i/>
-          <w:iCs/>
-        </w:rPr>
-        <w:t xml:space="preserve">) </w:t>
-      </w:r>
-      <w:r>
-        <w:rPr>
-          <w:b/>
-          <w:bCs/>
-        </w:rPr>
-        <w:t>)</w:t>
-      </w:r>
-      <w:proofErr w:type="gramEnd"/>
-      <w:r>
-        <w:rPr>
-          <w:b/>
-          <w:bCs/>
-        </w:rPr>
-        <w:t>;</w:t>
-      </w:r>
-    </w:p>
-    <w:p>
-      <w:pPr>
-        <w:spacing w:after="0"/>
-      </w:pPr>
-      <w:proofErr w:type="spellStart"/>
-      <w:r>
-        <w:rPr>
-          <w:b/>
-          <w:bCs/>
-        </w:rPr>
-        <w:t>TitrePeriodique</w:t>
-      </w:r>
-      <w:proofErr w:type="spellEnd"/>
-      <w:r>
-        <w:rPr>
-          <w:b/>
-          <w:bCs/>
-        </w:rPr>
-        <w:t xml:space="preserve"> = (</w:t>
+        <w:t xml:space="preserve"> VARCHAR(50) </w:t>
+      </w:r>
+      <w:r>
+        <w:rPr>
+          <w:b/>
+          <w:bCs/>
+        </w:rPr>
+        <w:t>);</w:t>
+      </w:r>
+    </w:p>
+    <w:p>
+      <w:pPr>
+        <w:spacing w:after="0"/>
+      </w:pPr>
+      <w:r>
+        <w:rPr>
+          <w:b/>
+          <w:bCs/>
+        </w:rPr>
+        <w:t>TitrePeriodique = (</w:t>
       </w:r>
       <w:r>
         <w:rPr>
@@ -1672,13 +1181,8 @@
         <w:t>#IdDocument</w:t>
       </w:r>
       <w:r>
-        <w:t xml:space="preserve">, </w:t>
-      </w:r>
-      <w:proofErr w:type="spellStart"/>
-      <w:r>
-        <w:t>Numero</w:t>
-      </w:r>
-      <w:proofErr w:type="spellEnd"/>
+        <w:t>, Numero</w:t>
+      </w:r>
       <w:r>
         <w:rPr>
           <w:i/>
@@ -1687,13 +1191,8 @@
         <w:t xml:space="preserve"> INT</w:t>
       </w:r>
       <w:r>
-        <w:t xml:space="preserve">, </w:t>
-      </w:r>
-      <w:proofErr w:type="spellStart"/>
-      <w:r>
-        <w:t>DatePublication</w:t>
-      </w:r>
-      <w:proofErr w:type="spellEnd"/>
+        <w:t>, DatePublication</w:t>
+      </w:r>
       <w:r>
         <w:rPr>
           <w:i/>
@@ -1709,46 +1208,14 @@
           <w:i/>
           <w:iCs/>
         </w:rPr>
-        <w:t xml:space="preserve"> </w:t>
-      </w:r>
-      <w:proofErr w:type="gramStart"/>
-      <w:r>
-        <w:rPr>
-          <w:i/>
-          <w:iCs/>
-        </w:rPr>
-        <w:t>VARCHAR(</w:t>
-      </w:r>
-      <w:proofErr w:type="gramEnd"/>
-      <w:r>
-        <w:rPr>
-          <w:i/>
-          <w:iCs/>
-        </w:rPr>
-        <w:t>50</w:t>
-      </w:r>
-      <w:proofErr w:type="gramStart"/>
-      <w:r>
-        <w:rPr>
-          <w:i/>
-          <w:iCs/>
-        </w:rPr>
-        <w:t xml:space="preserve">) </w:t>
-      </w:r>
-      <w:r>
-        <w:rPr>
-          <w:b/>
-          <w:bCs/>
-        </w:rPr>
-        <w:t>)</w:t>
-      </w:r>
-      <w:proofErr w:type="gramEnd"/>
-      <w:r>
-        <w:rPr>
-          <w:b/>
-          <w:bCs/>
-        </w:rPr>
-        <w:t>;</w:t>
+        <w:t xml:space="preserve"> VARCHAR(50) </w:t>
+      </w:r>
+      <w:r>
+        <w:rPr>
+          <w:b/>
+          <w:bCs/>
+        </w:rPr>
+        <w:t>);</w:t>
       </w:r>
     </w:p>
     <w:p>
@@ -1773,13 +1240,8 @@
         <w:t>#IdDocument</w:t>
       </w:r>
       <w:r>
-        <w:t xml:space="preserve">, </w:t>
-      </w:r>
-      <w:proofErr w:type="spellStart"/>
-      <w:r>
-        <w:t>Duree</w:t>
-      </w:r>
-      <w:proofErr w:type="spellEnd"/>
+        <w:t>, Duree</w:t>
+      </w:r>
       <w:r>
         <w:rPr>
           <w:i/>
@@ -1795,110 +1257,36 @@
           <w:i/>
           <w:iCs/>
         </w:rPr>
-        <w:t xml:space="preserve"> </w:t>
-      </w:r>
-      <w:proofErr w:type="gramStart"/>
-      <w:r>
-        <w:rPr>
-          <w:i/>
-          <w:iCs/>
-        </w:rPr>
-        <w:t>VARCHAR(</w:t>
-      </w:r>
-      <w:proofErr w:type="gramEnd"/>
-      <w:r>
-        <w:rPr>
-          <w:i/>
-          <w:iCs/>
-        </w:rPr>
-        <w:t>50</w:t>
-      </w:r>
-      <w:proofErr w:type="gramStart"/>
-      <w:r>
-        <w:rPr>
-          <w:i/>
-          <w:iCs/>
-        </w:rPr>
-        <w:t xml:space="preserve">) </w:t>
-      </w:r>
-      <w:r>
-        <w:t>,</w:t>
-      </w:r>
-      <w:proofErr w:type="gramEnd"/>
-      <w:r>
-        <w:t xml:space="preserve"> </w:t>
-      </w:r>
-      <w:proofErr w:type="spellStart"/>
-      <w:r>
-        <w:t>Interprete</w:t>
-      </w:r>
-      <w:proofErr w:type="spellEnd"/>
-      <w:r>
-        <w:rPr>
-          <w:i/>
-          <w:iCs/>
-        </w:rPr>
-        <w:t xml:space="preserve"> </w:t>
-      </w:r>
-      <w:proofErr w:type="gramStart"/>
-      <w:r>
-        <w:rPr>
-          <w:i/>
-          <w:iCs/>
-        </w:rPr>
-        <w:t>VARCHAR(</w:t>
-      </w:r>
-      <w:proofErr w:type="gramEnd"/>
-      <w:r>
-        <w:rPr>
-          <w:i/>
-          <w:iCs/>
-        </w:rPr>
-        <w:t>50</w:t>
-      </w:r>
-      <w:proofErr w:type="gramStart"/>
-      <w:r>
-        <w:rPr>
-          <w:i/>
-          <w:iCs/>
-        </w:rPr>
-        <w:t xml:space="preserve">) </w:t>
-      </w:r>
-      <w:r>
-        <w:rPr>
-          <w:b/>
-          <w:bCs/>
-        </w:rPr>
-        <w:t>)</w:t>
-      </w:r>
-      <w:proofErr w:type="gramEnd"/>
-      <w:r>
-        <w:rPr>
-          <w:b/>
-          <w:bCs/>
-        </w:rPr>
-        <w:t>;</w:t>
-      </w:r>
-    </w:p>
-    <w:p>
-      <w:pPr>
-        <w:spacing w:after="0"/>
-      </w:pPr>
-      <w:proofErr w:type="spellStart"/>
-      <w:r>
-        <w:rPr>
-          <w:b/>
-          <w:bCs/>
-        </w:rPr>
-        <w:t>Video</w:t>
-      </w:r>
-      <w:proofErr w:type="spellEnd"/>
-      <w:r>
-        <w:rPr>
-          <w:b/>
-          <w:bCs/>
-        </w:rPr>
-        <w:t xml:space="preserve"> = (</w:t>
+        <w:t xml:space="preserve"> VARCHAR(50) </w:t>
+      </w:r>
+      <w:r>
+        <w:t>, Interprete</w:t>
+      </w:r>
+      <w:r>
+        <w:rPr>
+          <w:i/>
+          <w:iCs/>
+        </w:rPr>
+        <w:t xml:space="preserve"> VARCHAR(50) </w:t>
+      </w:r>
+      <w:r>
+        <w:rPr>
+          <w:b/>
+          <w:bCs/>
+        </w:rPr>
+        <w:t>);</w:t>
+      </w:r>
+    </w:p>
+    <w:p>
+      <w:pPr>
+        <w:spacing w:after="0"/>
+      </w:pPr>
+      <w:r>
+        <w:rPr>
+          <w:b/>
+          <w:bCs/>
+        </w:rPr>
+        <w:t>Video = (</w:t>
       </w:r>
       <w:r>
         <w:rPr>
@@ -1911,13 +1299,8 @@
         <w:t>#IdDocument</w:t>
       </w:r>
       <w:r>
-        <w:t xml:space="preserve">, </w:t>
-      </w:r>
-      <w:proofErr w:type="spellStart"/>
-      <w:r>
-        <w:t>Duree</w:t>
-      </w:r>
-      <w:proofErr w:type="spellEnd"/>
+        <w:t>, Duree</w:t>
+      </w:r>
       <w:r>
         <w:rPr>
           <w:i/>
@@ -1933,89 +1316,24 @@
           <w:i/>
           <w:iCs/>
         </w:rPr>
-        <w:t xml:space="preserve"> </w:t>
-      </w:r>
-      <w:proofErr w:type="gramStart"/>
-      <w:r>
-        <w:rPr>
-          <w:i/>
-          <w:iCs/>
-        </w:rPr>
-        <w:t>VARCHAR(</w:t>
-      </w:r>
-      <w:proofErr w:type="gramEnd"/>
-      <w:r>
-        <w:rPr>
-          <w:i/>
-          <w:iCs/>
-        </w:rPr>
-        <w:t>50</w:t>
-      </w:r>
-      <w:proofErr w:type="gramStart"/>
-      <w:r>
-        <w:rPr>
-          <w:i/>
-          <w:iCs/>
-        </w:rPr>
-        <w:t xml:space="preserve">) </w:t>
-      </w:r>
-      <w:r>
-        <w:t>,</w:t>
-      </w:r>
-      <w:proofErr w:type="gramEnd"/>
-      <w:r>
-        <w:t xml:space="preserve"> </w:t>
-      </w:r>
-      <w:proofErr w:type="spellStart"/>
-      <w:r>
-        <w:t>Realisateur</w:t>
-      </w:r>
-      <w:proofErr w:type="spellEnd"/>
-      <w:r>
-        <w:rPr>
-          <w:i/>
-          <w:iCs/>
-        </w:rPr>
-        <w:t xml:space="preserve"> </w:t>
-      </w:r>
-      <w:proofErr w:type="gramStart"/>
-      <w:r>
-        <w:rPr>
-          <w:i/>
-          <w:iCs/>
-        </w:rPr>
-        <w:t>VARCHAR(</w:t>
-      </w:r>
-      <w:proofErr w:type="gramEnd"/>
-      <w:r>
-        <w:rPr>
-          <w:i/>
-          <w:iCs/>
-        </w:rPr>
-        <w:t>50</w:t>
-      </w:r>
-      <w:proofErr w:type="gramStart"/>
-      <w:r>
-        <w:rPr>
-          <w:i/>
-          <w:iCs/>
-        </w:rPr>
-        <w:t xml:space="preserve">) </w:t>
-      </w:r>
-      <w:r>
-        <w:rPr>
-          <w:b/>
-          <w:bCs/>
-        </w:rPr>
-        <w:t>)</w:t>
-      </w:r>
-      <w:proofErr w:type="gramEnd"/>
-      <w:r>
-        <w:rPr>
-          <w:b/>
-          <w:bCs/>
-        </w:rPr>
-        <w:t>;</w:t>
+        <w:t xml:space="preserve"> VARCHAR(50) </w:t>
+      </w:r>
+      <w:r>
+        <w:t>, Realisateur</w:t>
+      </w:r>
+      <w:r>
+        <w:rPr>
+          <w:i/>
+          <w:iCs/>
+        </w:rPr>
+        <w:t xml:space="preserve"> VARCHAR(50) </w:t>
+      </w:r>
+      <w:r>
+        <w:rPr>
+          <w:b/>
+          <w:bCs/>
+        </w:rPr>
+        <w:t>);</w:t>
       </w:r>
     </w:p>
     <w:p>
@@ -2029,7 +1347,6 @@
         </w:rPr>
         <w:t>Auteur = (</w:t>
       </w:r>
-      <w:proofErr w:type="spellStart"/>
       <w:r>
         <w:rPr>
           <w:b/>
@@ -2038,7 +1355,6 @@
         </w:rPr>
         <w:t>IdAuteur</w:t>
       </w:r>
-      <w:proofErr w:type="spellEnd"/>
       <w:r>
         <w:rPr>
           <w:b/>
@@ -2049,88 +1365,27 @@
         <w:t xml:space="preserve"> INT AUTO_INCREMENT</w:t>
       </w:r>
       <w:r>
-        <w:t xml:space="preserve">, </w:t>
-      </w:r>
-      <w:proofErr w:type="spellStart"/>
-      <w:r>
-        <w:t>Prenom</w:t>
-      </w:r>
-      <w:proofErr w:type="spellEnd"/>
-      <w:r>
-        <w:rPr>
-          <w:i/>
-          <w:iCs/>
-        </w:rPr>
-        <w:t xml:space="preserve"> </w:t>
-      </w:r>
-      <w:proofErr w:type="gramStart"/>
-      <w:r>
-        <w:rPr>
-          <w:i/>
-          <w:iCs/>
-        </w:rPr>
-        <w:t>VARCHAR(</w:t>
-      </w:r>
-      <w:proofErr w:type="gramEnd"/>
-      <w:r>
-        <w:rPr>
-          <w:i/>
-          <w:iCs/>
-        </w:rPr>
-        <w:t>50</w:t>
-      </w:r>
-      <w:proofErr w:type="gramStart"/>
-      <w:r>
-        <w:rPr>
-          <w:i/>
-          <w:iCs/>
-        </w:rPr>
-        <w:t xml:space="preserve">) </w:t>
-      </w:r>
-      <w:r>
-        <w:t>,</w:t>
-      </w:r>
-      <w:proofErr w:type="gramEnd"/>
-      <w:r>
-        <w:t xml:space="preserve"> Nom</w:t>
-      </w:r>
-      <w:r>
-        <w:rPr>
-          <w:i/>
-          <w:iCs/>
-        </w:rPr>
-        <w:t xml:space="preserve"> </w:t>
-      </w:r>
-      <w:proofErr w:type="gramStart"/>
-      <w:r>
-        <w:rPr>
-          <w:i/>
-          <w:iCs/>
-        </w:rPr>
-        <w:t>VARCHAR(</w:t>
-      </w:r>
-      <w:proofErr w:type="gramEnd"/>
-      <w:r>
-        <w:rPr>
-          <w:i/>
-          <w:iCs/>
-        </w:rPr>
-        <w:t>50</w:t>
-      </w:r>
-      <w:proofErr w:type="gramStart"/>
-      <w:r>
-        <w:rPr>
-          <w:i/>
-          <w:iCs/>
-        </w:rPr>
-        <w:t xml:space="preserve">) </w:t>
-      </w:r>
-      <w:r>
-        <w:t>,</w:t>
-      </w:r>
-      <w:proofErr w:type="gramEnd"/>
-      <w:r>
-        <w:t xml:space="preserve"> Description</w:t>
+        <w:t>, Prenom</w:t>
+      </w:r>
+      <w:r>
+        <w:rPr>
+          <w:i/>
+          <w:iCs/>
+        </w:rPr>
+        <w:t xml:space="preserve"> VARCHAR(50) </w:t>
+      </w:r>
+      <w:r>
+        <w:t>, Nom</w:t>
+      </w:r>
+      <w:r>
+        <w:rPr>
+          <w:i/>
+          <w:iCs/>
+        </w:rPr>
+        <w:t xml:space="preserve"> VARCHAR(50) </w:t>
+      </w:r>
+      <w:r>
+        <w:t>, Description</w:t>
       </w:r>
       <w:r>
         <w:rPr>
@@ -2139,7 +1394,6 @@
         </w:rPr>
         <w:t xml:space="preserve"> TEXT</w:t>
       </w:r>
-      <w:proofErr w:type="gramStart"/>
       <w:r>
         <w:rPr>
           <w:b/>
@@ -2147,7 +1401,6 @@
         </w:rPr>
         <w:t>);</w:t>
       </w:r>
-      <w:proofErr w:type="gramEnd"/>
     </w:p>
     <w:p>
       <w:pPr>
@@ -2160,7 +1413,6 @@
         </w:rPr>
         <w:t>Abonnement = (</w:t>
       </w:r>
-      <w:proofErr w:type="spellStart"/>
       <w:r>
         <w:rPr>
           <w:b/>
@@ -2169,77 +1421,25 @@
         </w:rPr>
         <w:t>IdAbonnement</w:t>
       </w:r>
-      <w:proofErr w:type="spellEnd"/>
-      <w:r>
-        <w:rPr>
-          <w:b/>
-          <w:bCs/>
-          <w:i/>
-          <w:iCs/>
-        </w:rPr>
-        <w:t xml:space="preserve"> </w:t>
-      </w:r>
-      <w:proofErr w:type="gramStart"/>
-      <w:r>
-        <w:rPr>
-          <w:b/>
-          <w:bCs/>
-          <w:i/>
-          <w:iCs/>
-        </w:rPr>
-        <w:t>VARCHAR(</w:t>
-      </w:r>
-      <w:proofErr w:type="gramEnd"/>
-      <w:r>
-        <w:rPr>
-          <w:b/>
-          <w:bCs/>
-          <w:i/>
-          <w:iCs/>
-        </w:rPr>
-        <w:t>50</w:t>
-      </w:r>
-      <w:proofErr w:type="gramStart"/>
-      <w:r>
-        <w:rPr>
-          <w:b/>
-          <w:bCs/>
-          <w:i/>
-          <w:iCs/>
-        </w:rPr>
-        <w:t xml:space="preserve">) </w:t>
-      </w:r>
-      <w:r>
-        <w:t>,</w:t>
-      </w:r>
-      <w:proofErr w:type="gramEnd"/>
-      <w:r>
-        <w:t xml:space="preserve"> Tarif</w:t>
-      </w:r>
-      <w:r>
-        <w:rPr>
-          <w:i/>
-          <w:iCs/>
-        </w:rPr>
-        <w:t xml:space="preserve"> </w:t>
-      </w:r>
-      <w:proofErr w:type="gramStart"/>
-      <w:r>
-        <w:rPr>
-          <w:i/>
-          <w:iCs/>
-        </w:rPr>
-        <w:t>DECIMAL(</w:t>
-      </w:r>
-      <w:proofErr w:type="gramEnd"/>
-      <w:r>
-        <w:rPr>
-          <w:i/>
-          <w:iCs/>
-        </w:rPr>
-        <w:t>19,4)</w:t>
-      </w:r>
-      <w:proofErr w:type="gramStart"/>
+      <w:r>
+        <w:rPr>
+          <w:b/>
+          <w:bCs/>
+          <w:i/>
+          <w:iCs/>
+        </w:rPr>
+        <w:t xml:space="preserve"> VARCHAR(50) </w:t>
+      </w:r>
+      <w:r>
+        <w:t>, Tarif</w:t>
+      </w:r>
+      <w:r>
+        <w:rPr>
+          <w:i/>
+          <w:iCs/>
+        </w:rPr>
+        <w:t xml:space="preserve"> DECIMAL(19,4)</w:t>
+      </w:r>
       <w:r>
         <w:rPr>
           <w:b/>
@@ -2247,7 +1447,6 @@
         </w:rPr>
         <w:t>);</w:t>
       </w:r>
-      <w:proofErr w:type="gramEnd"/>
     </w:p>
     <w:p>
       <w:pPr>
@@ -2260,7 +1459,6 @@
         </w:rPr>
         <w:t>Emprunt = (</w:t>
       </w:r>
-      <w:proofErr w:type="spellStart"/>
       <w:r>
         <w:rPr>
           <w:b/>
@@ -2269,7 +1467,6 @@
         </w:rPr>
         <w:t>IdEmprunt</w:t>
       </w:r>
-      <w:proofErr w:type="spellEnd"/>
       <w:r>
         <w:rPr>
           <w:b/>
@@ -2280,13 +1477,8 @@
         <w:t xml:space="preserve"> INT AUTO_INCREMENT</w:t>
       </w:r>
       <w:r>
-        <w:t xml:space="preserve">, </w:t>
-      </w:r>
-      <w:proofErr w:type="spellStart"/>
-      <w:r>
-        <w:t>DateReservation</w:t>
-      </w:r>
-      <w:proofErr w:type="spellEnd"/>
+        <w:t>, DateReservation</w:t>
+      </w:r>
       <w:r>
         <w:rPr>
           <w:i/>
@@ -2295,13 +1487,8 @@
         <w:t xml:space="preserve"> DATE</w:t>
       </w:r>
       <w:r>
-        <w:t xml:space="preserve">, </w:t>
-      </w:r>
-      <w:proofErr w:type="spellStart"/>
-      <w:r>
-        <w:t>DateRenduPrevision</w:t>
-      </w:r>
-      <w:proofErr w:type="spellEnd"/>
+        <w:t>, DateRenduPrevision</w:t>
+      </w:r>
       <w:r>
         <w:rPr>
           <w:i/>
@@ -2310,13 +1497,8 @@
         <w:t xml:space="preserve"> DATE</w:t>
       </w:r>
       <w:r>
-        <w:t xml:space="preserve">, </w:t>
-      </w:r>
-      <w:proofErr w:type="spellStart"/>
-      <w:r>
-        <w:t>DateRendu</w:t>
-      </w:r>
-      <w:proofErr w:type="spellEnd"/>
+        <w:t>, DateRendu</w:t>
+      </w:r>
       <w:r>
         <w:rPr>
           <w:i/>
@@ -2324,7 +1506,6 @@
         </w:rPr>
         <w:t xml:space="preserve"> DATE, #IdUtilisateur</w:t>
       </w:r>
-      <w:proofErr w:type="gramStart"/>
       <w:r>
         <w:rPr>
           <w:b/>
@@ -2332,7 +1513,6 @@
         </w:rPr>
         <w:t>);</w:t>
       </w:r>
-      <w:proofErr w:type="gramEnd"/>
     </w:p>
     <w:p>
       <w:pPr>
@@ -2356,56 +1536,18 @@
         <w:t>#IdUtilisateur</w:t>
       </w:r>
       <w:r>
-        <w:t xml:space="preserve">, </w:t>
-      </w:r>
-      <w:proofErr w:type="spellStart"/>
-      <w:r>
-        <w:t>StatutAbonnement</w:t>
-      </w:r>
-      <w:proofErr w:type="spellEnd"/>
-      <w:r>
-        <w:rPr>
-          <w:i/>
-          <w:iCs/>
-        </w:rPr>
-        <w:t xml:space="preserve"> </w:t>
-      </w:r>
-      <w:proofErr w:type="gramStart"/>
-      <w:r>
-        <w:rPr>
-          <w:i/>
-          <w:iCs/>
-        </w:rPr>
-        <w:t>VARCHAR(</w:t>
-      </w:r>
-      <w:proofErr w:type="gramEnd"/>
-      <w:r>
-        <w:rPr>
-          <w:i/>
-          <w:iCs/>
-        </w:rPr>
-        <w:t>50</w:t>
-      </w:r>
-      <w:proofErr w:type="gramStart"/>
-      <w:r>
-        <w:rPr>
-          <w:i/>
-          <w:iCs/>
-        </w:rPr>
-        <w:t xml:space="preserve">) </w:t>
-      </w:r>
-      <w:r>
-        <w:t>,</w:t>
-      </w:r>
-      <w:proofErr w:type="gramEnd"/>
-      <w:r>
-        <w:t xml:space="preserve"> </w:t>
-      </w:r>
-      <w:proofErr w:type="spellStart"/>
-      <w:r>
-        <w:t>DateFinAbonnement</w:t>
-      </w:r>
-      <w:proofErr w:type="spellEnd"/>
+        <w:t>, StatutAbonnement</w:t>
+      </w:r>
+      <w:r>
+        <w:rPr>
+          <w:i/>
+          <w:iCs/>
+        </w:rPr>
+        <w:t xml:space="preserve"> VARCHAR(50) </w:t>
+      </w:r>
+      <w:r>
+        <w:t>, DateFinAbonnement</w:t>
+      </w:r>
       <w:r>
         <w:rPr>
           <w:i/>
@@ -2418,9 +1560,30 @@
           <w:b/>
           <w:bCs/>
         </w:rPr>
-        <w:t>*</w:t>
-      </w:r>
-      <w:proofErr w:type="gramStart"/>
+        <w:t>*);</w:t>
+      </w:r>
+    </w:p>
+    <w:p>
+      <w:pPr>
+        <w:spacing w:after="0"/>
+      </w:pPr>
+      <w:r>
+        <w:rPr>
+          <w:b/>
+          <w:bCs/>
+        </w:rPr>
+        <w:t>Ecrire = (</w:t>
+      </w:r>
+      <w:r>
+        <w:rPr>
+          <w:b/>
+          <w:bCs/>
+          <w:i/>
+          <w:iCs/>
+          <w:u w:val="single"/>
+        </w:rPr>
+        <w:t>#IdDocument, #IdAuteur</w:t>
+      </w:r>
       <w:r>
         <w:rPr>
           <w:b/>
@@ -2428,18 +1591,17 @@
         </w:rPr>
         <w:t>);</w:t>
       </w:r>
-      <w:proofErr w:type="gramEnd"/>
-    </w:p>
-    <w:p>
-      <w:pPr>
-        <w:spacing w:after="0"/>
-      </w:pPr>
-      <w:r>
-        <w:rPr>
-          <w:b/>
-          <w:bCs/>
-        </w:rPr>
-        <w:t>Ecrire = (</w:t>
+    </w:p>
+    <w:p>
+      <w:pPr>
+        <w:spacing w:after="0"/>
+      </w:pPr>
+      <w:r>
+        <w:rPr>
+          <w:b/>
+          <w:bCs/>
+        </w:rPr>
+        <w:t>EmpruntArticle = (</w:t>
       </w:r>
       <w:r>
         <w:rPr>
@@ -2449,9 +1611,8 @@
           <w:iCs/>
           <w:u w:val="single"/>
         </w:rPr>
-        <w:t>#IdDocument, #IdAuteur</w:t>
-      </w:r>
-      <w:proofErr w:type="gramStart"/>
+        <w:t>#IdDocument, #IdEmprunt</w:t>
+      </w:r>
       <w:r>
         <w:rPr>
           <w:b/>
@@ -2459,47 +1620,6 @@
         </w:rPr>
         <w:t>);</w:t>
       </w:r>
-      <w:proofErr w:type="gramEnd"/>
-    </w:p>
-    <w:p>
-      <w:pPr>
-        <w:spacing w:after="0"/>
-      </w:pPr>
-      <w:proofErr w:type="spellStart"/>
-      <w:r>
-        <w:rPr>
-          <w:b/>
-          <w:bCs/>
-        </w:rPr>
-        <w:t>EmpruntArticle</w:t>
-      </w:r>
-      <w:proofErr w:type="spellEnd"/>
-      <w:r>
-        <w:rPr>
-          <w:b/>
-          <w:bCs/>
-        </w:rPr>
-        <w:t xml:space="preserve"> = (</w:t>
-      </w:r>
-      <w:r>
-        <w:rPr>
-          <w:b/>
-          <w:bCs/>
-          <w:i/>
-          <w:iCs/>
-          <w:u w:val="single"/>
-        </w:rPr>
-        <w:t>#IdDocument, #IdEmprunt</w:t>
-      </w:r>
-      <w:proofErr w:type="gramStart"/>
-      <w:r>
-        <w:rPr>
-          <w:b/>
-          <w:bCs/>
-        </w:rPr>
-        <w:t>);</w:t>
-      </w:r>
-      <w:proofErr w:type="gramEnd"/>
     </w:p>
     <w:p>
       <w:pPr>

</xml_diff>

<commit_message>
ajout et suppression des exemplaires
</commit_message>
<xml_diff>
--- a/Doc/DOC.docx
+++ b/Doc/DOC.docx
@@ -1036,18 +1036,63 @@
           <w:numId w:val="7"/>
         </w:numPr>
         <w:spacing w:after="0"/>
-      </w:pPr>
-      <w:r>
         <w:rPr>
           <w:color w:val="215E99" w:themeColor="text2" w:themeTint="BF"/>
         </w:rPr>
+      </w:pPr>
+      <w:r>
+        <w:rPr>
+          <w:color w:val="215E99" w:themeColor="text2" w:themeTint="BF"/>
+        </w:rPr>
         <w:t>Gestion de</w:t>
       </w:r>
       <w:r>
         <w:rPr>
           <w:color w:val="215E99" w:themeColor="text2" w:themeTint="BF"/>
         </w:rPr>
-        <w:t xml:space="preserve"> l’état physique d’un document</w:t>
+        <w:t xml:space="preserve"> l’état </w:t>
+      </w:r>
+      <w:r>
+        <w:rPr>
+          <w:color w:val="215E99" w:themeColor="text2" w:themeTint="BF"/>
+        </w:rPr>
+        <w:t xml:space="preserve">physique </w:t>
+      </w:r>
+      <w:r>
+        <w:rPr>
+          <w:color w:val="215E99" w:themeColor="text2" w:themeTint="BF"/>
+        </w:rPr>
+        <w:t>d’un document</w:t>
+      </w:r>
+    </w:p>
+    <w:p>
+      <w:pPr>
+        <w:numPr>
+          <w:ilvl w:val="0"/>
+          <w:numId w:val="7"/>
+        </w:numPr>
+        <w:spacing w:after="0"/>
+        <w:rPr>
+          <w:color w:val="215E99" w:themeColor="text2" w:themeTint="BF"/>
+        </w:rPr>
+      </w:pPr>
+      <w:r>
+        <w:rPr>
+          <w:color w:val="215E99" w:themeColor="text2" w:themeTint="BF"/>
+        </w:rPr>
+        <w:t>Gestion de</w:t>
+      </w:r>
+      <w:r>
+        <w:rPr>
+          <w:color w:val="215E99" w:themeColor="text2" w:themeTint="BF"/>
+        </w:rPr>
+        <w:t xml:space="preserve">s exemplaires </w:t>
+      </w:r>
+      <w:r>
+        <w:rPr>
+          <w:color w:val="215E99" w:themeColor="text2" w:themeTint="BF"/>
+        </w:rPr>
+        <w:t>(ajout, suppression)</w:t>
       </w:r>
     </w:p>
     <w:p>
@@ -1565,8 +1610,13 @@
       <w:pPr>
         <w:spacing w:after="0"/>
       </w:pPr>
-      <w:r>
-        <w:t xml:space="preserve">légende : </w:t>
+      <w:proofErr w:type="gramStart"/>
+      <w:r>
+        <w:t>légende</w:t>
+      </w:r>
+      <w:proofErr w:type="gramEnd"/>
+      <w:r>
+        <w:t xml:space="preserve"> : </w:t>
       </w:r>
     </w:p>
     <w:p>
@@ -1582,7 +1632,15 @@
         <w:spacing w:after="0"/>
       </w:pPr>
       <w:r>
-        <w:t>- bleu foncé : les associations qui crée une nouvelle table</w:t>
+        <w:t xml:space="preserve">- bleu foncé : les associations qui </w:t>
+      </w:r>
+      <w:proofErr w:type="gramStart"/>
+      <w:r>
+        <w:t>crée</w:t>
+      </w:r>
+      <w:proofErr w:type="gramEnd"/>
+      <w:r>
+        <w:t xml:space="preserve"> une nouvelle table</w:t>
       </w:r>
       <w:r>
         <w:br/>
@@ -1624,7 +1682,15 @@
         <w:spacing w:after="0"/>
       </w:pPr>
       <w:r>
-        <w:t xml:space="preserve">Si nous retranscrivons le MCD de façons écrite, alors, nous aurons le MCD (Modèle logique de données) : </w:t>
+        <w:t xml:space="preserve">Si nous retranscrivons le MCD de </w:t>
+      </w:r>
+      <w:proofErr w:type="gramStart"/>
+      <w:r>
+        <w:t>façons écrite</w:t>
+      </w:r>
+      <w:proofErr w:type="gramEnd"/>
+      <w:r>
+        <w:t xml:space="preserve">, alors, nous aurons le MCD (Modèle logique de données) : </w:t>
       </w:r>
     </w:p>
     <w:p>
@@ -1670,13 +1736,1172 @@
           <w:i/>
           <w:iCs/>
         </w:rPr>
-        <w:t xml:space="preserve"> VARCHAR(50) </w:t>
+        <w:t xml:space="preserve"> </w:t>
+      </w:r>
+      <w:proofErr w:type="gramStart"/>
+      <w:r>
+        <w:rPr>
+          <w:i/>
+          <w:iCs/>
+        </w:rPr>
+        <w:t>VARCHAR(</w:t>
+      </w:r>
+      <w:proofErr w:type="gramEnd"/>
+      <w:r>
+        <w:rPr>
+          <w:i/>
+          <w:iCs/>
+        </w:rPr>
+        <w:t>50</w:t>
+      </w:r>
+      <w:proofErr w:type="gramStart"/>
+      <w:r>
+        <w:rPr>
+          <w:i/>
+          <w:iCs/>
+        </w:rPr>
+        <w:t xml:space="preserve">) </w:t>
+      </w:r>
+      <w:r>
+        <w:t>,</w:t>
+      </w:r>
+      <w:proofErr w:type="gramEnd"/>
+      <w:r>
+        <w:t xml:space="preserve"> </w:t>
+      </w:r>
+      <w:proofErr w:type="spellStart"/>
+      <w:r>
+        <w:t>Prenom</w:t>
+      </w:r>
+      <w:proofErr w:type="spellEnd"/>
+      <w:r>
+        <w:rPr>
+          <w:i/>
+          <w:iCs/>
+        </w:rPr>
+        <w:t xml:space="preserve"> </w:t>
+      </w:r>
+      <w:proofErr w:type="gramStart"/>
+      <w:r>
+        <w:rPr>
+          <w:i/>
+          <w:iCs/>
+        </w:rPr>
+        <w:t>VARCHAR(</w:t>
+      </w:r>
+      <w:proofErr w:type="gramEnd"/>
+      <w:r>
+        <w:rPr>
+          <w:i/>
+          <w:iCs/>
+        </w:rPr>
+        <w:t>50</w:t>
+      </w:r>
+      <w:proofErr w:type="gramStart"/>
+      <w:r>
+        <w:rPr>
+          <w:i/>
+          <w:iCs/>
+        </w:rPr>
+        <w:t xml:space="preserve">) </w:t>
+      </w:r>
+      <w:r>
+        <w:t>,</w:t>
+      </w:r>
+      <w:proofErr w:type="gramEnd"/>
+      <w:r>
+        <w:t xml:space="preserve"> </w:t>
+      </w:r>
+      <w:proofErr w:type="spellStart"/>
+      <w:r>
+        <w:t>DateNaissance</w:t>
+      </w:r>
+      <w:proofErr w:type="spellEnd"/>
+      <w:r>
+        <w:rPr>
+          <w:i/>
+          <w:iCs/>
+        </w:rPr>
+        <w:t xml:space="preserve"> DATE</w:t>
+      </w:r>
+      <w:r>
+        <w:t>, Adresse1</w:t>
+      </w:r>
+      <w:r>
+        <w:rPr>
+          <w:i/>
+          <w:iCs/>
+        </w:rPr>
+        <w:t xml:space="preserve"> </w:t>
+      </w:r>
+      <w:proofErr w:type="gramStart"/>
+      <w:r>
+        <w:rPr>
+          <w:i/>
+          <w:iCs/>
+        </w:rPr>
+        <w:t>VARCHAR(</w:t>
+      </w:r>
+      <w:proofErr w:type="gramEnd"/>
+      <w:r>
+        <w:rPr>
+          <w:i/>
+          <w:iCs/>
+        </w:rPr>
+        <w:t>50</w:t>
+      </w:r>
+      <w:proofErr w:type="gramStart"/>
+      <w:r>
+        <w:rPr>
+          <w:i/>
+          <w:iCs/>
+        </w:rPr>
+        <w:t xml:space="preserve">) </w:t>
+      </w:r>
+      <w:r>
+        <w:t>,</w:t>
+      </w:r>
+      <w:proofErr w:type="gramEnd"/>
+      <w:r>
+        <w:t xml:space="preserve"> Adresse2</w:t>
+      </w:r>
+      <w:r>
+        <w:rPr>
+          <w:i/>
+          <w:iCs/>
+        </w:rPr>
+        <w:t xml:space="preserve"> </w:t>
+      </w:r>
+      <w:proofErr w:type="gramStart"/>
+      <w:r>
+        <w:rPr>
+          <w:i/>
+          <w:iCs/>
+        </w:rPr>
+        <w:t>VARCHAR(</w:t>
+      </w:r>
+      <w:proofErr w:type="gramEnd"/>
+      <w:r>
+        <w:rPr>
+          <w:i/>
+          <w:iCs/>
+        </w:rPr>
+        <w:t>50</w:t>
+      </w:r>
+      <w:proofErr w:type="gramStart"/>
+      <w:r>
+        <w:rPr>
+          <w:i/>
+          <w:iCs/>
+        </w:rPr>
+        <w:t xml:space="preserve">) </w:t>
+      </w:r>
+      <w:r>
+        <w:t>,</w:t>
+      </w:r>
+      <w:proofErr w:type="gramEnd"/>
+      <w:r>
+        <w:t xml:space="preserve"> Ville</w:t>
+      </w:r>
+      <w:r>
+        <w:rPr>
+          <w:i/>
+          <w:iCs/>
+        </w:rPr>
+        <w:t xml:space="preserve"> </w:t>
+      </w:r>
+      <w:proofErr w:type="gramStart"/>
+      <w:r>
+        <w:rPr>
+          <w:i/>
+          <w:iCs/>
+        </w:rPr>
+        <w:t>VARCHAR(</w:t>
+      </w:r>
+      <w:proofErr w:type="gramEnd"/>
+      <w:r>
+        <w:rPr>
+          <w:i/>
+          <w:iCs/>
+        </w:rPr>
+        <w:t>50</w:t>
+      </w:r>
+      <w:proofErr w:type="gramStart"/>
+      <w:r>
+        <w:rPr>
+          <w:i/>
+          <w:iCs/>
+        </w:rPr>
+        <w:t xml:space="preserve">) </w:t>
+      </w:r>
+      <w:r>
+        <w:t>,</w:t>
+      </w:r>
+      <w:proofErr w:type="gramEnd"/>
+      <w:r>
+        <w:t xml:space="preserve"> Pays</w:t>
+      </w:r>
+      <w:r>
+        <w:rPr>
+          <w:i/>
+          <w:iCs/>
+        </w:rPr>
+        <w:t xml:space="preserve"> </w:t>
+      </w:r>
+      <w:proofErr w:type="gramStart"/>
+      <w:r>
+        <w:rPr>
+          <w:i/>
+          <w:iCs/>
+        </w:rPr>
+        <w:t>VARCHAR(</w:t>
+      </w:r>
+      <w:proofErr w:type="gramEnd"/>
+      <w:r>
+        <w:rPr>
+          <w:i/>
+          <w:iCs/>
+        </w:rPr>
+        <w:t>50</w:t>
+      </w:r>
+      <w:proofErr w:type="gramStart"/>
+      <w:r>
+        <w:rPr>
+          <w:i/>
+          <w:iCs/>
+        </w:rPr>
+        <w:t xml:space="preserve">) </w:t>
+      </w:r>
+      <w:r>
+        <w:t>,</w:t>
+      </w:r>
+      <w:proofErr w:type="gramEnd"/>
+      <w:r>
+        <w:t xml:space="preserve"> Mail</w:t>
+      </w:r>
+      <w:r>
+        <w:rPr>
+          <w:b/>
+          <w:bCs/>
+          <w:i/>
+          <w:iCs/>
+        </w:rPr>
+        <w:t xml:space="preserve"> </w:t>
+      </w:r>
+      <w:proofErr w:type="gramStart"/>
+      <w:r>
+        <w:rPr>
+          <w:b/>
+          <w:bCs/>
+          <w:i/>
+          <w:iCs/>
+        </w:rPr>
+        <w:t>VARCHAR(</w:t>
+      </w:r>
+      <w:proofErr w:type="gramEnd"/>
+      <w:r>
+        <w:rPr>
+          <w:b/>
+          <w:bCs/>
+          <w:i/>
+          <w:iCs/>
+        </w:rPr>
+        <w:t>50</w:t>
+      </w:r>
+      <w:proofErr w:type="gramStart"/>
+      <w:r>
+        <w:rPr>
+          <w:b/>
+          <w:bCs/>
+          <w:i/>
+          <w:iCs/>
+        </w:rPr>
+        <w:t xml:space="preserve">) </w:t>
+      </w:r>
+      <w:r>
+        <w:t>,</w:t>
+      </w:r>
+      <w:proofErr w:type="gramEnd"/>
+      <w:r>
+        <w:t xml:space="preserve"> </w:t>
+      </w:r>
+      <w:proofErr w:type="spellStart"/>
+      <w:r>
+        <w:t>NumeroTelephone</w:t>
+      </w:r>
+      <w:proofErr w:type="spellEnd"/>
+      <w:r>
+        <w:rPr>
+          <w:i/>
+          <w:iCs/>
+        </w:rPr>
+        <w:t xml:space="preserve"> </w:t>
+      </w:r>
+      <w:proofErr w:type="gramStart"/>
+      <w:r>
+        <w:rPr>
+          <w:i/>
+          <w:iCs/>
+        </w:rPr>
+        <w:t>VARCHAR(</w:t>
+      </w:r>
+      <w:proofErr w:type="gramEnd"/>
+      <w:r>
+        <w:rPr>
+          <w:i/>
+          <w:iCs/>
+        </w:rPr>
+        <w:t>50</w:t>
+      </w:r>
+      <w:proofErr w:type="gramStart"/>
+      <w:r>
+        <w:rPr>
+          <w:i/>
+          <w:iCs/>
+        </w:rPr>
+        <w:t xml:space="preserve">) </w:t>
+      </w:r>
+      <w:r>
+        <w:t>,</w:t>
+      </w:r>
+      <w:proofErr w:type="gramEnd"/>
+      <w:r>
+        <w:t xml:space="preserve"> Situation</w:t>
+      </w:r>
+      <w:r>
+        <w:rPr>
+          <w:i/>
+          <w:iCs/>
+        </w:rPr>
+        <w:t xml:space="preserve"> </w:t>
+      </w:r>
+      <w:proofErr w:type="gramStart"/>
+      <w:r>
+        <w:rPr>
+          <w:i/>
+          <w:iCs/>
+        </w:rPr>
+        <w:t>VARCHAR(</w:t>
+      </w:r>
+      <w:proofErr w:type="gramEnd"/>
+      <w:r>
+        <w:rPr>
+          <w:i/>
+          <w:iCs/>
+        </w:rPr>
+        <w:t>50</w:t>
+      </w:r>
+      <w:proofErr w:type="gramStart"/>
+      <w:r>
+        <w:rPr>
+          <w:i/>
+          <w:iCs/>
+        </w:rPr>
+        <w:t xml:space="preserve">) </w:t>
+      </w:r>
+      <w:r>
+        <w:rPr>
+          <w:b/>
+          <w:bCs/>
+        </w:rPr>
+        <w:t>)</w:t>
+      </w:r>
+      <w:proofErr w:type="gramEnd"/>
+      <w:r>
+        <w:rPr>
+          <w:b/>
+          <w:bCs/>
+        </w:rPr>
+        <w:t>;</w:t>
+      </w:r>
+    </w:p>
+    <w:p>
+      <w:pPr>
+        <w:spacing w:after="0"/>
+      </w:pPr>
+      <w:proofErr w:type="spellStart"/>
+      <w:r>
+        <w:rPr>
+          <w:b/>
+          <w:bCs/>
+        </w:rPr>
+        <w:t>Employe</w:t>
+      </w:r>
+      <w:proofErr w:type="spellEnd"/>
+      <w:r>
+        <w:rPr>
+          <w:b/>
+          <w:bCs/>
+        </w:rPr>
+        <w:t xml:space="preserve"> = (</w:t>
+      </w:r>
+      <w:r>
+        <w:rPr>
+          <w:b/>
+          <w:bCs/>
+          <w:i/>
+          <w:iCs/>
+          <w:u w:val="single"/>
+        </w:rPr>
+        <w:t>#IdUtilisateur</w:t>
+      </w:r>
+      <w:r>
+        <w:t>, Statut</w:t>
+      </w:r>
+      <w:r>
+        <w:rPr>
+          <w:i/>
+          <w:iCs/>
+        </w:rPr>
+        <w:t xml:space="preserve"> </w:t>
+      </w:r>
+      <w:proofErr w:type="gramStart"/>
+      <w:r>
+        <w:rPr>
+          <w:i/>
+          <w:iCs/>
+        </w:rPr>
+        <w:t>VARCHAR(</w:t>
+      </w:r>
+      <w:proofErr w:type="gramEnd"/>
+      <w:r>
+        <w:rPr>
+          <w:i/>
+          <w:iCs/>
+        </w:rPr>
+        <w:t>50</w:t>
+      </w:r>
+      <w:proofErr w:type="gramStart"/>
+      <w:r>
+        <w:rPr>
+          <w:i/>
+          <w:iCs/>
+        </w:rPr>
+        <w:t xml:space="preserve">) </w:t>
+      </w:r>
+      <w:r>
+        <w:rPr>
+          <w:b/>
+          <w:bCs/>
+        </w:rPr>
+        <w:t>)</w:t>
+      </w:r>
+      <w:proofErr w:type="gramEnd"/>
+      <w:r>
+        <w:rPr>
+          <w:b/>
+          <w:bCs/>
+        </w:rPr>
+        <w:t>;</w:t>
+      </w:r>
+    </w:p>
+    <w:p>
+      <w:pPr>
+        <w:spacing w:after="0"/>
+      </w:pPr>
+      <w:r>
+        <w:rPr>
+          <w:b/>
+          <w:bCs/>
+        </w:rPr>
+        <w:t>Document = (</w:t>
+      </w:r>
+      <w:proofErr w:type="spellStart"/>
+      <w:r>
+        <w:rPr>
+          <w:b/>
+          <w:bCs/>
+          <w:u w:val="single"/>
+        </w:rPr>
+        <w:t>IdDocument</w:t>
+      </w:r>
+      <w:proofErr w:type="spellEnd"/>
+      <w:r>
+        <w:rPr>
+          <w:b/>
+          <w:bCs/>
+          <w:i/>
+          <w:iCs/>
+        </w:rPr>
+        <w:t xml:space="preserve"> INT AUTO_INCREMENT</w:t>
+      </w:r>
+      <w:r>
+        <w:t>, Titre</w:t>
+      </w:r>
+      <w:r>
+        <w:rPr>
+          <w:i/>
+          <w:iCs/>
+        </w:rPr>
+        <w:t xml:space="preserve"> </w:t>
+      </w:r>
+      <w:proofErr w:type="gramStart"/>
+      <w:r>
+        <w:rPr>
+          <w:i/>
+          <w:iCs/>
+        </w:rPr>
+        <w:t>VARCHAR(</w:t>
+      </w:r>
+      <w:proofErr w:type="gramEnd"/>
+      <w:r>
+        <w:rPr>
+          <w:i/>
+          <w:iCs/>
+        </w:rPr>
+        <w:t>50</w:t>
+      </w:r>
+      <w:proofErr w:type="gramStart"/>
+      <w:r>
+        <w:rPr>
+          <w:i/>
+          <w:iCs/>
+        </w:rPr>
+        <w:t xml:space="preserve">) </w:t>
+      </w:r>
+      <w:r>
+        <w:t>,</w:t>
+      </w:r>
+      <w:proofErr w:type="gramEnd"/>
+      <w:r>
+        <w:t xml:space="preserve"> </w:t>
+      </w:r>
+      <w:proofErr w:type="spellStart"/>
+      <w:r>
+        <w:t>Annee</w:t>
+      </w:r>
+      <w:proofErr w:type="spellEnd"/>
+      <w:r>
+        <w:rPr>
+          <w:i/>
+          <w:iCs/>
+        </w:rPr>
+        <w:t xml:space="preserve"> DATE</w:t>
+      </w:r>
+      <w:r>
+        <w:t>, Auteur</w:t>
+      </w:r>
+      <w:r>
+        <w:rPr>
+          <w:i/>
+          <w:iCs/>
+        </w:rPr>
+        <w:t xml:space="preserve"> </w:t>
+      </w:r>
+      <w:proofErr w:type="gramStart"/>
+      <w:r>
+        <w:rPr>
+          <w:i/>
+          <w:iCs/>
+        </w:rPr>
+        <w:t>VARCHAR(</w:t>
+      </w:r>
+      <w:proofErr w:type="gramEnd"/>
+      <w:r>
+        <w:rPr>
+          <w:i/>
+          <w:iCs/>
+        </w:rPr>
+        <w:t>50</w:t>
+      </w:r>
+      <w:proofErr w:type="gramStart"/>
+      <w:r>
+        <w:rPr>
+          <w:i/>
+          <w:iCs/>
+        </w:rPr>
+        <w:t xml:space="preserve">) </w:t>
+      </w:r>
+      <w:r>
+        <w:t>,</w:t>
+      </w:r>
+      <w:proofErr w:type="gramEnd"/>
+      <w:r>
+        <w:t xml:space="preserve"> </w:t>
+      </w:r>
+      <w:proofErr w:type="spellStart"/>
+      <w:r>
+        <w:t>Resume</w:t>
+      </w:r>
+      <w:proofErr w:type="spellEnd"/>
+      <w:r>
+        <w:rPr>
+          <w:i/>
+          <w:iCs/>
+        </w:rPr>
+        <w:t xml:space="preserve"> TEXT</w:t>
+      </w:r>
+      <w:r>
+        <w:t>, stock</w:t>
+      </w:r>
+      <w:r>
+        <w:rPr>
+          <w:i/>
+          <w:iCs/>
+        </w:rPr>
+        <w:t xml:space="preserve"> INT</w:t>
+      </w:r>
+      <w:proofErr w:type="gramStart"/>
+      <w:r>
+        <w:rPr>
+          <w:b/>
+          <w:bCs/>
+        </w:rPr>
+        <w:t>);</w:t>
+      </w:r>
+      <w:proofErr w:type="gramEnd"/>
+    </w:p>
+    <w:p>
+      <w:pPr>
+        <w:spacing w:after="0"/>
+      </w:pPr>
+      <w:r>
+        <w:rPr>
+          <w:b/>
+          <w:bCs/>
+        </w:rPr>
+        <w:t>Livre = (</w:t>
+      </w:r>
+      <w:r>
+        <w:rPr>
+          <w:b/>
+          <w:bCs/>
+          <w:i/>
+          <w:iCs/>
+          <w:u w:val="single"/>
+        </w:rPr>
+        <w:t>#IdDocument</w:t>
       </w:r>
       <w:r>
         <w:t xml:space="preserve">, </w:t>
       </w:r>
+      <w:r>
+        <w:rPr>
+          <w:b/>
+          <w:bCs/>
+        </w:rPr>
+        <w:t>ISBN</w:t>
+      </w:r>
+      <w:r>
+        <w:rPr>
+          <w:b/>
+          <w:bCs/>
+          <w:i/>
+          <w:iCs/>
+        </w:rPr>
+        <w:t xml:space="preserve"> </w:t>
+      </w:r>
+      <w:proofErr w:type="gramStart"/>
+      <w:r>
+        <w:rPr>
+          <w:b/>
+          <w:bCs/>
+          <w:i/>
+          <w:iCs/>
+        </w:rPr>
+        <w:t>VARCHAR(</w:t>
+      </w:r>
+      <w:proofErr w:type="gramEnd"/>
+      <w:r>
+        <w:rPr>
+          <w:b/>
+          <w:bCs/>
+          <w:i/>
+          <w:iCs/>
+        </w:rPr>
+        <w:t>50</w:t>
+      </w:r>
+      <w:proofErr w:type="gramStart"/>
+      <w:r>
+        <w:rPr>
+          <w:b/>
+          <w:bCs/>
+          <w:i/>
+          <w:iCs/>
+        </w:rPr>
+        <w:t xml:space="preserve">) </w:t>
+      </w:r>
+      <w:r>
+        <w:t>,</w:t>
+      </w:r>
+      <w:proofErr w:type="gramEnd"/>
+      <w:r>
+        <w:t xml:space="preserve"> </w:t>
+      </w:r>
       <w:proofErr w:type="spellStart"/>
       <w:r>
+        <w:t>NombrePage</w:t>
+      </w:r>
+      <w:proofErr w:type="spellEnd"/>
+      <w:r>
+        <w:rPr>
+          <w:i/>
+          <w:iCs/>
+        </w:rPr>
+        <w:t xml:space="preserve"> INT</w:t>
+      </w:r>
+      <w:r>
+        <w:t>, Genre</w:t>
+      </w:r>
+      <w:r>
+        <w:rPr>
+          <w:i/>
+          <w:iCs/>
+        </w:rPr>
+        <w:t xml:space="preserve"> </w:t>
+      </w:r>
+      <w:proofErr w:type="gramStart"/>
+      <w:r>
+        <w:rPr>
+          <w:i/>
+          <w:iCs/>
+        </w:rPr>
+        <w:t>VARCHAR(</w:t>
+      </w:r>
+      <w:proofErr w:type="gramEnd"/>
+      <w:r>
+        <w:rPr>
+          <w:i/>
+          <w:iCs/>
+        </w:rPr>
+        <w:t>50</w:t>
+      </w:r>
+      <w:proofErr w:type="gramStart"/>
+      <w:r>
+        <w:rPr>
+          <w:i/>
+          <w:iCs/>
+        </w:rPr>
+        <w:t xml:space="preserve">) </w:t>
+      </w:r>
+      <w:r>
+        <w:rPr>
+          <w:b/>
+          <w:bCs/>
+        </w:rPr>
+        <w:t>)</w:t>
+      </w:r>
+      <w:proofErr w:type="gramEnd"/>
+      <w:r>
+        <w:rPr>
+          <w:b/>
+          <w:bCs/>
+        </w:rPr>
+        <w:t>;</w:t>
+      </w:r>
+    </w:p>
+    <w:p>
+      <w:pPr>
+        <w:spacing w:after="0"/>
+      </w:pPr>
+      <w:proofErr w:type="spellStart"/>
+      <w:r>
+        <w:rPr>
+          <w:b/>
+          <w:bCs/>
+        </w:rPr>
+        <w:t>TitrePeriodique</w:t>
+      </w:r>
+      <w:proofErr w:type="spellEnd"/>
+      <w:r>
+        <w:rPr>
+          <w:b/>
+          <w:bCs/>
+        </w:rPr>
+        <w:t xml:space="preserve"> = (</w:t>
+      </w:r>
+      <w:r>
+        <w:rPr>
+          <w:b/>
+          <w:bCs/>
+          <w:i/>
+          <w:iCs/>
+          <w:u w:val="single"/>
+        </w:rPr>
+        <w:t>#IdDocument</w:t>
+      </w:r>
+      <w:r>
+        <w:t xml:space="preserve">, </w:t>
+      </w:r>
+      <w:proofErr w:type="spellStart"/>
+      <w:r>
+        <w:t>Numero</w:t>
+      </w:r>
+      <w:proofErr w:type="spellEnd"/>
+      <w:r>
+        <w:rPr>
+          <w:i/>
+          <w:iCs/>
+        </w:rPr>
+        <w:t xml:space="preserve"> INT</w:t>
+      </w:r>
+      <w:r>
+        <w:t xml:space="preserve">, </w:t>
+      </w:r>
+      <w:proofErr w:type="spellStart"/>
+      <w:r>
+        <w:t>DatePublication</w:t>
+      </w:r>
+      <w:proofErr w:type="spellEnd"/>
+      <w:r>
+        <w:rPr>
+          <w:i/>
+          <w:iCs/>
+        </w:rPr>
+        <w:t xml:space="preserve"> DATE</w:t>
+      </w:r>
+      <w:r>
+        <w:t>, Type</w:t>
+      </w:r>
+      <w:r>
+        <w:rPr>
+          <w:i/>
+          <w:iCs/>
+        </w:rPr>
+        <w:t xml:space="preserve"> </w:t>
+      </w:r>
+      <w:proofErr w:type="gramStart"/>
+      <w:r>
+        <w:rPr>
+          <w:i/>
+          <w:iCs/>
+        </w:rPr>
+        <w:t>VARCHAR(</w:t>
+      </w:r>
+      <w:proofErr w:type="gramEnd"/>
+      <w:r>
+        <w:rPr>
+          <w:i/>
+          <w:iCs/>
+        </w:rPr>
+        <w:t>50</w:t>
+      </w:r>
+      <w:proofErr w:type="gramStart"/>
+      <w:r>
+        <w:rPr>
+          <w:i/>
+          <w:iCs/>
+        </w:rPr>
+        <w:t xml:space="preserve">) </w:t>
+      </w:r>
+      <w:r>
+        <w:rPr>
+          <w:b/>
+          <w:bCs/>
+        </w:rPr>
+        <w:t>)</w:t>
+      </w:r>
+      <w:proofErr w:type="gramEnd"/>
+      <w:r>
+        <w:rPr>
+          <w:b/>
+          <w:bCs/>
+        </w:rPr>
+        <w:t>;</w:t>
+      </w:r>
+    </w:p>
+    <w:p>
+      <w:pPr>
+        <w:spacing w:after="0"/>
+      </w:pPr>
+      <w:r>
+        <w:rPr>
+          <w:b/>
+          <w:bCs/>
+        </w:rPr>
+        <w:t>Sonore = (</w:t>
+      </w:r>
+      <w:r>
+        <w:rPr>
+          <w:b/>
+          <w:bCs/>
+          <w:i/>
+          <w:iCs/>
+          <w:u w:val="single"/>
+        </w:rPr>
+        <w:t>#IdDocument</w:t>
+      </w:r>
+      <w:r>
+        <w:t xml:space="preserve">, </w:t>
+      </w:r>
+      <w:proofErr w:type="spellStart"/>
+      <w:r>
+        <w:t>Duree</w:t>
+      </w:r>
+      <w:proofErr w:type="spellEnd"/>
+      <w:r>
+        <w:rPr>
+          <w:i/>
+          <w:iCs/>
+        </w:rPr>
+        <w:t xml:space="preserve"> INT</w:t>
+      </w:r>
+      <w:r>
+        <w:t>, Format</w:t>
+      </w:r>
+      <w:r>
+        <w:rPr>
+          <w:i/>
+          <w:iCs/>
+        </w:rPr>
+        <w:t xml:space="preserve"> </w:t>
+      </w:r>
+      <w:proofErr w:type="gramStart"/>
+      <w:r>
+        <w:rPr>
+          <w:i/>
+          <w:iCs/>
+        </w:rPr>
+        <w:t>VARCHAR(</w:t>
+      </w:r>
+      <w:proofErr w:type="gramEnd"/>
+      <w:r>
+        <w:rPr>
+          <w:i/>
+          <w:iCs/>
+        </w:rPr>
+        <w:t>50</w:t>
+      </w:r>
+      <w:proofErr w:type="gramStart"/>
+      <w:r>
+        <w:rPr>
+          <w:i/>
+          <w:iCs/>
+        </w:rPr>
+        <w:t xml:space="preserve">) </w:t>
+      </w:r>
+      <w:r>
+        <w:t>,</w:t>
+      </w:r>
+      <w:proofErr w:type="gramEnd"/>
+      <w:r>
+        <w:t xml:space="preserve"> </w:t>
+      </w:r>
+      <w:proofErr w:type="spellStart"/>
+      <w:r>
+        <w:t>Interprete</w:t>
+      </w:r>
+      <w:proofErr w:type="spellEnd"/>
+      <w:r>
+        <w:rPr>
+          <w:i/>
+          <w:iCs/>
+        </w:rPr>
+        <w:t xml:space="preserve"> </w:t>
+      </w:r>
+      <w:proofErr w:type="gramStart"/>
+      <w:r>
+        <w:rPr>
+          <w:i/>
+          <w:iCs/>
+        </w:rPr>
+        <w:t>VARCHAR(</w:t>
+      </w:r>
+      <w:proofErr w:type="gramEnd"/>
+      <w:r>
+        <w:rPr>
+          <w:i/>
+          <w:iCs/>
+        </w:rPr>
+        <w:t>50</w:t>
+      </w:r>
+      <w:proofErr w:type="gramStart"/>
+      <w:r>
+        <w:rPr>
+          <w:i/>
+          <w:iCs/>
+        </w:rPr>
+        <w:t xml:space="preserve">) </w:t>
+      </w:r>
+      <w:r>
+        <w:rPr>
+          <w:b/>
+          <w:bCs/>
+        </w:rPr>
+        <w:t>)</w:t>
+      </w:r>
+      <w:proofErr w:type="gramEnd"/>
+      <w:r>
+        <w:rPr>
+          <w:b/>
+          <w:bCs/>
+        </w:rPr>
+        <w:t>;</w:t>
+      </w:r>
+    </w:p>
+    <w:p>
+      <w:pPr>
+        <w:spacing w:after="0"/>
+      </w:pPr>
+      <w:proofErr w:type="spellStart"/>
+      <w:r>
+        <w:rPr>
+          <w:b/>
+          <w:bCs/>
+        </w:rPr>
+        <w:t>Video</w:t>
+      </w:r>
+      <w:proofErr w:type="spellEnd"/>
+      <w:r>
+        <w:rPr>
+          <w:b/>
+          <w:bCs/>
+        </w:rPr>
+        <w:t xml:space="preserve"> = (</w:t>
+      </w:r>
+      <w:r>
+        <w:rPr>
+          <w:b/>
+          <w:bCs/>
+          <w:i/>
+          <w:iCs/>
+          <w:u w:val="single"/>
+        </w:rPr>
+        <w:t>#IdDocument</w:t>
+      </w:r>
+      <w:r>
+        <w:t xml:space="preserve">, </w:t>
+      </w:r>
+      <w:proofErr w:type="spellStart"/>
+      <w:r>
+        <w:t>Duree</w:t>
+      </w:r>
+      <w:proofErr w:type="spellEnd"/>
+      <w:r>
+        <w:rPr>
+          <w:i/>
+          <w:iCs/>
+        </w:rPr>
+        <w:t xml:space="preserve"> INT</w:t>
+      </w:r>
+      <w:r>
+        <w:t>, Format</w:t>
+      </w:r>
+      <w:r>
+        <w:rPr>
+          <w:i/>
+          <w:iCs/>
+        </w:rPr>
+        <w:t xml:space="preserve"> </w:t>
+      </w:r>
+      <w:proofErr w:type="gramStart"/>
+      <w:r>
+        <w:rPr>
+          <w:i/>
+          <w:iCs/>
+        </w:rPr>
+        <w:t>VARCHAR(</w:t>
+      </w:r>
+      <w:proofErr w:type="gramEnd"/>
+      <w:r>
+        <w:rPr>
+          <w:i/>
+          <w:iCs/>
+        </w:rPr>
+        <w:t>50</w:t>
+      </w:r>
+      <w:proofErr w:type="gramStart"/>
+      <w:r>
+        <w:rPr>
+          <w:i/>
+          <w:iCs/>
+        </w:rPr>
+        <w:t xml:space="preserve">) </w:t>
+      </w:r>
+      <w:r>
+        <w:t>,</w:t>
+      </w:r>
+      <w:proofErr w:type="gramEnd"/>
+      <w:r>
+        <w:t xml:space="preserve"> </w:t>
+      </w:r>
+      <w:proofErr w:type="spellStart"/>
+      <w:r>
+        <w:t>Realisateur</w:t>
+      </w:r>
+      <w:proofErr w:type="spellEnd"/>
+      <w:r>
+        <w:rPr>
+          <w:i/>
+          <w:iCs/>
+        </w:rPr>
+        <w:t xml:space="preserve"> </w:t>
+      </w:r>
+      <w:proofErr w:type="gramStart"/>
+      <w:r>
+        <w:rPr>
+          <w:i/>
+          <w:iCs/>
+        </w:rPr>
+        <w:t>VARCHAR(</w:t>
+      </w:r>
+      <w:proofErr w:type="gramEnd"/>
+      <w:r>
+        <w:rPr>
+          <w:i/>
+          <w:iCs/>
+        </w:rPr>
+        <w:t>50</w:t>
+      </w:r>
+      <w:proofErr w:type="gramStart"/>
+      <w:r>
+        <w:rPr>
+          <w:i/>
+          <w:iCs/>
+        </w:rPr>
+        <w:t xml:space="preserve">) </w:t>
+      </w:r>
+      <w:r>
+        <w:rPr>
+          <w:b/>
+          <w:bCs/>
+        </w:rPr>
+        <w:t>)</w:t>
+      </w:r>
+      <w:proofErr w:type="gramEnd"/>
+      <w:r>
+        <w:rPr>
+          <w:b/>
+          <w:bCs/>
+        </w:rPr>
+        <w:t>;</w:t>
+      </w:r>
+    </w:p>
+    <w:p>
+      <w:pPr>
+        <w:spacing w:after="0"/>
+      </w:pPr>
+      <w:r>
+        <w:rPr>
+          <w:b/>
+          <w:bCs/>
+        </w:rPr>
+        <w:t>Auteur = (</w:t>
+      </w:r>
+      <w:proofErr w:type="spellStart"/>
+      <w:r>
+        <w:rPr>
+          <w:b/>
+          <w:bCs/>
+          <w:u w:val="single"/>
+        </w:rPr>
+        <w:t>IdAuteur</w:t>
+      </w:r>
+      <w:proofErr w:type="spellEnd"/>
+      <w:r>
+        <w:rPr>
+          <w:b/>
+          <w:bCs/>
+          <w:i/>
+          <w:iCs/>
+        </w:rPr>
+        <w:t xml:space="preserve"> INT AUTO_INCREMENT</w:t>
+      </w:r>
+      <w:r>
+        <w:t xml:space="preserve">, </w:t>
+      </w:r>
+      <w:proofErr w:type="spellStart"/>
+      <w:r>
         <w:t>Prenom</w:t>
       </w:r>
       <w:proofErr w:type="spellEnd"/>
@@ -1685,14 +2910,230 @@
           <w:i/>
           <w:iCs/>
         </w:rPr>
-        <w:t xml:space="preserve"> VARCHAR(50) </w:t>
+        <w:t xml:space="preserve"> </w:t>
+      </w:r>
+      <w:proofErr w:type="gramStart"/>
+      <w:r>
+        <w:rPr>
+          <w:i/>
+          <w:iCs/>
+        </w:rPr>
+        <w:t>VARCHAR(</w:t>
+      </w:r>
+      <w:proofErr w:type="gramEnd"/>
+      <w:r>
+        <w:rPr>
+          <w:i/>
+          <w:iCs/>
+        </w:rPr>
+        <w:t>50</w:t>
+      </w:r>
+      <w:proofErr w:type="gramStart"/>
+      <w:r>
+        <w:rPr>
+          <w:i/>
+          <w:iCs/>
+        </w:rPr>
+        <w:t xml:space="preserve">) </w:t>
+      </w:r>
+      <w:r>
+        <w:t>,</w:t>
+      </w:r>
+      <w:proofErr w:type="gramEnd"/>
+      <w:r>
+        <w:t xml:space="preserve"> Nom</w:t>
+      </w:r>
+      <w:r>
+        <w:rPr>
+          <w:i/>
+          <w:iCs/>
+        </w:rPr>
+        <w:t xml:space="preserve"> </w:t>
+      </w:r>
+      <w:proofErr w:type="gramStart"/>
+      <w:r>
+        <w:rPr>
+          <w:i/>
+          <w:iCs/>
+        </w:rPr>
+        <w:t>VARCHAR(</w:t>
+      </w:r>
+      <w:proofErr w:type="gramEnd"/>
+      <w:r>
+        <w:rPr>
+          <w:i/>
+          <w:iCs/>
+        </w:rPr>
+        <w:t>50</w:t>
+      </w:r>
+      <w:proofErr w:type="gramStart"/>
+      <w:r>
+        <w:rPr>
+          <w:i/>
+          <w:iCs/>
+        </w:rPr>
+        <w:t xml:space="preserve">) </w:t>
+      </w:r>
+      <w:r>
+        <w:t>,</w:t>
+      </w:r>
+      <w:proofErr w:type="gramEnd"/>
+      <w:r>
+        <w:t xml:space="preserve"> Description</w:t>
+      </w:r>
+      <w:r>
+        <w:rPr>
+          <w:i/>
+          <w:iCs/>
+        </w:rPr>
+        <w:t xml:space="preserve"> TEXT</w:t>
+      </w:r>
+      <w:proofErr w:type="gramStart"/>
+      <w:r>
+        <w:rPr>
+          <w:b/>
+          <w:bCs/>
+        </w:rPr>
+        <w:t>);</w:t>
+      </w:r>
+      <w:proofErr w:type="gramEnd"/>
+    </w:p>
+    <w:p>
+      <w:pPr>
+        <w:spacing w:after="0"/>
+      </w:pPr>
+      <w:r>
+        <w:rPr>
+          <w:b/>
+          <w:bCs/>
+        </w:rPr>
+        <w:t>Abonnement = (</w:t>
+      </w:r>
+      <w:proofErr w:type="spellStart"/>
+      <w:r>
+        <w:rPr>
+          <w:b/>
+          <w:bCs/>
+          <w:u w:val="single"/>
+        </w:rPr>
+        <w:t>IdAbonnement</w:t>
+      </w:r>
+      <w:proofErr w:type="spellEnd"/>
+      <w:r>
+        <w:rPr>
+          <w:b/>
+          <w:bCs/>
+          <w:i/>
+          <w:iCs/>
+        </w:rPr>
+        <w:t xml:space="preserve"> </w:t>
+      </w:r>
+      <w:proofErr w:type="gramStart"/>
+      <w:r>
+        <w:rPr>
+          <w:b/>
+          <w:bCs/>
+          <w:i/>
+          <w:iCs/>
+        </w:rPr>
+        <w:t>VARCHAR(</w:t>
+      </w:r>
+      <w:proofErr w:type="gramEnd"/>
+      <w:r>
+        <w:rPr>
+          <w:b/>
+          <w:bCs/>
+          <w:i/>
+          <w:iCs/>
+        </w:rPr>
+        <w:t>50</w:t>
+      </w:r>
+      <w:proofErr w:type="gramStart"/>
+      <w:r>
+        <w:rPr>
+          <w:b/>
+          <w:bCs/>
+          <w:i/>
+          <w:iCs/>
+        </w:rPr>
+        <w:t xml:space="preserve">) </w:t>
+      </w:r>
+      <w:r>
+        <w:t>,</w:t>
+      </w:r>
+      <w:proofErr w:type="gramEnd"/>
+      <w:r>
+        <w:t xml:space="preserve"> Tarif</w:t>
+      </w:r>
+      <w:r>
+        <w:rPr>
+          <w:i/>
+          <w:iCs/>
+        </w:rPr>
+        <w:t xml:space="preserve"> </w:t>
+      </w:r>
+      <w:proofErr w:type="gramStart"/>
+      <w:r>
+        <w:rPr>
+          <w:i/>
+          <w:iCs/>
+        </w:rPr>
+        <w:t>DECIMAL(</w:t>
+      </w:r>
+      <w:proofErr w:type="gramEnd"/>
+      <w:r>
+        <w:rPr>
+          <w:i/>
+          <w:iCs/>
+        </w:rPr>
+        <w:t>19,4)</w:t>
+      </w:r>
+      <w:proofErr w:type="gramStart"/>
+      <w:r>
+        <w:rPr>
+          <w:b/>
+          <w:bCs/>
+        </w:rPr>
+        <w:t>);</w:t>
+      </w:r>
+      <w:proofErr w:type="gramEnd"/>
+    </w:p>
+    <w:p>
+      <w:pPr>
+        <w:spacing w:after="0"/>
+      </w:pPr>
+      <w:r>
+        <w:rPr>
+          <w:b/>
+          <w:bCs/>
+        </w:rPr>
+        <w:t>Emprunt = (</w:t>
+      </w:r>
+      <w:proofErr w:type="spellStart"/>
+      <w:r>
+        <w:rPr>
+          <w:b/>
+          <w:bCs/>
+          <w:u w:val="single"/>
+        </w:rPr>
+        <w:t>IdEmprunt</w:t>
+      </w:r>
+      <w:proofErr w:type="spellEnd"/>
+      <w:r>
+        <w:rPr>
+          <w:b/>
+          <w:bCs/>
+          <w:i/>
+          <w:iCs/>
+        </w:rPr>
+        <w:t xml:space="preserve"> INT AUTO_INCREMENT</w:t>
       </w:r>
       <w:r>
         <w:t xml:space="preserve">, </w:t>
       </w:r>
       <w:proofErr w:type="spellStart"/>
       <w:r>
-        <w:t>DateNaissance</w:t>
+        <w:t>DateReservation</w:t>
       </w:r>
       <w:proofErr w:type="spellEnd"/>
       <w:r>
@@ -1703,63 +3144,11 @@
         <w:t xml:space="preserve"> DATE</w:t>
       </w:r>
       <w:r>
-        <w:t>, Adresse1</w:t>
-      </w:r>
-      <w:r>
-        <w:rPr>
-          <w:i/>
-          <w:iCs/>
-        </w:rPr>
-        <w:t xml:space="preserve"> VARCHAR(50) </w:t>
-      </w:r>
-      <w:r>
-        <w:t>, Adresse2</w:t>
-      </w:r>
-      <w:r>
-        <w:rPr>
-          <w:i/>
-          <w:iCs/>
-        </w:rPr>
-        <w:t xml:space="preserve"> VARCHAR(50) </w:t>
-      </w:r>
-      <w:r>
-        <w:t>, Ville</w:t>
-      </w:r>
-      <w:r>
-        <w:rPr>
-          <w:i/>
-          <w:iCs/>
-        </w:rPr>
-        <w:t xml:space="preserve"> VARCHAR(50) </w:t>
-      </w:r>
-      <w:r>
-        <w:t>, Pays</w:t>
-      </w:r>
-      <w:r>
-        <w:rPr>
-          <w:i/>
-          <w:iCs/>
-        </w:rPr>
-        <w:t xml:space="preserve"> VARCHAR(50) </w:t>
-      </w:r>
-      <w:r>
-        <w:t>, Mail</w:t>
-      </w:r>
-      <w:r>
-        <w:rPr>
-          <w:b/>
-          <w:bCs/>
-          <w:i/>
-          <w:iCs/>
-        </w:rPr>
-        <w:t xml:space="preserve"> VARCHAR(50) </w:t>
-      </w:r>
-      <w:r>
         <w:t xml:space="preserve">, </w:t>
       </w:r>
       <w:proofErr w:type="spellStart"/>
       <w:r>
-        <w:t>NumeroTelephone</w:t>
+        <w:t>DateRenduPrevision</w:t>
       </w:r>
       <w:proofErr w:type="spellEnd"/>
       <w:r>
@@ -1767,18 +3156,24 @@
           <w:i/>
           <w:iCs/>
         </w:rPr>
-        <w:t xml:space="preserve"> VARCHAR(50) </w:t>
-      </w:r>
-      <w:r>
-        <w:t>, Situation</w:t>
-      </w:r>
-      <w:r>
-        <w:rPr>
-          <w:i/>
-          <w:iCs/>
-        </w:rPr>
-        <w:t xml:space="preserve"> VARCHAR(50) </w:t>
-      </w:r>
+        <w:t xml:space="preserve"> DATE</w:t>
+      </w:r>
+      <w:r>
+        <w:t xml:space="preserve">, </w:t>
+      </w:r>
+      <w:proofErr w:type="spellStart"/>
+      <w:r>
+        <w:t>DateRendu</w:t>
+      </w:r>
+      <w:proofErr w:type="spellEnd"/>
+      <w:r>
+        <w:rPr>
+          <w:i/>
+          <w:iCs/>
+        </w:rPr>
+        <w:t xml:space="preserve"> DATE, #IdUtilisateur</w:t>
+      </w:r>
+      <w:proofErr w:type="gramStart"/>
       <w:r>
         <w:rPr>
           <w:b/>
@@ -1786,22 +3181,150 @@
         </w:rPr>
         <w:t>);</w:t>
       </w:r>
-    </w:p>
-    <w:p>
-      <w:pPr>
-        <w:spacing w:after="0"/>
-      </w:pPr>
+      <w:proofErr w:type="gramEnd"/>
+    </w:p>
+    <w:p>
+      <w:pPr>
+        <w:spacing w:after="0"/>
+      </w:pPr>
+      <w:r>
+        <w:rPr>
+          <w:b/>
+          <w:bCs/>
+        </w:rPr>
+        <w:t>Client = (</w:t>
+      </w:r>
+      <w:r>
+        <w:rPr>
+          <w:b/>
+          <w:bCs/>
+          <w:i/>
+          <w:iCs/>
+          <w:u w:val="single"/>
+        </w:rPr>
+        <w:t>#IdUtilisateur</w:t>
+      </w:r>
+      <w:r>
+        <w:t xml:space="preserve">, </w:t>
+      </w:r>
       <w:proofErr w:type="spellStart"/>
       <w:r>
-        <w:rPr>
-          <w:b/>
-          <w:bCs/>
-        </w:rPr>
-        <w:t>Employe</w:t>
+        <w:t>StatutAbonnement</w:t>
       </w:r>
       <w:proofErr w:type="spellEnd"/>
       <w:r>
         <w:rPr>
+          <w:i/>
+          <w:iCs/>
+        </w:rPr>
+        <w:t xml:space="preserve"> </w:t>
+      </w:r>
+      <w:proofErr w:type="gramStart"/>
+      <w:r>
+        <w:rPr>
+          <w:i/>
+          <w:iCs/>
+        </w:rPr>
+        <w:t>VARCHAR(</w:t>
+      </w:r>
+      <w:proofErr w:type="gramEnd"/>
+      <w:r>
+        <w:rPr>
+          <w:i/>
+          <w:iCs/>
+        </w:rPr>
+        <w:t>50</w:t>
+      </w:r>
+      <w:proofErr w:type="gramStart"/>
+      <w:r>
+        <w:rPr>
+          <w:i/>
+          <w:iCs/>
+        </w:rPr>
+        <w:t xml:space="preserve">) </w:t>
+      </w:r>
+      <w:r>
+        <w:t>,</w:t>
+      </w:r>
+      <w:proofErr w:type="gramEnd"/>
+      <w:r>
+        <w:t xml:space="preserve"> </w:t>
+      </w:r>
+      <w:proofErr w:type="spellStart"/>
+      <w:r>
+        <w:t>DateFinAbonnement</w:t>
+      </w:r>
+      <w:proofErr w:type="spellEnd"/>
+      <w:r>
+        <w:rPr>
+          <w:i/>
+          <w:iCs/>
+        </w:rPr>
+        <w:t xml:space="preserve"> DATE, #IdAbonnement</w:t>
+      </w:r>
+      <w:r>
+        <w:rPr>
+          <w:b/>
+          <w:bCs/>
+        </w:rPr>
+        <w:t>*</w:t>
+      </w:r>
+      <w:proofErr w:type="gramStart"/>
+      <w:r>
+        <w:rPr>
+          <w:b/>
+          <w:bCs/>
+        </w:rPr>
+        <w:t>);</w:t>
+      </w:r>
+      <w:proofErr w:type="gramEnd"/>
+    </w:p>
+    <w:p>
+      <w:pPr>
+        <w:spacing w:after="0"/>
+      </w:pPr>
+      <w:r>
+        <w:rPr>
+          <w:b/>
+          <w:bCs/>
+        </w:rPr>
+        <w:t>Ecrire = (</w:t>
+      </w:r>
+      <w:r>
+        <w:rPr>
+          <w:b/>
+          <w:bCs/>
+          <w:i/>
+          <w:iCs/>
+          <w:u w:val="single"/>
+        </w:rPr>
+        <w:t>#IdDocument, #IdAuteur</w:t>
+      </w:r>
+      <w:proofErr w:type="gramStart"/>
+      <w:r>
+        <w:rPr>
+          <w:b/>
+          <w:bCs/>
+        </w:rPr>
+        <w:t>);</w:t>
+      </w:r>
+      <w:proofErr w:type="gramEnd"/>
+    </w:p>
+    <w:p>
+      <w:pPr>
+        <w:spacing w:after="0"/>
+      </w:pPr>
+      <w:proofErr w:type="spellStart"/>
+      <w:r>
+        <w:rPr>
+          <w:b/>
+          <w:bCs/>
+        </w:rPr>
+        <w:t>EmpruntArticle</w:t>
+      </w:r>
+      <w:proofErr w:type="spellEnd"/>
+      <w:r>
+        <w:rPr>
           <w:b/>
           <w:bCs/>
         </w:rPr>
@@ -1815,18 +3338,9 @@
           <w:iCs/>
           <w:u w:val="single"/>
         </w:rPr>
-        <w:t>#IdUtilisateur</w:t>
-      </w:r>
-      <w:r>
-        <w:t>, Statut</w:t>
-      </w:r>
-      <w:r>
-        <w:rPr>
-          <w:i/>
-          <w:iCs/>
-        </w:rPr>
-        <w:t xml:space="preserve"> VARCHAR(50) </w:t>
-      </w:r>
+        <w:t>#IdDocument, #IdEmprunt</w:t>
+      </w:r>
+      <w:proofErr w:type="gramStart"/>
       <w:r>
         <w:rPr>
           <w:b/>
@@ -1834,732 +3348,7 @@
         </w:rPr>
         <w:t>);</w:t>
       </w:r>
-    </w:p>
-    <w:p>
-      <w:pPr>
-        <w:spacing w:after="0"/>
-      </w:pPr>
-      <w:r>
-        <w:rPr>
-          <w:b/>
-          <w:bCs/>
-        </w:rPr>
-        <w:t>Document = (</w:t>
-      </w:r>
-      <w:proofErr w:type="spellStart"/>
-      <w:r>
-        <w:rPr>
-          <w:b/>
-          <w:bCs/>
-          <w:u w:val="single"/>
-        </w:rPr>
-        <w:t>IdDocument</w:t>
-      </w:r>
-      <w:proofErr w:type="spellEnd"/>
-      <w:r>
-        <w:rPr>
-          <w:b/>
-          <w:bCs/>
-          <w:i/>
-          <w:iCs/>
-        </w:rPr>
-        <w:t xml:space="preserve"> INT AUTO_INCREMENT</w:t>
-      </w:r>
-      <w:r>
-        <w:t>, Titre</w:t>
-      </w:r>
-      <w:r>
-        <w:rPr>
-          <w:i/>
-          <w:iCs/>
-        </w:rPr>
-        <w:t xml:space="preserve"> VARCHAR(50) </w:t>
-      </w:r>
-      <w:r>
-        <w:t xml:space="preserve">, </w:t>
-      </w:r>
-      <w:proofErr w:type="spellStart"/>
-      <w:r>
-        <w:t>Annee</w:t>
-      </w:r>
-      <w:proofErr w:type="spellEnd"/>
-      <w:r>
-        <w:rPr>
-          <w:i/>
-          <w:iCs/>
-        </w:rPr>
-        <w:t xml:space="preserve"> DATE</w:t>
-      </w:r>
-      <w:r>
-        <w:t>, Auteur</w:t>
-      </w:r>
-      <w:r>
-        <w:rPr>
-          <w:i/>
-          <w:iCs/>
-        </w:rPr>
-        <w:t xml:space="preserve"> VARCHAR(50) </w:t>
-      </w:r>
-      <w:r>
-        <w:t xml:space="preserve">, </w:t>
-      </w:r>
-      <w:proofErr w:type="spellStart"/>
-      <w:r>
-        <w:t>Resume</w:t>
-      </w:r>
-      <w:proofErr w:type="spellEnd"/>
-      <w:r>
-        <w:rPr>
-          <w:i/>
-          <w:iCs/>
-        </w:rPr>
-        <w:t xml:space="preserve"> TEXT</w:t>
-      </w:r>
-      <w:r>
-        <w:t>, stock</w:t>
-      </w:r>
-      <w:r>
-        <w:rPr>
-          <w:i/>
-          <w:iCs/>
-        </w:rPr>
-        <w:t xml:space="preserve"> INT</w:t>
-      </w:r>
-      <w:r>
-        <w:rPr>
-          <w:b/>
-          <w:bCs/>
-        </w:rPr>
-        <w:t>);</w:t>
-      </w:r>
-    </w:p>
-    <w:p>
-      <w:pPr>
-        <w:spacing w:after="0"/>
-      </w:pPr>
-      <w:r>
-        <w:rPr>
-          <w:b/>
-          <w:bCs/>
-        </w:rPr>
-        <w:t>Livre = (</w:t>
-      </w:r>
-      <w:r>
-        <w:rPr>
-          <w:b/>
-          <w:bCs/>
-          <w:i/>
-          <w:iCs/>
-          <w:u w:val="single"/>
-        </w:rPr>
-        <w:t>#IdDocument</w:t>
-      </w:r>
-      <w:r>
-        <w:t xml:space="preserve">, </w:t>
-      </w:r>
-      <w:r>
-        <w:rPr>
-          <w:b/>
-          <w:bCs/>
-        </w:rPr>
-        <w:t>ISBN</w:t>
-      </w:r>
-      <w:r>
-        <w:rPr>
-          <w:b/>
-          <w:bCs/>
-          <w:i/>
-          <w:iCs/>
-        </w:rPr>
-        <w:t xml:space="preserve"> VARCHAR(50) </w:t>
-      </w:r>
-      <w:r>
-        <w:t xml:space="preserve">, </w:t>
-      </w:r>
-      <w:proofErr w:type="spellStart"/>
-      <w:r>
-        <w:t>NombrePage</w:t>
-      </w:r>
-      <w:proofErr w:type="spellEnd"/>
-      <w:r>
-        <w:rPr>
-          <w:i/>
-          <w:iCs/>
-        </w:rPr>
-        <w:t xml:space="preserve"> INT</w:t>
-      </w:r>
-      <w:r>
-        <w:t>, Genre</w:t>
-      </w:r>
-      <w:r>
-        <w:rPr>
-          <w:i/>
-          <w:iCs/>
-        </w:rPr>
-        <w:t xml:space="preserve"> VARCHAR(50) </w:t>
-      </w:r>
-      <w:r>
-        <w:rPr>
-          <w:b/>
-          <w:bCs/>
-        </w:rPr>
-        <w:t>);</w:t>
-      </w:r>
-    </w:p>
-    <w:p>
-      <w:pPr>
-        <w:spacing w:after="0"/>
-      </w:pPr>
-      <w:proofErr w:type="spellStart"/>
-      <w:r>
-        <w:rPr>
-          <w:b/>
-          <w:bCs/>
-        </w:rPr>
-        <w:t>TitrePeriodique</w:t>
-      </w:r>
-      <w:proofErr w:type="spellEnd"/>
-      <w:r>
-        <w:rPr>
-          <w:b/>
-          <w:bCs/>
-        </w:rPr>
-        <w:t xml:space="preserve"> = (</w:t>
-      </w:r>
-      <w:r>
-        <w:rPr>
-          <w:b/>
-          <w:bCs/>
-          <w:i/>
-          <w:iCs/>
-          <w:u w:val="single"/>
-        </w:rPr>
-        <w:t>#IdDocument</w:t>
-      </w:r>
-      <w:r>
-        <w:t xml:space="preserve">, </w:t>
-      </w:r>
-      <w:proofErr w:type="spellStart"/>
-      <w:r>
-        <w:t>Numero</w:t>
-      </w:r>
-      <w:proofErr w:type="spellEnd"/>
-      <w:r>
-        <w:rPr>
-          <w:i/>
-          <w:iCs/>
-        </w:rPr>
-        <w:t xml:space="preserve"> INT</w:t>
-      </w:r>
-      <w:r>
-        <w:t xml:space="preserve">, </w:t>
-      </w:r>
-      <w:proofErr w:type="spellStart"/>
-      <w:r>
-        <w:t>DatePublication</w:t>
-      </w:r>
-      <w:proofErr w:type="spellEnd"/>
-      <w:r>
-        <w:rPr>
-          <w:i/>
-          <w:iCs/>
-        </w:rPr>
-        <w:t xml:space="preserve"> DATE</w:t>
-      </w:r>
-      <w:r>
-        <w:t>, Type</w:t>
-      </w:r>
-      <w:r>
-        <w:rPr>
-          <w:i/>
-          <w:iCs/>
-        </w:rPr>
-        <w:t xml:space="preserve"> VARCHAR(50) </w:t>
-      </w:r>
-      <w:r>
-        <w:rPr>
-          <w:b/>
-          <w:bCs/>
-        </w:rPr>
-        <w:t>);</w:t>
-      </w:r>
-    </w:p>
-    <w:p>
-      <w:pPr>
-        <w:spacing w:after="0"/>
-      </w:pPr>
-      <w:r>
-        <w:rPr>
-          <w:b/>
-          <w:bCs/>
-        </w:rPr>
-        <w:t>Sonore = (</w:t>
-      </w:r>
-      <w:r>
-        <w:rPr>
-          <w:b/>
-          <w:bCs/>
-          <w:i/>
-          <w:iCs/>
-          <w:u w:val="single"/>
-        </w:rPr>
-        <w:t>#IdDocument</w:t>
-      </w:r>
-      <w:r>
-        <w:t xml:space="preserve">, </w:t>
-      </w:r>
-      <w:proofErr w:type="spellStart"/>
-      <w:r>
-        <w:t>Duree</w:t>
-      </w:r>
-      <w:proofErr w:type="spellEnd"/>
-      <w:r>
-        <w:rPr>
-          <w:i/>
-          <w:iCs/>
-        </w:rPr>
-        <w:t xml:space="preserve"> INT</w:t>
-      </w:r>
-      <w:r>
-        <w:t>, Format</w:t>
-      </w:r>
-      <w:r>
-        <w:rPr>
-          <w:i/>
-          <w:iCs/>
-        </w:rPr>
-        <w:t xml:space="preserve"> VARCHAR(50) </w:t>
-      </w:r>
-      <w:r>
-        <w:t xml:space="preserve">, </w:t>
-      </w:r>
-      <w:proofErr w:type="spellStart"/>
-      <w:r>
-        <w:t>Interprete</w:t>
-      </w:r>
-      <w:proofErr w:type="spellEnd"/>
-      <w:r>
-        <w:rPr>
-          <w:i/>
-          <w:iCs/>
-        </w:rPr>
-        <w:t xml:space="preserve"> VARCHAR(50) </w:t>
-      </w:r>
-      <w:r>
-        <w:rPr>
-          <w:b/>
-          <w:bCs/>
-        </w:rPr>
-        <w:t>);</w:t>
-      </w:r>
-    </w:p>
-    <w:p>
-      <w:pPr>
-        <w:spacing w:after="0"/>
-      </w:pPr>
-      <w:proofErr w:type="spellStart"/>
-      <w:r>
-        <w:rPr>
-          <w:b/>
-          <w:bCs/>
-        </w:rPr>
-        <w:t>Video</w:t>
-      </w:r>
-      <w:proofErr w:type="spellEnd"/>
-      <w:r>
-        <w:rPr>
-          <w:b/>
-          <w:bCs/>
-        </w:rPr>
-        <w:t xml:space="preserve"> = (</w:t>
-      </w:r>
-      <w:r>
-        <w:rPr>
-          <w:b/>
-          <w:bCs/>
-          <w:i/>
-          <w:iCs/>
-          <w:u w:val="single"/>
-        </w:rPr>
-        <w:t>#IdDocument</w:t>
-      </w:r>
-      <w:r>
-        <w:t xml:space="preserve">, </w:t>
-      </w:r>
-      <w:proofErr w:type="spellStart"/>
-      <w:r>
-        <w:t>Duree</w:t>
-      </w:r>
-      <w:proofErr w:type="spellEnd"/>
-      <w:r>
-        <w:rPr>
-          <w:i/>
-          <w:iCs/>
-        </w:rPr>
-        <w:t xml:space="preserve"> INT</w:t>
-      </w:r>
-      <w:r>
-        <w:t>, Format</w:t>
-      </w:r>
-      <w:r>
-        <w:rPr>
-          <w:i/>
-          <w:iCs/>
-        </w:rPr>
-        <w:t xml:space="preserve"> VARCHAR(50) </w:t>
-      </w:r>
-      <w:r>
-        <w:t xml:space="preserve">, </w:t>
-      </w:r>
-      <w:proofErr w:type="spellStart"/>
-      <w:r>
-        <w:t>Realisateur</w:t>
-      </w:r>
-      <w:proofErr w:type="spellEnd"/>
-      <w:r>
-        <w:rPr>
-          <w:i/>
-          <w:iCs/>
-        </w:rPr>
-        <w:t xml:space="preserve"> VARCHAR(50) </w:t>
-      </w:r>
-      <w:r>
-        <w:rPr>
-          <w:b/>
-          <w:bCs/>
-        </w:rPr>
-        <w:t>);</w:t>
-      </w:r>
-    </w:p>
-    <w:p>
-      <w:pPr>
-        <w:spacing w:after="0"/>
-      </w:pPr>
-      <w:r>
-        <w:rPr>
-          <w:b/>
-          <w:bCs/>
-        </w:rPr>
-        <w:t>Auteur = (</w:t>
-      </w:r>
-      <w:proofErr w:type="spellStart"/>
-      <w:r>
-        <w:rPr>
-          <w:b/>
-          <w:bCs/>
-          <w:u w:val="single"/>
-        </w:rPr>
-        <w:t>IdAuteur</w:t>
-      </w:r>
-      <w:proofErr w:type="spellEnd"/>
-      <w:r>
-        <w:rPr>
-          <w:b/>
-          <w:bCs/>
-          <w:i/>
-          <w:iCs/>
-        </w:rPr>
-        <w:t xml:space="preserve"> INT AUTO_INCREMENT</w:t>
-      </w:r>
-      <w:r>
-        <w:t xml:space="preserve">, </w:t>
-      </w:r>
-      <w:proofErr w:type="spellStart"/>
-      <w:r>
-        <w:t>Prenom</w:t>
-      </w:r>
-      <w:proofErr w:type="spellEnd"/>
-      <w:r>
-        <w:rPr>
-          <w:i/>
-          <w:iCs/>
-        </w:rPr>
-        <w:t xml:space="preserve"> VARCHAR(50) </w:t>
-      </w:r>
-      <w:r>
-        <w:t>, Nom</w:t>
-      </w:r>
-      <w:r>
-        <w:rPr>
-          <w:i/>
-          <w:iCs/>
-        </w:rPr>
-        <w:t xml:space="preserve"> VARCHAR(50) </w:t>
-      </w:r>
-      <w:r>
-        <w:t>, Description</w:t>
-      </w:r>
-      <w:r>
-        <w:rPr>
-          <w:i/>
-          <w:iCs/>
-        </w:rPr>
-        <w:t xml:space="preserve"> TEXT</w:t>
-      </w:r>
-      <w:r>
-        <w:rPr>
-          <w:b/>
-          <w:bCs/>
-        </w:rPr>
-        <w:t>);</w:t>
-      </w:r>
-    </w:p>
-    <w:p>
-      <w:pPr>
-        <w:spacing w:after="0"/>
-      </w:pPr>
-      <w:r>
-        <w:rPr>
-          <w:b/>
-          <w:bCs/>
-        </w:rPr>
-        <w:t>Abonnement = (</w:t>
-      </w:r>
-      <w:proofErr w:type="spellStart"/>
-      <w:r>
-        <w:rPr>
-          <w:b/>
-          <w:bCs/>
-          <w:u w:val="single"/>
-        </w:rPr>
-        <w:t>IdAbonnement</w:t>
-      </w:r>
-      <w:proofErr w:type="spellEnd"/>
-      <w:r>
-        <w:rPr>
-          <w:b/>
-          <w:bCs/>
-          <w:i/>
-          <w:iCs/>
-        </w:rPr>
-        <w:t xml:space="preserve"> VARCHAR(50) </w:t>
-      </w:r>
-      <w:r>
-        <w:t>, Tarif</w:t>
-      </w:r>
-      <w:r>
-        <w:rPr>
-          <w:i/>
-          <w:iCs/>
-        </w:rPr>
-        <w:t xml:space="preserve"> DECIMAL(19,4)</w:t>
-      </w:r>
-      <w:r>
-        <w:rPr>
-          <w:b/>
-          <w:bCs/>
-        </w:rPr>
-        <w:t>);</w:t>
-      </w:r>
-    </w:p>
-    <w:p>
-      <w:pPr>
-        <w:spacing w:after="0"/>
-      </w:pPr>
-      <w:r>
-        <w:rPr>
-          <w:b/>
-          <w:bCs/>
-        </w:rPr>
-        <w:t>Emprunt = (</w:t>
-      </w:r>
-      <w:proofErr w:type="spellStart"/>
-      <w:r>
-        <w:rPr>
-          <w:b/>
-          <w:bCs/>
-          <w:u w:val="single"/>
-        </w:rPr>
-        <w:t>IdEmprunt</w:t>
-      </w:r>
-      <w:proofErr w:type="spellEnd"/>
-      <w:r>
-        <w:rPr>
-          <w:b/>
-          <w:bCs/>
-          <w:i/>
-          <w:iCs/>
-        </w:rPr>
-        <w:t xml:space="preserve"> INT AUTO_INCREMENT</w:t>
-      </w:r>
-      <w:r>
-        <w:t xml:space="preserve">, </w:t>
-      </w:r>
-      <w:proofErr w:type="spellStart"/>
-      <w:r>
-        <w:t>DateReservation</w:t>
-      </w:r>
-      <w:proofErr w:type="spellEnd"/>
-      <w:r>
-        <w:rPr>
-          <w:i/>
-          <w:iCs/>
-        </w:rPr>
-        <w:t xml:space="preserve"> DATE</w:t>
-      </w:r>
-      <w:r>
-        <w:t xml:space="preserve">, </w:t>
-      </w:r>
-      <w:proofErr w:type="spellStart"/>
-      <w:r>
-        <w:t>DateRenduPrevision</w:t>
-      </w:r>
-      <w:proofErr w:type="spellEnd"/>
-      <w:r>
-        <w:rPr>
-          <w:i/>
-          <w:iCs/>
-        </w:rPr>
-        <w:t xml:space="preserve"> DATE</w:t>
-      </w:r>
-      <w:r>
-        <w:t xml:space="preserve">, </w:t>
-      </w:r>
-      <w:proofErr w:type="spellStart"/>
-      <w:r>
-        <w:t>DateRendu</w:t>
-      </w:r>
-      <w:proofErr w:type="spellEnd"/>
-      <w:r>
-        <w:rPr>
-          <w:i/>
-          <w:iCs/>
-        </w:rPr>
-        <w:t xml:space="preserve"> DATE, #IdUtilisateur</w:t>
-      </w:r>
-      <w:r>
-        <w:rPr>
-          <w:b/>
-          <w:bCs/>
-        </w:rPr>
-        <w:t>);</w:t>
-      </w:r>
-    </w:p>
-    <w:p>
-      <w:pPr>
-        <w:spacing w:after="0"/>
-      </w:pPr>
-      <w:r>
-        <w:rPr>
-          <w:b/>
-          <w:bCs/>
-        </w:rPr>
-        <w:t>Client = (</w:t>
-      </w:r>
-      <w:r>
-        <w:rPr>
-          <w:b/>
-          <w:bCs/>
-          <w:i/>
-          <w:iCs/>
-          <w:u w:val="single"/>
-        </w:rPr>
-        <w:t>#IdUtilisateur</w:t>
-      </w:r>
-      <w:r>
-        <w:t xml:space="preserve">, </w:t>
-      </w:r>
-      <w:proofErr w:type="spellStart"/>
-      <w:r>
-        <w:t>StatutAbonnement</w:t>
-      </w:r>
-      <w:proofErr w:type="spellEnd"/>
-      <w:r>
-        <w:rPr>
-          <w:i/>
-          <w:iCs/>
-        </w:rPr>
-        <w:t xml:space="preserve"> VARCHAR(50) </w:t>
-      </w:r>
-      <w:r>
-        <w:t xml:space="preserve">, </w:t>
-      </w:r>
-      <w:proofErr w:type="spellStart"/>
-      <w:r>
-        <w:t>DateFinAbonnement</w:t>
-      </w:r>
-      <w:proofErr w:type="spellEnd"/>
-      <w:r>
-        <w:rPr>
-          <w:i/>
-          <w:iCs/>
-        </w:rPr>
-        <w:t xml:space="preserve"> DATE, #IdAbonnement</w:t>
-      </w:r>
-      <w:r>
-        <w:rPr>
-          <w:b/>
-          <w:bCs/>
-        </w:rPr>
-        <w:t>*);</w:t>
-      </w:r>
-    </w:p>
-    <w:p>
-      <w:pPr>
-        <w:spacing w:after="0"/>
-      </w:pPr>
-      <w:r>
-        <w:rPr>
-          <w:b/>
-          <w:bCs/>
-        </w:rPr>
-        <w:t>Ecrire = (</w:t>
-      </w:r>
-      <w:r>
-        <w:rPr>
-          <w:b/>
-          <w:bCs/>
-          <w:i/>
-          <w:iCs/>
-          <w:u w:val="single"/>
-        </w:rPr>
-        <w:t>#IdDocument, #IdAuteur</w:t>
-      </w:r>
-      <w:r>
-        <w:rPr>
-          <w:b/>
-          <w:bCs/>
-        </w:rPr>
-        <w:t>);</w:t>
-      </w:r>
-    </w:p>
-    <w:p>
-      <w:pPr>
-        <w:spacing w:after="0"/>
-      </w:pPr>
-      <w:proofErr w:type="spellStart"/>
-      <w:r>
-        <w:rPr>
-          <w:b/>
-          <w:bCs/>
-        </w:rPr>
-        <w:t>EmpruntArticle</w:t>
-      </w:r>
-      <w:proofErr w:type="spellEnd"/>
-      <w:r>
-        <w:rPr>
-          <w:b/>
-          <w:bCs/>
-        </w:rPr>
-        <w:t xml:space="preserve"> = (</w:t>
-      </w:r>
-      <w:r>
-        <w:rPr>
-          <w:b/>
-          <w:bCs/>
-          <w:i/>
-          <w:iCs/>
-          <w:u w:val="single"/>
-        </w:rPr>
-        <w:t>#IdDocument, #IdEmprunt</w:t>
-      </w:r>
-      <w:r>
-        <w:rPr>
-          <w:b/>
-          <w:bCs/>
-        </w:rPr>
-        <w:t>);</w:t>
-      </w:r>
+      <w:proofErr w:type="gramEnd"/>
     </w:p>
     <w:p>
       <w:pPr>

</xml_diff>

<commit_message>
supression auteur sans les docs
</commit_message>
<xml_diff>
--- a/Doc/DOC.docx
+++ b/Doc/DOC.docx
@@ -749,7 +749,13 @@
         <w:spacing w:after="0"/>
       </w:pPr>
       <w:r>
-        <w:t>Filtrage et tri des résultats</w:t>
+        <w:rPr>
+          <w:color w:val="215E99" w:themeColor="text2" w:themeTint="BF"/>
+        </w:rPr>
+        <w:t xml:space="preserve">Filtrage </w:t>
+      </w:r>
+      <w:r>
+        <w:t>et tri des résultats</w:t>
       </w:r>
     </w:p>
     <w:p>
@@ -1104,7 +1110,19 @@
         <w:rPr>
           <w:color w:val="215E99" w:themeColor="text2" w:themeTint="BF"/>
         </w:rPr>
-        <w:t>Gestion des auteurs (ajout, modification, suppression)</w:t>
+        <w:t>Gestion des auteurs (ajout, modification, suppression</w:t>
+      </w:r>
+      <w:r>
+        <w:rPr>
+          <w:color w:val="215E99" w:themeColor="text2" w:themeTint="BF"/>
+        </w:rPr>
+        <w:t xml:space="preserve"> (sans supprimer document)</w:t>
+      </w:r>
+      <w:r>
+        <w:rPr>
+          <w:color w:val="215E99" w:themeColor="text2" w:themeTint="BF"/>
+        </w:rPr>
+        <w:t>)</w:t>
       </w:r>
     </w:p>
     <w:p>
@@ -1619,8 +1637,13 @@
       <w:pPr>
         <w:spacing w:after="0"/>
       </w:pPr>
-      <w:r>
-        <w:t xml:space="preserve">légende : </w:t>
+      <w:proofErr w:type="gramStart"/>
+      <w:r>
+        <w:t>légende</w:t>
+      </w:r>
+      <w:proofErr w:type="gramEnd"/>
+      <w:r>
+        <w:t xml:space="preserve"> : </w:t>
       </w:r>
     </w:p>
     <w:p>
@@ -1636,7 +1659,15 @@
         <w:spacing w:after="0"/>
       </w:pPr>
       <w:r>
-        <w:t>- bleu foncé : les associations qui crée une nouvelle table</w:t>
+        <w:t xml:space="preserve">- bleu foncé : les associations qui </w:t>
+      </w:r>
+      <w:proofErr w:type="gramStart"/>
+      <w:r>
+        <w:t>crée</w:t>
+      </w:r>
+      <w:proofErr w:type="gramEnd"/>
+      <w:r>
+        <w:t xml:space="preserve"> une nouvelle table</w:t>
       </w:r>
       <w:r>
         <w:br/>
@@ -1678,7 +1709,15 @@
         <w:spacing w:after="0"/>
       </w:pPr>
       <w:r>
-        <w:t xml:space="preserve">Si nous retranscrivons le MCD de façons écrite, alors, nous aurons le MCD (Modèle logique de données) : </w:t>
+        <w:t xml:space="preserve">Si nous retranscrivons le MCD de </w:t>
+      </w:r>
+      <w:proofErr w:type="gramStart"/>
+      <w:r>
+        <w:t>façons écrite</w:t>
+      </w:r>
+      <w:proofErr w:type="gramEnd"/>
+      <w:r>
+        <w:t xml:space="preserve">, alors, nous aurons le MCD (Modèle logique de données) : </w:t>
       </w:r>
     </w:p>
     <w:p>
@@ -1724,13 +1763,1172 @@
           <w:i/>
           <w:iCs/>
         </w:rPr>
-        <w:t xml:space="preserve"> VARCHAR(50) </w:t>
+        <w:t xml:space="preserve"> </w:t>
+      </w:r>
+      <w:proofErr w:type="gramStart"/>
+      <w:r>
+        <w:rPr>
+          <w:i/>
+          <w:iCs/>
+        </w:rPr>
+        <w:t>VARCHAR(</w:t>
+      </w:r>
+      <w:proofErr w:type="gramEnd"/>
+      <w:r>
+        <w:rPr>
+          <w:i/>
+          <w:iCs/>
+        </w:rPr>
+        <w:t>50</w:t>
+      </w:r>
+      <w:proofErr w:type="gramStart"/>
+      <w:r>
+        <w:rPr>
+          <w:i/>
+          <w:iCs/>
+        </w:rPr>
+        <w:t xml:space="preserve">) </w:t>
+      </w:r>
+      <w:r>
+        <w:t>,</w:t>
+      </w:r>
+      <w:proofErr w:type="gramEnd"/>
+      <w:r>
+        <w:t xml:space="preserve"> </w:t>
+      </w:r>
+      <w:proofErr w:type="spellStart"/>
+      <w:r>
+        <w:t>Prenom</w:t>
+      </w:r>
+      <w:proofErr w:type="spellEnd"/>
+      <w:r>
+        <w:rPr>
+          <w:i/>
+          <w:iCs/>
+        </w:rPr>
+        <w:t xml:space="preserve"> </w:t>
+      </w:r>
+      <w:proofErr w:type="gramStart"/>
+      <w:r>
+        <w:rPr>
+          <w:i/>
+          <w:iCs/>
+        </w:rPr>
+        <w:t>VARCHAR(</w:t>
+      </w:r>
+      <w:proofErr w:type="gramEnd"/>
+      <w:r>
+        <w:rPr>
+          <w:i/>
+          <w:iCs/>
+        </w:rPr>
+        <w:t>50</w:t>
+      </w:r>
+      <w:proofErr w:type="gramStart"/>
+      <w:r>
+        <w:rPr>
+          <w:i/>
+          <w:iCs/>
+        </w:rPr>
+        <w:t xml:space="preserve">) </w:t>
+      </w:r>
+      <w:r>
+        <w:t>,</w:t>
+      </w:r>
+      <w:proofErr w:type="gramEnd"/>
+      <w:r>
+        <w:t xml:space="preserve"> </w:t>
+      </w:r>
+      <w:proofErr w:type="spellStart"/>
+      <w:r>
+        <w:t>DateNaissance</w:t>
+      </w:r>
+      <w:proofErr w:type="spellEnd"/>
+      <w:r>
+        <w:rPr>
+          <w:i/>
+          <w:iCs/>
+        </w:rPr>
+        <w:t xml:space="preserve"> DATE</w:t>
+      </w:r>
+      <w:r>
+        <w:t>, Adresse1</w:t>
+      </w:r>
+      <w:r>
+        <w:rPr>
+          <w:i/>
+          <w:iCs/>
+        </w:rPr>
+        <w:t xml:space="preserve"> </w:t>
+      </w:r>
+      <w:proofErr w:type="gramStart"/>
+      <w:r>
+        <w:rPr>
+          <w:i/>
+          <w:iCs/>
+        </w:rPr>
+        <w:t>VARCHAR(</w:t>
+      </w:r>
+      <w:proofErr w:type="gramEnd"/>
+      <w:r>
+        <w:rPr>
+          <w:i/>
+          <w:iCs/>
+        </w:rPr>
+        <w:t>50</w:t>
+      </w:r>
+      <w:proofErr w:type="gramStart"/>
+      <w:r>
+        <w:rPr>
+          <w:i/>
+          <w:iCs/>
+        </w:rPr>
+        <w:t xml:space="preserve">) </w:t>
+      </w:r>
+      <w:r>
+        <w:t>,</w:t>
+      </w:r>
+      <w:proofErr w:type="gramEnd"/>
+      <w:r>
+        <w:t xml:space="preserve"> Adresse2</w:t>
+      </w:r>
+      <w:r>
+        <w:rPr>
+          <w:i/>
+          <w:iCs/>
+        </w:rPr>
+        <w:t xml:space="preserve"> </w:t>
+      </w:r>
+      <w:proofErr w:type="gramStart"/>
+      <w:r>
+        <w:rPr>
+          <w:i/>
+          <w:iCs/>
+        </w:rPr>
+        <w:t>VARCHAR(</w:t>
+      </w:r>
+      <w:proofErr w:type="gramEnd"/>
+      <w:r>
+        <w:rPr>
+          <w:i/>
+          <w:iCs/>
+        </w:rPr>
+        <w:t>50</w:t>
+      </w:r>
+      <w:proofErr w:type="gramStart"/>
+      <w:r>
+        <w:rPr>
+          <w:i/>
+          <w:iCs/>
+        </w:rPr>
+        <w:t xml:space="preserve">) </w:t>
+      </w:r>
+      <w:r>
+        <w:t>,</w:t>
+      </w:r>
+      <w:proofErr w:type="gramEnd"/>
+      <w:r>
+        <w:t xml:space="preserve"> Ville</w:t>
+      </w:r>
+      <w:r>
+        <w:rPr>
+          <w:i/>
+          <w:iCs/>
+        </w:rPr>
+        <w:t xml:space="preserve"> </w:t>
+      </w:r>
+      <w:proofErr w:type="gramStart"/>
+      <w:r>
+        <w:rPr>
+          <w:i/>
+          <w:iCs/>
+        </w:rPr>
+        <w:t>VARCHAR(</w:t>
+      </w:r>
+      <w:proofErr w:type="gramEnd"/>
+      <w:r>
+        <w:rPr>
+          <w:i/>
+          <w:iCs/>
+        </w:rPr>
+        <w:t>50</w:t>
+      </w:r>
+      <w:proofErr w:type="gramStart"/>
+      <w:r>
+        <w:rPr>
+          <w:i/>
+          <w:iCs/>
+        </w:rPr>
+        <w:t xml:space="preserve">) </w:t>
+      </w:r>
+      <w:r>
+        <w:t>,</w:t>
+      </w:r>
+      <w:proofErr w:type="gramEnd"/>
+      <w:r>
+        <w:t xml:space="preserve"> Pays</w:t>
+      </w:r>
+      <w:r>
+        <w:rPr>
+          <w:i/>
+          <w:iCs/>
+        </w:rPr>
+        <w:t xml:space="preserve"> </w:t>
+      </w:r>
+      <w:proofErr w:type="gramStart"/>
+      <w:r>
+        <w:rPr>
+          <w:i/>
+          <w:iCs/>
+        </w:rPr>
+        <w:t>VARCHAR(</w:t>
+      </w:r>
+      <w:proofErr w:type="gramEnd"/>
+      <w:r>
+        <w:rPr>
+          <w:i/>
+          <w:iCs/>
+        </w:rPr>
+        <w:t>50</w:t>
+      </w:r>
+      <w:proofErr w:type="gramStart"/>
+      <w:r>
+        <w:rPr>
+          <w:i/>
+          <w:iCs/>
+        </w:rPr>
+        <w:t xml:space="preserve">) </w:t>
+      </w:r>
+      <w:r>
+        <w:t>,</w:t>
+      </w:r>
+      <w:proofErr w:type="gramEnd"/>
+      <w:r>
+        <w:t xml:space="preserve"> Mail</w:t>
+      </w:r>
+      <w:r>
+        <w:rPr>
+          <w:b/>
+          <w:bCs/>
+          <w:i/>
+          <w:iCs/>
+        </w:rPr>
+        <w:t xml:space="preserve"> </w:t>
+      </w:r>
+      <w:proofErr w:type="gramStart"/>
+      <w:r>
+        <w:rPr>
+          <w:b/>
+          <w:bCs/>
+          <w:i/>
+          <w:iCs/>
+        </w:rPr>
+        <w:t>VARCHAR(</w:t>
+      </w:r>
+      <w:proofErr w:type="gramEnd"/>
+      <w:r>
+        <w:rPr>
+          <w:b/>
+          <w:bCs/>
+          <w:i/>
+          <w:iCs/>
+        </w:rPr>
+        <w:t>50</w:t>
+      </w:r>
+      <w:proofErr w:type="gramStart"/>
+      <w:r>
+        <w:rPr>
+          <w:b/>
+          <w:bCs/>
+          <w:i/>
+          <w:iCs/>
+        </w:rPr>
+        <w:t xml:space="preserve">) </w:t>
+      </w:r>
+      <w:r>
+        <w:t>,</w:t>
+      </w:r>
+      <w:proofErr w:type="gramEnd"/>
+      <w:r>
+        <w:t xml:space="preserve"> </w:t>
+      </w:r>
+      <w:proofErr w:type="spellStart"/>
+      <w:r>
+        <w:t>NumeroTelephone</w:t>
+      </w:r>
+      <w:proofErr w:type="spellEnd"/>
+      <w:r>
+        <w:rPr>
+          <w:i/>
+          <w:iCs/>
+        </w:rPr>
+        <w:t xml:space="preserve"> </w:t>
+      </w:r>
+      <w:proofErr w:type="gramStart"/>
+      <w:r>
+        <w:rPr>
+          <w:i/>
+          <w:iCs/>
+        </w:rPr>
+        <w:t>VARCHAR(</w:t>
+      </w:r>
+      <w:proofErr w:type="gramEnd"/>
+      <w:r>
+        <w:rPr>
+          <w:i/>
+          <w:iCs/>
+        </w:rPr>
+        <w:t>50</w:t>
+      </w:r>
+      <w:proofErr w:type="gramStart"/>
+      <w:r>
+        <w:rPr>
+          <w:i/>
+          <w:iCs/>
+        </w:rPr>
+        <w:t xml:space="preserve">) </w:t>
+      </w:r>
+      <w:r>
+        <w:t>,</w:t>
+      </w:r>
+      <w:proofErr w:type="gramEnd"/>
+      <w:r>
+        <w:t xml:space="preserve"> Situation</w:t>
+      </w:r>
+      <w:r>
+        <w:rPr>
+          <w:i/>
+          <w:iCs/>
+        </w:rPr>
+        <w:t xml:space="preserve"> </w:t>
+      </w:r>
+      <w:proofErr w:type="gramStart"/>
+      <w:r>
+        <w:rPr>
+          <w:i/>
+          <w:iCs/>
+        </w:rPr>
+        <w:t>VARCHAR(</w:t>
+      </w:r>
+      <w:proofErr w:type="gramEnd"/>
+      <w:r>
+        <w:rPr>
+          <w:i/>
+          <w:iCs/>
+        </w:rPr>
+        <w:t>50</w:t>
+      </w:r>
+      <w:proofErr w:type="gramStart"/>
+      <w:r>
+        <w:rPr>
+          <w:i/>
+          <w:iCs/>
+        </w:rPr>
+        <w:t xml:space="preserve">) </w:t>
+      </w:r>
+      <w:r>
+        <w:rPr>
+          <w:b/>
+          <w:bCs/>
+        </w:rPr>
+        <w:t>)</w:t>
+      </w:r>
+      <w:proofErr w:type="gramEnd"/>
+      <w:r>
+        <w:rPr>
+          <w:b/>
+          <w:bCs/>
+        </w:rPr>
+        <w:t>;</w:t>
+      </w:r>
+    </w:p>
+    <w:p>
+      <w:pPr>
+        <w:spacing w:after="0"/>
+      </w:pPr>
+      <w:proofErr w:type="spellStart"/>
+      <w:r>
+        <w:rPr>
+          <w:b/>
+          <w:bCs/>
+        </w:rPr>
+        <w:t>Employe</w:t>
+      </w:r>
+      <w:proofErr w:type="spellEnd"/>
+      <w:r>
+        <w:rPr>
+          <w:b/>
+          <w:bCs/>
+        </w:rPr>
+        <w:t xml:space="preserve"> = (</w:t>
+      </w:r>
+      <w:r>
+        <w:rPr>
+          <w:b/>
+          <w:bCs/>
+          <w:i/>
+          <w:iCs/>
+          <w:u w:val="single"/>
+        </w:rPr>
+        <w:t>#IdUtilisateur</w:t>
+      </w:r>
+      <w:r>
+        <w:t>, Statut</w:t>
+      </w:r>
+      <w:r>
+        <w:rPr>
+          <w:i/>
+          <w:iCs/>
+        </w:rPr>
+        <w:t xml:space="preserve"> </w:t>
+      </w:r>
+      <w:proofErr w:type="gramStart"/>
+      <w:r>
+        <w:rPr>
+          <w:i/>
+          <w:iCs/>
+        </w:rPr>
+        <w:t>VARCHAR(</w:t>
+      </w:r>
+      <w:proofErr w:type="gramEnd"/>
+      <w:r>
+        <w:rPr>
+          <w:i/>
+          <w:iCs/>
+        </w:rPr>
+        <w:t>50</w:t>
+      </w:r>
+      <w:proofErr w:type="gramStart"/>
+      <w:r>
+        <w:rPr>
+          <w:i/>
+          <w:iCs/>
+        </w:rPr>
+        <w:t xml:space="preserve">) </w:t>
+      </w:r>
+      <w:r>
+        <w:rPr>
+          <w:b/>
+          <w:bCs/>
+        </w:rPr>
+        <w:t>)</w:t>
+      </w:r>
+      <w:proofErr w:type="gramEnd"/>
+      <w:r>
+        <w:rPr>
+          <w:b/>
+          <w:bCs/>
+        </w:rPr>
+        <w:t>;</w:t>
+      </w:r>
+    </w:p>
+    <w:p>
+      <w:pPr>
+        <w:spacing w:after="0"/>
+      </w:pPr>
+      <w:r>
+        <w:rPr>
+          <w:b/>
+          <w:bCs/>
+        </w:rPr>
+        <w:t>Document = (</w:t>
+      </w:r>
+      <w:proofErr w:type="spellStart"/>
+      <w:r>
+        <w:rPr>
+          <w:b/>
+          <w:bCs/>
+          <w:u w:val="single"/>
+        </w:rPr>
+        <w:t>IdDocument</w:t>
+      </w:r>
+      <w:proofErr w:type="spellEnd"/>
+      <w:r>
+        <w:rPr>
+          <w:b/>
+          <w:bCs/>
+          <w:i/>
+          <w:iCs/>
+        </w:rPr>
+        <w:t xml:space="preserve"> INT AUTO_INCREMENT</w:t>
+      </w:r>
+      <w:r>
+        <w:t>, Titre</w:t>
+      </w:r>
+      <w:r>
+        <w:rPr>
+          <w:i/>
+          <w:iCs/>
+        </w:rPr>
+        <w:t xml:space="preserve"> </w:t>
+      </w:r>
+      <w:proofErr w:type="gramStart"/>
+      <w:r>
+        <w:rPr>
+          <w:i/>
+          <w:iCs/>
+        </w:rPr>
+        <w:t>VARCHAR(</w:t>
+      </w:r>
+      <w:proofErr w:type="gramEnd"/>
+      <w:r>
+        <w:rPr>
+          <w:i/>
+          <w:iCs/>
+        </w:rPr>
+        <w:t>50</w:t>
+      </w:r>
+      <w:proofErr w:type="gramStart"/>
+      <w:r>
+        <w:rPr>
+          <w:i/>
+          <w:iCs/>
+        </w:rPr>
+        <w:t xml:space="preserve">) </w:t>
+      </w:r>
+      <w:r>
+        <w:t>,</w:t>
+      </w:r>
+      <w:proofErr w:type="gramEnd"/>
+      <w:r>
+        <w:t xml:space="preserve"> </w:t>
+      </w:r>
+      <w:proofErr w:type="spellStart"/>
+      <w:r>
+        <w:t>Annee</w:t>
+      </w:r>
+      <w:proofErr w:type="spellEnd"/>
+      <w:r>
+        <w:rPr>
+          <w:i/>
+          <w:iCs/>
+        </w:rPr>
+        <w:t xml:space="preserve"> DATE</w:t>
+      </w:r>
+      <w:r>
+        <w:t>, Auteur</w:t>
+      </w:r>
+      <w:r>
+        <w:rPr>
+          <w:i/>
+          <w:iCs/>
+        </w:rPr>
+        <w:t xml:space="preserve"> </w:t>
+      </w:r>
+      <w:proofErr w:type="gramStart"/>
+      <w:r>
+        <w:rPr>
+          <w:i/>
+          <w:iCs/>
+        </w:rPr>
+        <w:t>VARCHAR(</w:t>
+      </w:r>
+      <w:proofErr w:type="gramEnd"/>
+      <w:r>
+        <w:rPr>
+          <w:i/>
+          <w:iCs/>
+        </w:rPr>
+        <w:t>50</w:t>
+      </w:r>
+      <w:proofErr w:type="gramStart"/>
+      <w:r>
+        <w:rPr>
+          <w:i/>
+          <w:iCs/>
+        </w:rPr>
+        <w:t xml:space="preserve">) </w:t>
+      </w:r>
+      <w:r>
+        <w:t>,</w:t>
+      </w:r>
+      <w:proofErr w:type="gramEnd"/>
+      <w:r>
+        <w:t xml:space="preserve"> </w:t>
+      </w:r>
+      <w:proofErr w:type="spellStart"/>
+      <w:r>
+        <w:t>Resume</w:t>
+      </w:r>
+      <w:proofErr w:type="spellEnd"/>
+      <w:r>
+        <w:rPr>
+          <w:i/>
+          <w:iCs/>
+        </w:rPr>
+        <w:t xml:space="preserve"> TEXT</w:t>
+      </w:r>
+      <w:r>
+        <w:t>, stock</w:t>
+      </w:r>
+      <w:r>
+        <w:rPr>
+          <w:i/>
+          <w:iCs/>
+        </w:rPr>
+        <w:t xml:space="preserve"> INT</w:t>
+      </w:r>
+      <w:proofErr w:type="gramStart"/>
+      <w:r>
+        <w:rPr>
+          <w:b/>
+          <w:bCs/>
+        </w:rPr>
+        <w:t>);</w:t>
+      </w:r>
+      <w:proofErr w:type="gramEnd"/>
+    </w:p>
+    <w:p>
+      <w:pPr>
+        <w:spacing w:after="0"/>
+      </w:pPr>
+      <w:r>
+        <w:rPr>
+          <w:b/>
+          <w:bCs/>
+        </w:rPr>
+        <w:t>Livre = (</w:t>
+      </w:r>
+      <w:r>
+        <w:rPr>
+          <w:b/>
+          <w:bCs/>
+          <w:i/>
+          <w:iCs/>
+          <w:u w:val="single"/>
+        </w:rPr>
+        <w:t>#IdDocument</w:t>
       </w:r>
       <w:r>
         <w:t xml:space="preserve">, </w:t>
       </w:r>
+      <w:r>
+        <w:rPr>
+          <w:b/>
+          <w:bCs/>
+        </w:rPr>
+        <w:t>ISBN</w:t>
+      </w:r>
+      <w:r>
+        <w:rPr>
+          <w:b/>
+          <w:bCs/>
+          <w:i/>
+          <w:iCs/>
+        </w:rPr>
+        <w:t xml:space="preserve"> </w:t>
+      </w:r>
+      <w:proofErr w:type="gramStart"/>
+      <w:r>
+        <w:rPr>
+          <w:b/>
+          <w:bCs/>
+          <w:i/>
+          <w:iCs/>
+        </w:rPr>
+        <w:t>VARCHAR(</w:t>
+      </w:r>
+      <w:proofErr w:type="gramEnd"/>
+      <w:r>
+        <w:rPr>
+          <w:b/>
+          <w:bCs/>
+          <w:i/>
+          <w:iCs/>
+        </w:rPr>
+        <w:t>50</w:t>
+      </w:r>
+      <w:proofErr w:type="gramStart"/>
+      <w:r>
+        <w:rPr>
+          <w:b/>
+          <w:bCs/>
+          <w:i/>
+          <w:iCs/>
+        </w:rPr>
+        <w:t xml:space="preserve">) </w:t>
+      </w:r>
+      <w:r>
+        <w:t>,</w:t>
+      </w:r>
+      <w:proofErr w:type="gramEnd"/>
+      <w:r>
+        <w:t xml:space="preserve"> </w:t>
+      </w:r>
       <w:proofErr w:type="spellStart"/>
       <w:r>
+        <w:t>NombrePage</w:t>
+      </w:r>
+      <w:proofErr w:type="spellEnd"/>
+      <w:r>
+        <w:rPr>
+          <w:i/>
+          <w:iCs/>
+        </w:rPr>
+        <w:t xml:space="preserve"> INT</w:t>
+      </w:r>
+      <w:r>
+        <w:t>, Genre</w:t>
+      </w:r>
+      <w:r>
+        <w:rPr>
+          <w:i/>
+          <w:iCs/>
+        </w:rPr>
+        <w:t xml:space="preserve"> </w:t>
+      </w:r>
+      <w:proofErr w:type="gramStart"/>
+      <w:r>
+        <w:rPr>
+          <w:i/>
+          <w:iCs/>
+        </w:rPr>
+        <w:t>VARCHAR(</w:t>
+      </w:r>
+      <w:proofErr w:type="gramEnd"/>
+      <w:r>
+        <w:rPr>
+          <w:i/>
+          <w:iCs/>
+        </w:rPr>
+        <w:t>50</w:t>
+      </w:r>
+      <w:proofErr w:type="gramStart"/>
+      <w:r>
+        <w:rPr>
+          <w:i/>
+          <w:iCs/>
+        </w:rPr>
+        <w:t xml:space="preserve">) </w:t>
+      </w:r>
+      <w:r>
+        <w:rPr>
+          <w:b/>
+          <w:bCs/>
+        </w:rPr>
+        <w:t>)</w:t>
+      </w:r>
+      <w:proofErr w:type="gramEnd"/>
+      <w:r>
+        <w:rPr>
+          <w:b/>
+          <w:bCs/>
+        </w:rPr>
+        <w:t>;</w:t>
+      </w:r>
+    </w:p>
+    <w:p>
+      <w:pPr>
+        <w:spacing w:after="0"/>
+      </w:pPr>
+      <w:proofErr w:type="spellStart"/>
+      <w:r>
+        <w:rPr>
+          <w:b/>
+          <w:bCs/>
+        </w:rPr>
+        <w:t>TitrePeriodique</w:t>
+      </w:r>
+      <w:proofErr w:type="spellEnd"/>
+      <w:r>
+        <w:rPr>
+          <w:b/>
+          <w:bCs/>
+        </w:rPr>
+        <w:t xml:space="preserve"> = (</w:t>
+      </w:r>
+      <w:r>
+        <w:rPr>
+          <w:b/>
+          <w:bCs/>
+          <w:i/>
+          <w:iCs/>
+          <w:u w:val="single"/>
+        </w:rPr>
+        <w:t>#IdDocument</w:t>
+      </w:r>
+      <w:r>
+        <w:t xml:space="preserve">, </w:t>
+      </w:r>
+      <w:proofErr w:type="spellStart"/>
+      <w:r>
+        <w:t>Numero</w:t>
+      </w:r>
+      <w:proofErr w:type="spellEnd"/>
+      <w:r>
+        <w:rPr>
+          <w:i/>
+          <w:iCs/>
+        </w:rPr>
+        <w:t xml:space="preserve"> INT</w:t>
+      </w:r>
+      <w:r>
+        <w:t xml:space="preserve">, </w:t>
+      </w:r>
+      <w:proofErr w:type="spellStart"/>
+      <w:r>
+        <w:t>DatePublication</w:t>
+      </w:r>
+      <w:proofErr w:type="spellEnd"/>
+      <w:r>
+        <w:rPr>
+          <w:i/>
+          <w:iCs/>
+        </w:rPr>
+        <w:t xml:space="preserve"> DATE</w:t>
+      </w:r>
+      <w:r>
+        <w:t>, Type</w:t>
+      </w:r>
+      <w:r>
+        <w:rPr>
+          <w:i/>
+          <w:iCs/>
+        </w:rPr>
+        <w:t xml:space="preserve"> </w:t>
+      </w:r>
+      <w:proofErr w:type="gramStart"/>
+      <w:r>
+        <w:rPr>
+          <w:i/>
+          <w:iCs/>
+        </w:rPr>
+        <w:t>VARCHAR(</w:t>
+      </w:r>
+      <w:proofErr w:type="gramEnd"/>
+      <w:r>
+        <w:rPr>
+          <w:i/>
+          <w:iCs/>
+        </w:rPr>
+        <w:t>50</w:t>
+      </w:r>
+      <w:proofErr w:type="gramStart"/>
+      <w:r>
+        <w:rPr>
+          <w:i/>
+          <w:iCs/>
+        </w:rPr>
+        <w:t xml:space="preserve">) </w:t>
+      </w:r>
+      <w:r>
+        <w:rPr>
+          <w:b/>
+          <w:bCs/>
+        </w:rPr>
+        <w:t>)</w:t>
+      </w:r>
+      <w:proofErr w:type="gramEnd"/>
+      <w:r>
+        <w:rPr>
+          <w:b/>
+          <w:bCs/>
+        </w:rPr>
+        <w:t>;</w:t>
+      </w:r>
+    </w:p>
+    <w:p>
+      <w:pPr>
+        <w:spacing w:after="0"/>
+      </w:pPr>
+      <w:r>
+        <w:rPr>
+          <w:b/>
+          <w:bCs/>
+        </w:rPr>
+        <w:t>Sonore = (</w:t>
+      </w:r>
+      <w:r>
+        <w:rPr>
+          <w:b/>
+          <w:bCs/>
+          <w:i/>
+          <w:iCs/>
+          <w:u w:val="single"/>
+        </w:rPr>
+        <w:t>#IdDocument</w:t>
+      </w:r>
+      <w:r>
+        <w:t xml:space="preserve">, </w:t>
+      </w:r>
+      <w:proofErr w:type="spellStart"/>
+      <w:r>
+        <w:t>Duree</w:t>
+      </w:r>
+      <w:proofErr w:type="spellEnd"/>
+      <w:r>
+        <w:rPr>
+          <w:i/>
+          <w:iCs/>
+        </w:rPr>
+        <w:t xml:space="preserve"> INT</w:t>
+      </w:r>
+      <w:r>
+        <w:t>, Format</w:t>
+      </w:r>
+      <w:r>
+        <w:rPr>
+          <w:i/>
+          <w:iCs/>
+        </w:rPr>
+        <w:t xml:space="preserve"> </w:t>
+      </w:r>
+      <w:proofErr w:type="gramStart"/>
+      <w:r>
+        <w:rPr>
+          <w:i/>
+          <w:iCs/>
+        </w:rPr>
+        <w:t>VARCHAR(</w:t>
+      </w:r>
+      <w:proofErr w:type="gramEnd"/>
+      <w:r>
+        <w:rPr>
+          <w:i/>
+          <w:iCs/>
+        </w:rPr>
+        <w:t>50</w:t>
+      </w:r>
+      <w:proofErr w:type="gramStart"/>
+      <w:r>
+        <w:rPr>
+          <w:i/>
+          <w:iCs/>
+        </w:rPr>
+        <w:t xml:space="preserve">) </w:t>
+      </w:r>
+      <w:r>
+        <w:t>,</w:t>
+      </w:r>
+      <w:proofErr w:type="gramEnd"/>
+      <w:r>
+        <w:t xml:space="preserve"> </w:t>
+      </w:r>
+      <w:proofErr w:type="spellStart"/>
+      <w:r>
+        <w:t>Interprete</w:t>
+      </w:r>
+      <w:proofErr w:type="spellEnd"/>
+      <w:r>
+        <w:rPr>
+          <w:i/>
+          <w:iCs/>
+        </w:rPr>
+        <w:t xml:space="preserve"> </w:t>
+      </w:r>
+      <w:proofErr w:type="gramStart"/>
+      <w:r>
+        <w:rPr>
+          <w:i/>
+          <w:iCs/>
+        </w:rPr>
+        <w:t>VARCHAR(</w:t>
+      </w:r>
+      <w:proofErr w:type="gramEnd"/>
+      <w:r>
+        <w:rPr>
+          <w:i/>
+          <w:iCs/>
+        </w:rPr>
+        <w:t>50</w:t>
+      </w:r>
+      <w:proofErr w:type="gramStart"/>
+      <w:r>
+        <w:rPr>
+          <w:i/>
+          <w:iCs/>
+        </w:rPr>
+        <w:t xml:space="preserve">) </w:t>
+      </w:r>
+      <w:r>
+        <w:rPr>
+          <w:b/>
+          <w:bCs/>
+        </w:rPr>
+        <w:t>)</w:t>
+      </w:r>
+      <w:proofErr w:type="gramEnd"/>
+      <w:r>
+        <w:rPr>
+          <w:b/>
+          <w:bCs/>
+        </w:rPr>
+        <w:t>;</w:t>
+      </w:r>
+    </w:p>
+    <w:p>
+      <w:pPr>
+        <w:spacing w:after="0"/>
+      </w:pPr>
+      <w:proofErr w:type="spellStart"/>
+      <w:r>
+        <w:rPr>
+          <w:b/>
+          <w:bCs/>
+        </w:rPr>
+        <w:t>Video</w:t>
+      </w:r>
+      <w:proofErr w:type="spellEnd"/>
+      <w:r>
+        <w:rPr>
+          <w:b/>
+          <w:bCs/>
+        </w:rPr>
+        <w:t xml:space="preserve"> = (</w:t>
+      </w:r>
+      <w:r>
+        <w:rPr>
+          <w:b/>
+          <w:bCs/>
+          <w:i/>
+          <w:iCs/>
+          <w:u w:val="single"/>
+        </w:rPr>
+        <w:t>#IdDocument</w:t>
+      </w:r>
+      <w:r>
+        <w:t xml:space="preserve">, </w:t>
+      </w:r>
+      <w:proofErr w:type="spellStart"/>
+      <w:r>
+        <w:t>Duree</w:t>
+      </w:r>
+      <w:proofErr w:type="spellEnd"/>
+      <w:r>
+        <w:rPr>
+          <w:i/>
+          <w:iCs/>
+        </w:rPr>
+        <w:t xml:space="preserve"> INT</w:t>
+      </w:r>
+      <w:r>
+        <w:t>, Format</w:t>
+      </w:r>
+      <w:r>
+        <w:rPr>
+          <w:i/>
+          <w:iCs/>
+        </w:rPr>
+        <w:t xml:space="preserve"> </w:t>
+      </w:r>
+      <w:proofErr w:type="gramStart"/>
+      <w:r>
+        <w:rPr>
+          <w:i/>
+          <w:iCs/>
+        </w:rPr>
+        <w:t>VARCHAR(</w:t>
+      </w:r>
+      <w:proofErr w:type="gramEnd"/>
+      <w:r>
+        <w:rPr>
+          <w:i/>
+          <w:iCs/>
+        </w:rPr>
+        <w:t>50</w:t>
+      </w:r>
+      <w:proofErr w:type="gramStart"/>
+      <w:r>
+        <w:rPr>
+          <w:i/>
+          <w:iCs/>
+        </w:rPr>
+        <w:t xml:space="preserve">) </w:t>
+      </w:r>
+      <w:r>
+        <w:t>,</w:t>
+      </w:r>
+      <w:proofErr w:type="gramEnd"/>
+      <w:r>
+        <w:t xml:space="preserve"> </w:t>
+      </w:r>
+      <w:proofErr w:type="spellStart"/>
+      <w:r>
+        <w:t>Realisateur</w:t>
+      </w:r>
+      <w:proofErr w:type="spellEnd"/>
+      <w:r>
+        <w:rPr>
+          <w:i/>
+          <w:iCs/>
+        </w:rPr>
+        <w:t xml:space="preserve"> </w:t>
+      </w:r>
+      <w:proofErr w:type="gramStart"/>
+      <w:r>
+        <w:rPr>
+          <w:i/>
+          <w:iCs/>
+        </w:rPr>
+        <w:t>VARCHAR(</w:t>
+      </w:r>
+      <w:proofErr w:type="gramEnd"/>
+      <w:r>
+        <w:rPr>
+          <w:i/>
+          <w:iCs/>
+        </w:rPr>
+        <w:t>50</w:t>
+      </w:r>
+      <w:proofErr w:type="gramStart"/>
+      <w:r>
+        <w:rPr>
+          <w:i/>
+          <w:iCs/>
+        </w:rPr>
+        <w:t xml:space="preserve">) </w:t>
+      </w:r>
+      <w:r>
+        <w:rPr>
+          <w:b/>
+          <w:bCs/>
+        </w:rPr>
+        <w:t>)</w:t>
+      </w:r>
+      <w:proofErr w:type="gramEnd"/>
+      <w:r>
+        <w:rPr>
+          <w:b/>
+          <w:bCs/>
+        </w:rPr>
+        <w:t>;</w:t>
+      </w:r>
+    </w:p>
+    <w:p>
+      <w:pPr>
+        <w:spacing w:after="0"/>
+      </w:pPr>
+      <w:r>
+        <w:rPr>
+          <w:b/>
+          <w:bCs/>
+        </w:rPr>
+        <w:t>Auteur = (</w:t>
+      </w:r>
+      <w:proofErr w:type="spellStart"/>
+      <w:r>
+        <w:rPr>
+          <w:b/>
+          <w:bCs/>
+          <w:u w:val="single"/>
+        </w:rPr>
+        <w:t>IdAuteur</w:t>
+      </w:r>
+      <w:proofErr w:type="spellEnd"/>
+      <w:r>
+        <w:rPr>
+          <w:b/>
+          <w:bCs/>
+          <w:i/>
+          <w:iCs/>
+        </w:rPr>
+        <w:t xml:space="preserve"> INT AUTO_INCREMENT</w:t>
+      </w:r>
+      <w:r>
+        <w:t xml:space="preserve">, </w:t>
+      </w:r>
+      <w:proofErr w:type="spellStart"/>
+      <w:r>
         <w:t>Prenom</w:t>
       </w:r>
       <w:proofErr w:type="spellEnd"/>
@@ -1739,14 +2937,230 @@
           <w:i/>
           <w:iCs/>
         </w:rPr>
-        <w:t xml:space="preserve"> VARCHAR(50) </w:t>
+        <w:t xml:space="preserve"> </w:t>
+      </w:r>
+      <w:proofErr w:type="gramStart"/>
+      <w:r>
+        <w:rPr>
+          <w:i/>
+          <w:iCs/>
+        </w:rPr>
+        <w:t>VARCHAR(</w:t>
+      </w:r>
+      <w:proofErr w:type="gramEnd"/>
+      <w:r>
+        <w:rPr>
+          <w:i/>
+          <w:iCs/>
+        </w:rPr>
+        <w:t>50</w:t>
+      </w:r>
+      <w:proofErr w:type="gramStart"/>
+      <w:r>
+        <w:rPr>
+          <w:i/>
+          <w:iCs/>
+        </w:rPr>
+        <w:t xml:space="preserve">) </w:t>
+      </w:r>
+      <w:r>
+        <w:t>,</w:t>
+      </w:r>
+      <w:proofErr w:type="gramEnd"/>
+      <w:r>
+        <w:t xml:space="preserve"> Nom</w:t>
+      </w:r>
+      <w:r>
+        <w:rPr>
+          <w:i/>
+          <w:iCs/>
+        </w:rPr>
+        <w:t xml:space="preserve"> </w:t>
+      </w:r>
+      <w:proofErr w:type="gramStart"/>
+      <w:r>
+        <w:rPr>
+          <w:i/>
+          <w:iCs/>
+        </w:rPr>
+        <w:t>VARCHAR(</w:t>
+      </w:r>
+      <w:proofErr w:type="gramEnd"/>
+      <w:r>
+        <w:rPr>
+          <w:i/>
+          <w:iCs/>
+        </w:rPr>
+        <w:t>50</w:t>
+      </w:r>
+      <w:proofErr w:type="gramStart"/>
+      <w:r>
+        <w:rPr>
+          <w:i/>
+          <w:iCs/>
+        </w:rPr>
+        <w:t xml:space="preserve">) </w:t>
+      </w:r>
+      <w:r>
+        <w:t>,</w:t>
+      </w:r>
+      <w:proofErr w:type="gramEnd"/>
+      <w:r>
+        <w:t xml:space="preserve"> Description</w:t>
+      </w:r>
+      <w:r>
+        <w:rPr>
+          <w:i/>
+          <w:iCs/>
+        </w:rPr>
+        <w:t xml:space="preserve"> TEXT</w:t>
+      </w:r>
+      <w:proofErr w:type="gramStart"/>
+      <w:r>
+        <w:rPr>
+          <w:b/>
+          <w:bCs/>
+        </w:rPr>
+        <w:t>);</w:t>
+      </w:r>
+      <w:proofErr w:type="gramEnd"/>
+    </w:p>
+    <w:p>
+      <w:pPr>
+        <w:spacing w:after="0"/>
+      </w:pPr>
+      <w:r>
+        <w:rPr>
+          <w:b/>
+          <w:bCs/>
+        </w:rPr>
+        <w:t>Abonnement = (</w:t>
+      </w:r>
+      <w:proofErr w:type="spellStart"/>
+      <w:r>
+        <w:rPr>
+          <w:b/>
+          <w:bCs/>
+          <w:u w:val="single"/>
+        </w:rPr>
+        <w:t>IdAbonnement</w:t>
+      </w:r>
+      <w:proofErr w:type="spellEnd"/>
+      <w:r>
+        <w:rPr>
+          <w:b/>
+          <w:bCs/>
+          <w:i/>
+          <w:iCs/>
+        </w:rPr>
+        <w:t xml:space="preserve"> </w:t>
+      </w:r>
+      <w:proofErr w:type="gramStart"/>
+      <w:r>
+        <w:rPr>
+          <w:b/>
+          <w:bCs/>
+          <w:i/>
+          <w:iCs/>
+        </w:rPr>
+        <w:t>VARCHAR(</w:t>
+      </w:r>
+      <w:proofErr w:type="gramEnd"/>
+      <w:r>
+        <w:rPr>
+          <w:b/>
+          <w:bCs/>
+          <w:i/>
+          <w:iCs/>
+        </w:rPr>
+        <w:t>50</w:t>
+      </w:r>
+      <w:proofErr w:type="gramStart"/>
+      <w:r>
+        <w:rPr>
+          <w:b/>
+          <w:bCs/>
+          <w:i/>
+          <w:iCs/>
+        </w:rPr>
+        <w:t xml:space="preserve">) </w:t>
+      </w:r>
+      <w:r>
+        <w:t>,</w:t>
+      </w:r>
+      <w:proofErr w:type="gramEnd"/>
+      <w:r>
+        <w:t xml:space="preserve"> Tarif</w:t>
+      </w:r>
+      <w:r>
+        <w:rPr>
+          <w:i/>
+          <w:iCs/>
+        </w:rPr>
+        <w:t xml:space="preserve"> </w:t>
+      </w:r>
+      <w:proofErr w:type="gramStart"/>
+      <w:r>
+        <w:rPr>
+          <w:i/>
+          <w:iCs/>
+        </w:rPr>
+        <w:t>DECIMAL(</w:t>
+      </w:r>
+      <w:proofErr w:type="gramEnd"/>
+      <w:r>
+        <w:rPr>
+          <w:i/>
+          <w:iCs/>
+        </w:rPr>
+        <w:t>19,4)</w:t>
+      </w:r>
+      <w:proofErr w:type="gramStart"/>
+      <w:r>
+        <w:rPr>
+          <w:b/>
+          <w:bCs/>
+        </w:rPr>
+        <w:t>);</w:t>
+      </w:r>
+      <w:proofErr w:type="gramEnd"/>
+    </w:p>
+    <w:p>
+      <w:pPr>
+        <w:spacing w:after="0"/>
+      </w:pPr>
+      <w:r>
+        <w:rPr>
+          <w:b/>
+          <w:bCs/>
+        </w:rPr>
+        <w:t>Emprunt = (</w:t>
+      </w:r>
+      <w:proofErr w:type="spellStart"/>
+      <w:r>
+        <w:rPr>
+          <w:b/>
+          <w:bCs/>
+          <w:u w:val="single"/>
+        </w:rPr>
+        <w:t>IdEmprunt</w:t>
+      </w:r>
+      <w:proofErr w:type="spellEnd"/>
+      <w:r>
+        <w:rPr>
+          <w:b/>
+          <w:bCs/>
+          <w:i/>
+          <w:iCs/>
+        </w:rPr>
+        <w:t xml:space="preserve"> INT AUTO_INCREMENT</w:t>
       </w:r>
       <w:r>
         <w:t xml:space="preserve">, </w:t>
       </w:r>
       <w:proofErr w:type="spellStart"/>
       <w:r>
-        <w:t>DateNaissance</w:t>
+        <w:t>DateReservation</w:t>
       </w:r>
       <w:proofErr w:type="spellEnd"/>
       <w:r>
@@ -1757,63 +3171,11 @@
         <w:t xml:space="preserve"> DATE</w:t>
       </w:r>
       <w:r>
-        <w:t>, Adresse1</w:t>
-      </w:r>
-      <w:r>
-        <w:rPr>
-          <w:i/>
-          <w:iCs/>
-        </w:rPr>
-        <w:t xml:space="preserve"> VARCHAR(50) </w:t>
-      </w:r>
-      <w:r>
-        <w:t>, Adresse2</w:t>
-      </w:r>
-      <w:r>
-        <w:rPr>
-          <w:i/>
-          <w:iCs/>
-        </w:rPr>
-        <w:t xml:space="preserve"> VARCHAR(50) </w:t>
-      </w:r>
-      <w:r>
-        <w:t>, Ville</w:t>
-      </w:r>
-      <w:r>
-        <w:rPr>
-          <w:i/>
-          <w:iCs/>
-        </w:rPr>
-        <w:t xml:space="preserve"> VARCHAR(50) </w:t>
-      </w:r>
-      <w:r>
-        <w:t>, Pays</w:t>
-      </w:r>
-      <w:r>
-        <w:rPr>
-          <w:i/>
-          <w:iCs/>
-        </w:rPr>
-        <w:t xml:space="preserve"> VARCHAR(50) </w:t>
-      </w:r>
-      <w:r>
-        <w:t>, Mail</w:t>
-      </w:r>
-      <w:r>
-        <w:rPr>
-          <w:b/>
-          <w:bCs/>
-          <w:i/>
-          <w:iCs/>
-        </w:rPr>
-        <w:t xml:space="preserve"> VARCHAR(50) </w:t>
-      </w:r>
-      <w:r>
         <w:t xml:space="preserve">, </w:t>
       </w:r>
       <w:proofErr w:type="spellStart"/>
       <w:r>
-        <w:t>NumeroTelephone</w:t>
+        <w:t>DateRenduPrevision</w:t>
       </w:r>
       <w:proofErr w:type="spellEnd"/>
       <w:r>
@@ -1821,18 +3183,24 @@
           <w:i/>
           <w:iCs/>
         </w:rPr>
-        <w:t xml:space="preserve"> VARCHAR(50) </w:t>
-      </w:r>
-      <w:r>
-        <w:t>, Situation</w:t>
-      </w:r>
-      <w:r>
-        <w:rPr>
-          <w:i/>
-          <w:iCs/>
-        </w:rPr>
-        <w:t xml:space="preserve"> VARCHAR(50) </w:t>
-      </w:r>
+        <w:t xml:space="preserve"> DATE</w:t>
+      </w:r>
+      <w:r>
+        <w:t xml:space="preserve">, </w:t>
+      </w:r>
+      <w:proofErr w:type="spellStart"/>
+      <w:r>
+        <w:t>DateRendu</w:t>
+      </w:r>
+      <w:proofErr w:type="spellEnd"/>
+      <w:r>
+        <w:rPr>
+          <w:i/>
+          <w:iCs/>
+        </w:rPr>
+        <w:t xml:space="preserve"> DATE, #IdUtilisateur</w:t>
+      </w:r>
+      <w:proofErr w:type="gramStart"/>
       <w:r>
         <w:rPr>
           <w:b/>
@@ -1840,22 +3208,150 @@
         </w:rPr>
         <w:t>);</w:t>
       </w:r>
-    </w:p>
-    <w:p>
-      <w:pPr>
-        <w:spacing w:after="0"/>
-      </w:pPr>
+      <w:proofErr w:type="gramEnd"/>
+    </w:p>
+    <w:p>
+      <w:pPr>
+        <w:spacing w:after="0"/>
+      </w:pPr>
+      <w:r>
+        <w:rPr>
+          <w:b/>
+          <w:bCs/>
+        </w:rPr>
+        <w:t>Client = (</w:t>
+      </w:r>
+      <w:r>
+        <w:rPr>
+          <w:b/>
+          <w:bCs/>
+          <w:i/>
+          <w:iCs/>
+          <w:u w:val="single"/>
+        </w:rPr>
+        <w:t>#IdUtilisateur</w:t>
+      </w:r>
+      <w:r>
+        <w:t xml:space="preserve">, </w:t>
+      </w:r>
       <w:proofErr w:type="spellStart"/>
       <w:r>
-        <w:rPr>
-          <w:b/>
-          <w:bCs/>
-        </w:rPr>
-        <w:t>Employe</w:t>
+        <w:t>StatutAbonnement</w:t>
       </w:r>
       <w:proofErr w:type="spellEnd"/>
       <w:r>
         <w:rPr>
+          <w:i/>
+          <w:iCs/>
+        </w:rPr>
+        <w:t xml:space="preserve"> </w:t>
+      </w:r>
+      <w:proofErr w:type="gramStart"/>
+      <w:r>
+        <w:rPr>
+          <w:i/>
+          <w:iCs/>
+        </w:rPr>
+        <w:t>VARCHAR(</w:t>
+      </w:r>
+      <w:proofErr w:type="gramEnd"/>
+      <w:r>
+        <w:rPr>
+          <w:i/>
+          <w:iCs/>
+        </w:rPr>
+        <w:t>50</w:t>
+      </w:r>
+      <w:proofErr w:type="gramStart"/>
+      <w:r>
+        <w:rPr>
+          <w:i/>
+          <w:iCs/>
+        </w:rPr>
+        <w:t xml:space="preserve">) </w:t>
+      </w:r>
+      <w:r>
+        <w:t>,</w:t>
+      </w:r>
+      <w:proofErr w:type="gramEnd"/>
+      <w:r>
+        <w:t xml:space="preserve"> </w:t>
+      </w:r>
+      <w:proofErr w:type="spellStart"/>
+      <w:r>
+        <w:t>DateFinAbonnement</w:t>
+      </w:r>
+      <w:proofErr w:type="spellEnd"/>
+      <w:r>
+        <w:rPr>
+          <w:i/>
+          <w:iCs/>
+        </w:rPr>
+        <w:t xml:space="preserve"> DATE, #IdAbonnement</w:t>
+      </w:r>
+      <w:r>
+        <w:rPr>
+          <w:b/>
+          <w:bCs/>
+        </w:rPr>
+        <w:t>*</w:t>
+      </w:r>
+      <w:proofErr w:type="gramStart"/>
+      <w:r>
+        <w:rPr>
+          <w:b/>
+          <w:bCs/>
+        </w:rPr>
+        <w:t>);</w:t>
+      </w:r>
+      <w:proofErr w:type="gramEnd"/>
+    </w:p>
+    <w:p>
+      <w:pPr>
+        <w:spacing w:after="0"/>
+      </w:pPr>
+      <w:r>
+        <w:rPr>
+          <w:b/>
+          <w:bCs/>
+        </w:rPr>
+        <w:t>Ecrire = (</w:t>
+      </w:r>
+      <w:r>
+        <w:rPr>
+          <w:b/>
+          <w:bCs/>
+          <w:i/>
+          <w:iCs/>
+          <w:u w:val="single"/>
+        </w:rPr>
+        <w:t>#IdDocument, #IdAuteur</w:t>
+      </w:r>
+      <w:proofErr w:type="gramStart"/>
+      <w:r>
+        <w:rPr>
+          <w:b/>
+          <w:bCs/>
+        </w:rPr>
+        <w:t>);</w:t>
+      </w:r>
+      <w:proofErr w:type="gramEnd"/>
+    </w:p>
+    <w:p>
+      <w:pPr>
+        <w:spacing w:after="0"/>
+      </w:pPr>
+      <w:proofErr w:type="spellStart"/>
+      <w:r>
+        <w:rPr>
+          <w:b/>
+          <w:bCs/>
+        </w:rPr>
+        <w:t>EmpruntArticle</w:t>
+      </w:r>
+      <w:proofErr w:type="spellEnd"/>
+      <w:r>
+        <w:rPr>
           <w:b/>
           <w:bCs/>
         </w:rPr>
@@ -1869,18 +3365,9 @@
           <w:iCs/>
           <w:u w:val="single"/>
         </w:rPr>
-        <w:t>#IdUtilisateur</w:t>
-      </w:r>
-      <w:r>
-        <w:t>, Statut</w:t>
-      </w:r>
-      <w:r>
-        <w:rPr>
-          <w:i/>
-          <w:iCs/>
-        </w:rPr>
-        <w:t xml:space="preserve"> VARCHAR(50) </w:t>
-      </w:r>
+        <w:t>#IdDocument, #IdEmprunt</w:t>
+      </w:r>
+      <w:proofErr w:type="gramStart"/>
       <w:r>
         <w:rPr>
           <w:b/>
@@ -1888,732 +3375,7 @@
         </w:rPr>
         <w:t>);</w:t>
       </w:r>
-    </w:p>
-    <w:p>
-      <w:pPr>
-        <w:spacing w:after="0"/>
-      </w:pPr>
-      <w:r>
-        <w:rPr>
-          <w:b/>
-          <w:bCs/>
-        </w:rPr>
-        <w:t>Document = (</w:t>
-      </w:r>
-      <w:proofErr w:type="spellStart"/>
-      <w:r>
-        <w:rPr>
-          <w:b/>
-          <w:bCs/>
-          <w:u w:val="single"/>
-        </w:rPr>
-        <w:t>IdDocument</w:t>
-      </w:r>
-      <w:proofErr w:type="spellEnd"/>
-      <w:r>
-        <w:rPr>
-          <w:b/>
-          <w:bCs/>
-          <w:i/>
-          <w:iCs/>
-        </w:rPr>
-        <w:t xml:space="preserve"> INT AUTO_INCREMENT</w:t>
-      </w:r>
-      <w:r>
-        <w:t>, Titre</w:t>
-      </w:r>
-      <w:r>
-        <w:rPr>
-          <w:i/>
-          <w:iCs/>
-        </w:rPr>
-        <w:t xml:space="preserve"> VARCHAR(50) </w:t>
-      </w:r>
-      <w:r>
-        <w:t xml:space="preserve">, </w:t>
-      </w:r>
-      <w:proofErr w:type="spellStart"/>
-      <w:r>
-        <w:t>Annee</w:t>
-      </w:r>
-      <w:proofErr w:type="spellEnd"/>
-      <w:r>
-        <w:rPr>
-          <w:i/>
-          <w:iCs/>
-        </w:rPr>
-        <w:t xml:space="preserve"> DATE</w:t>
-      </w:r>
-      <w:r>
-        <w:t>, Auteur</w:t>
-      </w:r>
-      <w:r>
-        <w:rPr>
-          <w:i/>
-          <w:iCs/>
-        </w:rPr>
-        <w:t xml:space="preserve"> VARCHAR(50) </w:t>
-      </w:r>
-      <w:r>
-        <w:t xml:space="preserve">, </w:t>
-      </w:r>
-      <w:proofErr w:type="spellStart"/>
-      <w:r>
-        <w:t>Resume</w:t>
-      </w:r>
-      <w:proofErr w:type="spellEnd"/>
-      <w:r>
-        <w:rPr>
-          <w:i/>
-          <w:iCs/>
-        </w:rPr>
-        <w:t xml:space="preserve"> TEXT</w:t>
-      </w:r>
-      <w:r>
-        <w:t>, stock</w:t>
-      </w:r>
-      <w:r>
-        <w:rPr>
-          <w:i/>
-          <w:iCs/>
-        </w:rPr>
-        <w:t xml:space="preserve"> INT</w:t>
-      </w:r>
-      <w:r>
-        <w:rPr>
-          <w:b/>
-          <w:bCs/>
-        </w:rPr>
-        <w:t>);</w:t>
-      </w:r>
-    </w:p>
-    <w:p>
-      <w:pPr>
-        <w:spacing w:after="0"/>
-      </w:pPr>
-      <w:r>
-        <w:rPr>
-          <w:b/>
-          <w:bCs/>
-        </w:rPr>
-        <w:t>Livre = (</w:t>
-      </w:r>
-      <w:r>
-        <w:rPr>
-          <w:b/>
-          <w:bCs/>
-          <w:i/>
-          <w:iCs/>
-          <w:u w:val="single"/>
-        </w:rPr>
-        <w:t>#IdDocument</w:t>
-      </w:r>
-      <w:r>
-        <w:t xml:space="preserve">, </w:t>
-      </w:r>
-      <w:r>
-        <w:rPr>
-          <w:b/>
-          <w:bCs/>
-        </w:rPr>
-        <w:t>ISBN</w:t>
-      </w:r>
-      <w:r>
-        <w:rPr>
-          <w:b/>
-          <w:bCs/>
-          <w:i/>
-          <w:iCs/>
-        </w:rPr>
-        <w:t xml:space="preserve"> VARCHAR(50) </w:t>
-      </w:r>
-      <w:r>
-        <w:t xml:space="preserve">, </w:t>
-      </w:r>
-      <w:proofErr w:type="spellStart"/>
-      <w:r>
-        <w:t>NombrePage</w:t>
-      </w:r>
-      <w:proofErr w:type="spellEnd"/>
-      <w:r>
-        <w:rPr>
-          <w:i/>
-          <w:iCs/>
-        </w:rPr>
-        <w:t xml:space="preserve"> INT</w:t>
-      </w:r>
-      <w:r>
-        <w:t>, Genre</w:t>
-      </w:r>
-      <w:r>
-        <w:rPr>
-          <w:i/>
-          <w:iCs/>
-        </w:rPr>
-        <w:t xml:space="preserve"> VARCHAR(50) </w:t>
-      </w:r>
-      <w:r>
-        <w:rPr>
-          <w:b/>
-          <w:bCs/>
-        </w:rPr>
-        <w:t>);</w:t>
-      </w:r>
-    </w:p>
-    <w:p>
-      <w:pPr>
-        <w:spacing w:after="0"/>
-      </w:pPr>
-      <w:proofErr w:type="spellStart"/>
-      <w:r>
-        <w:rPr>
-          <w:b/>
-          <w:bCs/>
-        </w:rPr>
-        <w:t>TitrePeriodique</w:t>
-      </w:r>
-      <w:proofErr w:type="spellEnd"/>
-      <w:r>
-        <w:rPr>
-          <w:b/>
-          <w:bCs/>
-        </w:rPr>
-        <w:t xml:space="preserve"> = (</w:t>
-      </w:r>
-      <w:r>
-        <w:rPr>
-          <w:b/>
-          <w:bCs/>
-          <w:i/>
-          <w:iCs/>
-          <w:u w:val="single"/>
-        </w:rPr>
-        <w:t>#IdDocument</w:t>
-      </w:r>
-      <w:r>
-        <w:t xml:space="preserve">, </w:t>
-      </w:r>
-      <w:proofErr w:type="spellStart"/>
-      <w:r>
-        <w:t>Numero</w:t>
-      </w:r>
-      <w:proofErr w:type="spellEnd"/>
-      <w:r>
-        <w:rPr>
-          <w:i/>
-          <w:iCs/>
-        </w:rPr>
-        <w:t xml:space="preserve"> INT</w:t>
-      </w:r>
-      <w:r>
-        <w:t xml:space="preserve">, </w:t>
-      </w:r>
-      <w:proofErr w:type="spellStart"/>
-      <w:r>
-        <w:t>DatePublication</w:t>
-      </w:r>
-      <w:proofErr w:type="spellEnd"/>
-      <w:r>
-        <w:rPr>
-          <w:i/>
-          <w:iCs/>
-        </w:rPr>
-        <w:t xml:space="preserve"> DATE</w:t>
-      </w:r>
-      <w:r>
-        <w:t>, Type</w:t>
-      </w:r>
-      <w:r>
-        <w:rPr>
-          <w:i/>
-          <w:iCs/>
-        </w:rPr>
-        <w:t xml:space="preserve"> VARCHAR(50) </w:t>
-      </w:r>
-      <w:r>
-        <w:rPr>
-          <w:b/>
-          <w:bCs/>
-        </w:rPr>
-        <w:t>);</w:t>
-      </w:r>
-    </w:p>
-    <w:p>
-      <w:pPr>
-        <w:spacing w:after="0"/>
-      </w:pPr>
-      <w:r>
-        <w:rPr>
-          <w:b/>
-          <w:bCs/>
-        </w:rPr>
-        <w:t>Sonore = (</w:t>
-      </w:r>
-      <w:r>
-        <w:rPr>
-          <w:b/>
-          <w:bCs/>
-          <w:i/>
-          <w:iCs/>
-          <w:u w:val="single"/>
-        </w:rPr>
-        <w:t>#IdDocument</w:t>
-      </w:r>
-      <w:r>
-        <w:t xml:space="preserve">, </w:t>
-      </w:r>
-      <w:proofErr w:type="spellStart"/>
-      <w:r>
-        <w:t>Duree</w:t>
-      </w:r>
-      <w:proofErr w:type="spellEnd"/>
-      <w:r>
-        <w:rPr>
-          <w:i/>
-          <w:iCs/>
-        </w:rPr>
-        <w:t xml:space="preserve"> INT</w:t>
-      </w:r>
-      <w:r>
-        <w:t>, Format</w:t>
-      </w:r>
-      <w:r>
-        <w:rPr>
-          <w:i/>
-          <w:iCs/>
-        </w:rPr>
-        <w:t xml:space="preserve"> VARCHAR(50) </w:t>
-      </w:r>
-      <w:r>
-        <w:t xml:space="preserve">, </w:t>
-      </w:r>
-      <w:proofErr w:type="spellStart"/>
-      <w:r>
-        <w:t>Interprete</w:t>
-      </w:r>
-      <w:proofErr w:type="spellEnd"/>
-      <w:r>
-        <w:rPr>
-          <w:i/>
-          <w:iCs/>
-        </w:rPr>
-        <w:t xml:space="preserve"> VARCHAR(50) </w:t>
-      </w:r>
-      <w:r>
-        <w:rPr>
-          <w:b/>
-          <w:bCs/>
-        </w:rPr>
-        <w:t>);</w:t>
-      </w:r>
-    </w:p>
-    <w:p>
-      <w:pPr>
-        <w:spacing w:after="0"/>
-      </w:pPr>
-      <w:proofErr w:type="spellStart"/>
-      <w:r>
-        <w:rPr>
-          <w:b/>
-          <w:bCs/>
-        </w:rPr>
-        <w:t>Video</w:t>
-      </w:r>
-      <w:proofErr w:type="spellEnd"/>
-      <w:r>
-        <w:rPr>
-          <w:b/>
-          <w:bCs/>
-        </w:rPr>
-        <w:t xml:space="preserve"> = (</w:t>
-      </w:r>
-      <w:r>
-        <w:rPr>
-          <w:b/>
-          <w:bCs/>
-          <w:i/>
-          <w:iCs/>
-          <w:u w:val="single"/>
-        </w:rPr>
-        <w:t>#IdDocument</w:t>
-      </w:r>
-      <w:r>
-        <w:t xml:space="preserve">, </w:t>
-      </w:r>
-      <w:proofErr w:type="spellStart"/>
-      <w:r>
-        <w:t>Duree</w:t>
-      </w:r>
-      <w:proofErr w:type="spellEnd"/>
-      <w:r>
-        <w:rPr>
-          <w:i/>
-          <w:iCs/>
-        </w:rPr>
-        <w:t xml:space="preserve"> INT</w:t>
-      </w:r>
-      <w:r>
-        <w:t>, Format</w:t>
-      </w:r>
-      <w:r>
-        <w:rPr>
-          <w:i/>
-          <w:iCs/>
-        </w:rPr>
-        <w:t xml:space="preserve"> VARCHAR(50) </w:t>
-      </w:r>
-      <w:r>
-        <w:t xml:space="preserve">, </w:t>
-      </w:r>
-      <w:proofErr w:type="spellStart"/>
-      <w:r>
-        <w:t>Realisateur</w:t>
-      </w:r>
-      <w:proofErr w:type="spellEnd"/>
-      <w:r>
-        <w:rPr>
-          <w:i/>
-          <w:iCs/>
-        </w:rPr>
-        <w:t xml:space="preserve"> VARCHAR(50) </w:t>
-      </w:r>
-      <w:r>
-        <w:rPr>
-          <w:b/>
-          <w:bCs/>
-        </w:rPr>
-        <w:t>);</w:t>
-      </w:r>
-    </w:p>
-    <w:p>
-      <w:pPr>
-        <w:spacing w:after="0"/>
-      </w:pPr>
-      <w:r>
-        <w:rPr>
-          <w:b/>
-          <w:bCs/>
-        </w:rPr>
-        <w:t>Auteur = (</w:t>
-      </w:r>
-      <w:proofErr w:type="spellStart"/>
-      <w:r>
-        <w:rPr>
-          <w:b/>
-          <w:bCs/>
-          <w:u w:val="single"/>
-        </w:rPr>
-        <w:t>IdAuteur</w:t>
-      </w:r>
-      <w:proofErr w:type="spellEnd"/>
-      <w:r>
-        <w:rPr>
-          <w:b/>
-          <w:bCs/>
-          <w:i/>
-          <w:iCs/>
-        </w:rPr>
-        <w:t xml:space="preserve"> INT AUTO_INCREMENT</w:t>
-      </w:r>
-      <w:r>
-        <w:t xml:space="preserve">, </w:t>
-      </w:r>
-      <w:proofErr w:type="spellStart"/>
-      <w:r>
-        <w:t>Prenom</w:t>
-      </w:r>
-      <w:proofErr w:type="spellEnd"/>
-      <w:r>
-        <w:rPr>
-          <w:i/>
-          <w:iCs/>
-        </w:rPr>
-        <w:t xml:space="preserve"> VARCHAR(50) </w:t>
-      </w:r>
-      <w:r>
-        <w:t>, Nom</w:t>
-      </w:r>
-      <w:r>
-        <w:rPr>
-          <w:i/>
-          <w:iCs/>
-        </w:rPr>
-        <w:t xml:space="preserve"> VARCHAR(50) </w:t>
-      </w:r>
-      <w:r>
-        <w:t>, Description</w:t>
-      </w:r>
-      <w:r>
-        <w:rPr>
-          <w:i/>
-          <w:iCs/>
-        </w:rPr>
-        <w:t xml:space="preserve"> TEXT</w:t>
-      </w:r>
-      <w:r>
-        <w:rPr>
-          <w:b/>
-          <w:bCs/>
-        </w:rPr>
-        <w:t>);</w:t>
-      </w:r>
-    </w:p>
-    <w:p>
-      <w:pPr>
-        <w:spacing w:after="0"/>
-      </w:pPr>
-      <w:r>
-        <w:rPr>
-          <w:b/>
-          <w:bCs/>
-        </w:rPr>
-        <w:t>Abonnement = (</w:t>
-      </w:r>
-      <w:proofErr w:type="spellStart"/>
-      <w:r>
-        <w:rPr>
-          <w:b/>
-          <w:bCs/>
-          <w:u w:val="single"/>
-        </w:rPr>
-        <w:t>IdAbonnement</w:t>
-      </w:r>
-      <w:proofErr w:type="spellEnd"/>
-      <w:r>
-        <w:rPr>
-          <w:b/>
-          <w:bCs/>
-          <w:i/>
-          <w:iCs/>
-        </w:rPr>
-        <w:t xml:space="preserve"> VARCHAR(50) </w:t>
-      </w:r>
-      <w:r>
-        <w:t>, Tarif</w:t>
-      </w:r>
-      <w:r>
-        <w:rPr>
-          <w:i/>
-          <w:iCs/>
-        </w:rPr>
-        <w:t xml:space="preserve"> DECIMAL(19,4)</w:t>
-      </w:r>
-      <w:r>
-        <w:rPr>
-          <w:b/>
-          <w:bCs/>
-        </w:rPr>
-        <w:t>);</w:t>
-      </w:r>
-    </w:p>
-    <w:p>
-      <w:pPr>
-        <w:spacing w:after="0"/>
-      </w:pPr>
-      <w:r>
-        <w:rPr>
-          <w:b/>
-          <w:bCs/>
-        </w:rPr>
-        <w:t>Emprunt = (</w:t>
-      </w:r>
-      <w:proofErr w:type="spellStart"/>
-      <w:r>
-        <w:rPr>
-          <w:b/>
-          <w:bCs/>
-          <w:u w:val="single"/>
-        </w:rPr>
-        <w:t>IdEmprunt</w:t>
-      </w:r>
-      <w:proofErr w:type="spellEnd"/>
-      <w:r>
-        <w:rPr>
-          <w:b/>
-          <w:bCs/>
-          <w:i/>
-          <w:iCs/>
-        </w:rPr>
-        <w:t xml:space="preserve"> INT AUTO_INCREMENT</w:t>
-      </w:r>
-      <w:r>
-        <w:t xml:space="preserve">, </w:t>
-      </w:r>
-      <w:proofErr w:type="spellStart"/>
-      <w:r>
-        <w:t>DateReservation</w:t>
-      </w:r>
-      <w:proofErr w:type="spellEnd"/>
-      <w:r>
-        <w:rPr>
-          <w:i/>
-          <w:iCs/>
-        </w:rPr>
-        <w:t xml:space="preserve"> DATE</w:t>
-      </w:r>
-      <w:r>
-        <w:t xml:space="preserve">, </w:t>
-      </w:r>
-      <w:proofErr w:type="spellStart"/>
-      <w:r>
-        <w:t>DateRenduPrevision</w:t>
-      </w:r>
-      <w:proofErr w:type="spellEnd"/>
-      <w:r>
-        <w:rPr>
-          <w:i/>
-          <w:iCs/>
-        </w:rPr>
-        <w:t xml:space="preserve"> DATE</w:t>
-      </w:r>
-      <w:r>
-        <w:t xml:space="preserve">, </w:t>
-      </w:r>
-      <w:proofErr w:type="spellStart"/>
-      <w:r>
-        <w:t>DateRendu</w:t>
-      </w:r>
-      <w:proofErr w:type="spellEnd"/>
-      <w:r>
-        <w:rPr>
-          <w:i/>
-          <w:iCs/>
-        </w:rPr>
-        <w:t xml:space="preserve"> DATE, #IdUtilisateur</w:t>
-      </w:r>
-      <w:r>
-        <w:rPr>
-          <w:b/>
-          <w:bCs/>
-        </w:rPr>
-        <w:t>);</w:t>
-      </w:r>
-    </w:p>
-    <w:p>
-      <w:pPr>
-        <w:spacing w:after="0"/>
-      </w:pPr>
-      <w:r>
-        <w:rPr>
-          <w:b/>
-          <w:bCs/>
-        </w:rPr>
-        <w:t>Client = (</w:t>
-      </w:r>
-      <w:r>
-        <w:rPr>
-          <w:b/>
-          <w:bCs/>
-          <w:i/>
-          <w:iCs/>
-          <w:u w:val="single"/>
-        </w:rPr>
-        <w:t>#IdUtilisateur</w:t>
-      </w:r>
-      <w:r>
-        <w:t xml:space="preserve">, </w:t>
-      </w:r>
-      <w:proofErr w:type="spellStart"/>
-      <w:r>
-        <w:t>StatutAbonnement</w:t>
-      </w:r>
-      <w:proofErr w:type="spellEnd"/>
-      <w:r>
-        <w:rPr>
-          <w:i/>
-          <w:iCs/>
-        </w:rPr>
-        <w:t xml:space="preserve"> VARCHAR(50) </w:t>
-      </w:r>
-      <w:r>
-        <w:t xml:space="preserve">, </w:t>
-      </w:r>
-      <w:proofErr w:type="spellStart"/>
-      <w:r>
-        <w:t>DateFinAbonnement</w:t>
-      </w:r>
-      <w:proofErr w:type="spellEnd"/>
-      <w:r>
-        <w:rPr>
-          <w:i/>
-          <w:iCs/>
-        </w:rPr>
-        <w:t xml:space="preserve"> DATE, #IdAbonnement</w:t>
-      </w:r>
-      <w:r>
-        <w:rPr>
-          <w:b/>
-          <w:bCs/>
-        </w:rPr>
-        <w:t>*);</w:t>
-      </w:r>
-    </w:p>
-    <w:p>
-      <w:pPr>
-        <w:spacing w:after="0"/>
-      </w:pPr>
-      <w:r>
-        <w:rPr>
-          <w:b/>
-          <w:bCs/>
-        </w:rPr>
-        <w:t>Ecrire = (</w:t>
-      </w:r>
-      <w:r>
-        <w:rPr>
-          <w:b/>
-          <w:bCs/>
-          <w:i/>
-          <w:iCs/>
-          <w:u w:val="single"/>
-        </w:rPr>
-        <w:t>#IdDocument, #IdAuteur</w:t>
-      </w:r>
-      <w:r>
-        <w:rPr>
-          <w:b/>
-          <w:bCs/>
-        </w:rPr>
-        <w:t>);</w:t>
-      </w:r>
-    </w:p>
-    <w:p>
-      <w:pPr>
-        <w:spacing w:after="0"/>
-      </w:pPr>
-      <w:proofErr w:type="spellStart"/>
-      <w:r>
-        <w:rPr>
-          <w:b/>
-          <w:bCs/>
-        </w:rPr>
-        <w:t>EmpruntArticle</w:t>
-      </w:r>
-      <w:proofErr w:type="spellEnd"/>
-      <w:r>
-        <w:rPr>
-          <w:b/>
-          <w:bCs/>
-        </w:rPr>
-        <w:t xml:space="preserve"> = (</w:t>
-      </w:r>
-      <w:r>
-        <w:rPr>
-          <w:b/>
-          <w:bCs/>
-          <w:i/>
-          <w:iCs/>
-          <w:u w:val="single"/>
-        </w:rPr>
-        <w:t>#IdDocument, #IdEmprunt</w:t>
-      </w:r>
-      <w:r>
-        <w:rPr>
-          <w:b/>
-          <w:bCs/>
-        </w:rPr>
-        <w:t>);</w:t>
-      </w:r>
+      <w:proofErr w:type="gramEnd"/>
     </w:p>
     <w:p>
       <w:pPr>

</xml_diff>